<commit_message>
project definition data sources 2
</commit_message>
<xml_diff>
--- a/Skymart/Power_BI_Portfolio_Project_Worksheet.docx
+++ b/Skymart/Power_BI_Portfolio_Project_Worksheet.docx
@@ -196,13 +196,8 @@
             <w:pPr>
               <w:spacing w:after="0"/>
             </w:pPr>
-            <w:proofErr w:type="spellStart"/>
-            <w:r>
-              <w:t>Skymart</w:t>
-            </w:r>
-            <w:proofErr w:type="spellEnd"/>
-            <w:r>
-              <w:t xml:space="preserve"> Retail Sales Analytics</w:t>
+            <w:r>
+              <w:t>Skymart Retail Sales Analytics</w:t>
             </w:r>
           </w:p>
         </w:tc>
@@ -301,19 +296,11 @@
             <w:pPr>
               <w:spacing w:after="0"/>
             </w:pPr>
-            <w:proofErr w:type="spellStart"/>
-            <w:r>
-              <w:rPr>
-                <w:sz w:val="17"/>
-              </w:rPr>
-              <w:t>Skymart</w:t>
-            </w:r>
-            <w:proofErr w:type="spellEnd"/>
-            <w:r>
-              <w:rPr>
-                <w:sz w:val="17"/>
-              </w:rPr>
-              <w:t xml:space="preserve"> Retail Sales__________________________________</w:t>
+            <w:r>
+              <w:rPr>
+                <w:sz w:val="17"/>
+              </w:rPr>
+              <w:t>Skymart Retail Sales__________________________________</w:t>
             </w:r>
           </w:p>
         </w:tc>
@@ -2651,15 +2638,7 @@
         <w:t xml:space="preserve">1.  </w:t>
       </w:r>
       <w:r>
-        <w:t xml:space="preserve">Output – </w:t>
-      </w:r>
-      <w:proofErr w:type="spellStart"/>
-      <w:r>
-        <w:t>Dashboar</w:t>
-      </w:r>
-      <w:proofErr w:type="spellEnd"/>
-      <w:r>
-        <w:t>: Develop a dashboard by 22/08 that displays revenue and order counts by month, region, and product, with filters</w:t>
+        <w:t>Output – Dashboar: Develop a dashboard by 22/08 that displays revenue and order counts by month, region, and product, with filters</w:t>
       </w:r>
     </w:p>
     <w:p>
@@ -3603,15 +3582,7 @@
               <w:spacing w:after="40"/>
             </w:pPr>
             <w:r>
-              <w:t xml:space="preserve">Internal, restricted-may contains </w:t>
-            </w:r>
-            <w:proofErr w:type="gramStart"/>
-            <w:r>
-              <w:t>PII(</w:t>
-            </w:r>
-            <w:proofErr w:type="gramEnd"/>
-            <w:r>
-              <w:t>personally identifiable information)</w:t>
+              <w:t>Internal, restricted-may contains PII(personally identifiable information)</w:t>
             </w:r>
           </w:p>
         </w:tc>
@@ -3755,11 +3726,9 @@
             <w:pPr>
               <w:spacing w:after="40"/>
             </w:pPr>
-            <w:proofErr w:type="spellStart"/>
-            <w:r>
-              <w:t>Operat</w:t>
-            </w:r>
-            <w:proofErr w:type="spellEnd"/>
+            <w:r>
+              <w:t>Sales op manager</w:t>
+            </w:r>
           </w:p>
         </w:tc>
         <w:tc>
@@ -3807,7 +3776,13 @@
               <w:spacing w:after="40"/>
             </w:pPr>
             <w:r>
-              <w:t>Internal</w:t>
+              <w:t xml:space="preserve">Confidential-contain </w:t>
+            </w:r>
+            <w:r>
+              <w:t>transaction</w:t>
+            </w:r>
+            <w:r>
+              <w:t xml:space="preserve"> data</w:t>
             </w:r>
           </w:p>
         </w:tc>
@@ -3855,6 +3830,9 @@
             <w:pPr>
               <w:spacing w:after="40"/>
             </w:pPr>
+            <w:r>
+              <w:t>Sales op manager</w:t>
+            </w:r>
           </w:p>
         </w:tc>
         <w:tc>
@@ -3903,6 +3881,9 @@
             </w:pPr>
             <w:r>
               <w:t>Internal</w:t>
+            </w:r>
+            <w:r>
+              <w:t>-contain transaction and pricing data</w:t>
             </w:r>
           </w:p>
         </w:tc>
@@ -3949,6 +3930,9 @@
             <w:pPr>
               <w:spacing w:after="40"/>
             </w:pPr>
+            <w:r>
+              <w:t>Sales Head/sales planning manager</w:t>
+            </w:r>
           </w:p>
         </w:tc>
         <w:tc>
@@ -3996,7 +3980,7 @@
               <w:spacing w:after="40"/>
             </w:pPr>
             <w:r>
-              <w:t>Internal</w:t>
+              <w:t>confidential-contains internal targets and performance expectations</w:t>
             </w:r>
           </w:p>
         </w:tc>
@@ -4043,6 +4027,9 @@
             <w:pPr>
               <w:spacing w:after="40"/>
             </w:pPr>
+            <w:r>
+              <w:t>Inventory manager</w:t>
+            </w:r>
           </w:p>
         </w:tc>
         <w:tc>
@@ -4090,7 +4077,7 @@
               <w:spacing w:after="40"/>
             </w:pPr>
             <w:r>
-              <w:t>Internal</w:t>
+              <w:t>Confidential-contains stock levels and operational information</w:t>
             </w:r>
           </w:p>
         </w:tc>
@@ -4137,6 +4124,9 @@
             <w:pPr>
               <w:spacing w:after="40"/>
             </w:pPr>
+            <w:r>
+              <w:t>Customer servive/return operation manager</w:t>
+            </w:r>
           </w:p>
         </w:tc>
         <w:tc>
@@ -4147,6 +4137,9 @@
             <w:pPr>
               <w:spacing w:after="40"/>
             </w:pPr>
+            <w:r>
+              <w:t>CSV read only</w:t>
+            </w:r>
           </w:p>
         </w:tc>
         <w:tc>
@@ -4181,7 +4174,7 @@
               <w:spacing w:after="40"/>
             </w:pPr>
             <w:r>
-              <w:t>Internal</w:t>
+              <w:t>Confidential-contains transaction and return information</w:t>
             </w:r>
           </w:p>
         </w:tc>
@@ -4228,6 +4221,9 @@
             <w:pPr>
               <w:spacing w:after="40"/>
             </w:pPr>
+            <w:r>
+              <w:t>Sales op or marketing manager</w:t>
+            </w:r>
           </w:p>
         </w:tc>
         <w:tc>
@@ -4238,6 +4234,9 @@
             <w:pPr>
               <w:spacing w:after="40"/>
             </w:pPr>
+            <w:r>
+              <w:t>CSV read only</w:t>
+            </w:r>
           </w:p>
         </w:tc>
         <w:tc>
@@ -4272,7 +4271,7 @@
               <w:spacing w:after="40"/>
             </w:pPr>
             <w:r>
-              <w:t>Public</w:t>
+              <w:t>Internal-contains sales-channel reference data</w:t>
             </w:r>
           </w:p>
         </w:tc>
@@ -4320,6 +4319,9 @@
             <w:pPr>
               <w:spacing w:after="40"/>
             </w:pPr>
+            <w:r>
+              <w:t>Logistics manager</w:t>
+            </w:r>
           </w:p>
         </w:tc>
         <w:tc>
@@ -4330,6 +4332,9 @@
             <w:pPr>
               <w:spacing w:after="40"/>
             </w:pPr>
+            <w:r>
+              <w:t>JSON read only</w:t>
+            </w:r>
           </w:p>
         </w:tc>
         <w:tc>
@@ -4364,7 +4369,7 @@
               <w:spacing w:after="40"/>
             </w:pPr>
             <w:r>
-              <w:t>Internal</w:t>
+              <w:t>Confidential-contains shipping info</w:t>
             </w:r>
           </w:p>
         </w:tc>

</xml_diff>

<commit_message>
project definition final data sources
</commit_message>
<xml_diff>
--- a/Skymart/Power_BI_Portfolio_Project_Worksheet.docx
+++ b/Skymart/Power_BI_Portfolio_Project_Worksheet.docx
@@ -196,8 +196,13 @@
             <w:pPr>
               <w:spacing w:after="0"/>
             </w:pPr>
-            <w:r>
-              <w:t>Skymart Retail Sales Analytics</w:t>
+            <w:proofErr w:type="spellStart"/>
+            <w:r>
+              <w:t>Skymart</w:t>
+            </w:r>
+            <w:proofErr w:type="spellEnd"/>
+            <w:r>
+              <w:t xml:space="preserve"> Retail Sales Analytics</w:t>
             </w:r>
           </w:p>
         </w:tc>
@@ -296,11 +301,19 @@
             <w:pPr>
               <w:spacing w:after="0"/>
             </w:pPr>
-            <w:r>
-              <w:rPr>
-                <w:sz w:val="17"/>
-              </w:rPr>
-              <w:t>Skymart Retail Sales__________________________________</w:t>
+            <w:proofErr w:type="spellStart"/>
+            <w:r>
+              <w:rPr>
+                <w:sz w:val="17"/>
+              </w:rPr>
+              <w:t>Skymart</w:t>
+            </w:r>
+            <w:proofErr w:type="spellEnd"/>
+            <w:r>
+              <w:rPr>
+                <w:sz w:val="17"/>
+              </w:rPr>
+              <w:t xml:space="preserve"> Retail Sales__________________________________</w:t>
             </w:r>
           </w:p>
         </w:tc>
@@ -2638,7 +2651,13 @@
         <w:t xml:space="preserve">1.  </w:t>
       </w:r>
       <w:r>
-        <w:t>Output – Dashboar: Develop a dashboard by 22/08 that displays revenue and order counts by month, region, and product, with filters</w:t>
+        <w:t>Output – Dashboar</w:t>
+      </w:r>
+      <w:r>
+        <w:t>d</w:t>
+      </w:r>
+      <w:r>
+        <w:t>: Develop a dashboard by 22/08 that displays revenue and order counts by month, region, and product, with filters</w:t>
       </w:r>
     </w:p>
     <w:p>
@@ -3176,13 +3195,13 @@
       </w:tblPr>
       <w:tblGrid>
         <w:gridCol w:w="1159"/>
-        <w:gridCol w:w="992"/>
-        <w:gridCol w:w="1769"/>
+        <w:gridCol w:w="1671"/>
+        <w:gridCol w:w="1090"/>
         <w:gridCol w:w="1170"/>
-        <w:gridCol w:w="1080"/>
-        <w:gridCol w:w="1622"/>
-        <w:gridCol w:w="1622"/>
-        <w:gridCol w:w="1017"/>
+        <w:gridCol w:w="717"/>
+        <w:gridCol w:w="1985"/>
+        <w:gridCol w:w="1984"/>
+        <w:gridCol w:w="655"/>
       </w:tblGrid>
       <w:tr>
         <w:tc>
@@ -3213,7 +3232,7 @@
         </w:tc>
         <w:tc>
           <w:tcPr>
-            <w:tcW w:w="992" w:type="dxa"/>
+            <w:tcW w:w="1671" w:type="dxa"/>
           </w:tcPr>
           <w:p>
             <w:pPr>
@@ -3239,7 +3258,7 @@
         </w:tc>
         <w:tc>
           <w:tcPr>
-            <w:tcW w:w="1769" w:type="dxa"/>
+            <w:tcW w:w="1090" w:type="dxa"/>
           </w:tcPr>
           <w:p>
             <w:pPr>
@@ -3291,7 +3310,7 @@
         </w:tc>
         <w:tc>
           <w:tcPr>
-            <w:tcW w:w="1080" w:type="dxa"/>
+            <w:tcW w:w="717" w:type="dxa"/>
           </w:tcPr>
           <w:p>
             <w:pPr>
@@ -3317,7 +3336,7 @@
         </w:tc>
         <w:tc>
           <w:tcPr>
-            <w:tcW w:w="1622" w:type="dxa"/>
+            <w:tcW w:w="1985" w:type="dxa"/>
           </w:tcPr>
           <w:p>
             <w:pPr>
@@ -3343,7 +3362,7 @@
         </w:tc>
         <w:tc>
           <w:tcPr>
-            <w:tcW w:w="1622" w:type="dxa"/>
+            <w:tcW w:w="1984" w:type="dxa"/>
           </w:tcPr>
           <w:p>
             <w:pPr>
@@ -3378,7 +3397,7 @@
         </w:tc>
         <w:tc>
           <w:tcPr>
-            <w:tcW w:w="1017" w:type="dxa"/>
+            <w:tcW w:w="655" w:type="dxa"/>
           </w:tcPr>
           <w:p>
             <w:pPr>
@@ -3413,30 +3432,136 @@
               <w:spacing w:after="40"/>
             </w:pPr>
             <w:r>
-              <w:t>SQL orders table</w:t>
-            </w:r>
-          </w:p>
-        </w:tc>
-        <w:tc>
-          <w:tcPr>
-            <w:tcW w:w="992" w:type="dxa"/>
+              <w:t>SQL customers table</w:t>
+            </w:r>
+          </w:p>
+        </w:tc>
+        <w:tc>
+          <w:tcPr>
+            <w:tcW w:w="1671" w:type="dxa"/>
           </w:tcPr>
           <w:p>
             <w:pPr>
               <w:spacing w:after="40"/>
             </w:pPr>
-          </w:p>
-        </w:tc>
-        <w:tc>
-          <w:tcPr>
-            <w:tcW w:w="1769" w:type="dxa"/>
-          </w:tcPr>
+            <w:proofErr w:type="spellStart"/>
+            <w:r>
+              <w:rPr>
+                <w:highlight w:val="yellow"/>
+              </w:rPr>
+              <w:t>customer_id</w:t>
+            </w:r>
+            <w:proofErr w:type="spellEnd"/>
+            <w:r>
+              <w:t>,</w:t>
+            </w:r>
+          </w:p>
           <w:p>
             <w:pPr>
               <w:spacing w:after="40"/>
             </w:pPr>
-            <w:r>
-              <w:t>Sales system/data owner</w:t>
+            <w:proofErr w:type="spellStart"/>
+            <w:r>
+              <w:t>customer_name</w:t>
+            </w:r>
+            <w:proofErr w:type="spellEnd"/>
+            <w:r>
+              <w:t>,</w:t>
+            </w:r>
+          </w:p>
+          <w:p>
+            <w:pPr>
+              <w:spacing w:after="40"/>
+            </w:pPr>
+            <w:r>
+              <w:t>email,</w:t>
+            </w:r>
+          </w:p>
+          <w:p>
+            <w:pPr>
+              <w:spacing w:after="40"/>
+            </w:pPr>
+            <w:r>
+              <w:t>customer_segment,</w:t>
+            </w:r>
+          </w:p>
+          <w:p>
+            <w:pPr>
+              <w:spacing w:after="40"/>
+            </w:pPr>
+            <w:r>
+              <w:rPr>
+                <w:highlight w:val="yellow"/>
+              </w:rPr>
+              <w:t>city</w:t>
+            </w:r>
+            <w:r>
+              <w:t>,</w:t>
+            </w:r>
+          </w:p>
+          <w:p>
+            <w:pPr>
+              <w:spacing w:after="40"/>
+            </w:pPr>
+            <w:proofErr w:type="spellStart"/>
+            <w:r>
+              <w:rPr>
+                <w:highlight w:val="yellow"/>
+              </w:rPr>
+              <w:t>region_id</w:t>
+            </w:r>
+            <w:proofErr w:type="spellEnd"/>
+            <w:r>
+              <w:t>,</w:t>
+            </w:r>
+          </w:p>
+          <w:p>
+            <w:pPr>
+              <w:spacing w:after="40"/>
+            </w:pPr>
+            <w:proofErr w:type="spellStart"/>
+            <w:r>
+              <w:t>join_date</w:t>
+            </w:r>
+            <w:proofErr w:type="spellEnd"/>
+            <w:r>
+              <w:t>,</w:t>
+            </w:r>
+          </w:p>
+          <w:p>
+            <w:pPr>
+              <w:spacing w:after="40"/>
+            </w:pPr>
+            <w:proofErr w:type="spellStart"/>
+            <w:r>
+              <w:t>loyalty_tier</w:t>
+            </w:r>
+            <w:proofErr w:type="spellEnd"/>
+            <w:r>
+              <w:t>,</w:t>
+            </w:r>
+          </w:p>
+          <w:p>
+            <w:pPr>
+              <w:spacing w:after="40"/>
+            </w:pPr>
+            <w:proofErr w:type="spellStart"/>
+            <w:r>
+              <w:t>marketing_opt_in</w:t>
+            </w:r>
+            <w:proofErr w:type="spellEnd"/>
+          </w:p>
+        </w:tc>
+        <w:tc>
+          <w:tcPr>
+            <w:tcW w:w="1090" w:type="dxa"/>
+          </w:tcPr>
+          <w:p>
+            <w:pPr>
+              <w:spacing w:after="40"/>
+            </w:pPr>
+            <w:r>
+              <w:t>Sales system/Customers Data owner</w:t>
             </w:r>
           </w:p>
         </w:tc>
@@ -3449,13 +3574,13 @@
               <w:spacing w:after="40"/>
             </w:pPr>
             <w:r>
-              <w:t>PostgreSQL conn</w:t>
-            </w:r>
-          </w:p>
-        </w:tc>
-        <w:tc>
-          <w:tcPr>
-            <w:tcW w:w="1080" w:type="dxa"/>
+              <w:t>PostgreSQL read-only</w:t>
+            </w:r>
+          </w:p>
+        </w:tc>
+        <w:tc>
+          <w:tcPr>
+            <w:tcW w:w="717" w:type="dxa"/>
           </w:tcPr>
           <w:p>
             <w:pPr>
@@ -3465,7 +3590,7 @@
         </w:tc>
         <w:tc>
           <w:tcPr>
-            <w:tcW w:w="1622" w:type="dxa"/>
+            <w:tcW w:w="1985" w:type="dxa"/>
           </w:tcPr>
           <w:p>
             <w:pPr>
@@ -3478,20 +3603,28 @@
         </w:tc>
         <w:tc>
           <w:tcPr>
-            <w:tcW w:w="1622" w:type="dxa"/>
+            <w:tcW w:w="1984" w:type="dxa"/>
           </w:tcPr>
           <w:p>
             <w:pPr>
               <w:spacing w:after="40"/>
             </w:pPr>
             <w:r>
-              <w:t>Internal/confidential</w:t>
-            </w:r>
-          </w:p>
-        </w:tc>
-        <w:tc>
-          <w:tcPr>
-            <w:tcW w:w="1017" w:type="dxa"/>
+              <w:t xml:space="preserve">Internal, restricted-may contains </w:t>
+            </w:r>
+            <w:proofErr w:type="gramStart"/>
+            <w:r>
+              <w:t>PII(</w:t>
+            </w:r>
+            <w:proofErr w:type="gramEnd"/>
+            <w:r>
+              <w:t>personally identifiable information)</w:t>
+            </w:r>
+          </w:p>
+        </w:tc>
+        <w:tc>
+          <w:tcPr>
+            <w:tcW w:w="655" w:type="dxa"/>
           </w:tcPr>
           <w:p>
             <w:pPr>
@@ -3510,14 +3643,305 @@
               <w:spacing w:after="40"/>
             </w:pPr>
             <w:r>
-              <w:t>SQL customers table</w:t>
-            </w:r>
-          </w:p>
-        </w:tc>
-        <w:tc>
-          <w:tcPr>
-            <w:tcW w:w="992" w:type="dxa"/>
-          </w:tcPr>
+              <w:t>SQL products table</w:t>
+            </w:r>
+          </w:p>
+        </w:tc>
+        <w:tc>
+          <w:tcPr>
+            <w:tcW w:w="1671" w:type="dxa"/>
+          </w:tcPr>
+          <w:p>
+            <w:pPr>
+              <w:spacing w:after="0" w:line="240" w:lineRule="auto"/>
+              <w:rPr>
+                <w:rFonts w:ascii="Calibri" w:hAnsi="Calibri" w:cs="Calibri"/>
+                <w:color w:val="000000"/>
+                <w:sz w:val="22"/>
+              </w:rPr>
+            </w:pPr>
+            <w:proofErr w:type="spellStart"/>
+            <w:r>
+              <w:rPr>
+                <w:rFonts w:ascii="Calibri" w:hAnsi="Calibri" w:cs="Calibri"/>
+                <w:color w:val="000000"/>
+                <w:sz w:val="22"/>
+                <w:highlight w:val="yellow"/>
+              </w:rPr>
+              <w:t>product_id</w:t>
+            </w:r>
+            <w:proofErr w:type="spellEnd"/>
+            <w:r>
+              <w:rPr>
+                <w:rFonts w:ascii="Calibri" w:hAnsi="Calibri" w:cs="Calibri"/>
+                <w:color w:val="000000"/>
+                <w:sz w:val="22"/>
+              </w:rPr>
+              <w:t>,</w:t>
+            </w:r>
+          </w:p>
+          <w:p>
+            <w:pPr>
+              <w:spacing w:after="0" w:line="240" w:lineRule="auto"/>
+              <w:rPr>
+                <w:rFonts w:ascii="Calibri" w:hAnsi="Calibri" w:cs="Calibri"/>
+                <w:color w:val="000000"/>
+                <w:sz w:val="22"/>
+              </w:rPr>
+            </w:pPr>
+            <w:proofErr w:type="spellStart"/>
+            <w:r>
+              <w:rPr>
+                <w:rFonts w:ascii="Calibri" w:hAnsi="Calibri" w:cs="Calibri"/>
+                <w:color w:val="000000"/>
+                <w:sz w:val="22"/>
+              </w:rPr>
+              <w:t>sku</w:t>
+            </w:r>
+            <w:proofErr w:type="spellEnd"/>
+            <w:r>
+              <w:rPr>
+                <w:rFonts w:ascii="Calibri" w:hAnsi="Calibri" w:cs="Calibri"/>
+                <w:color w:val="000000"/>
+                <w:sz w:val="22"/>
+              </w:rPr>
+              <w:t>,</w:t>
+            </w:r>
+          </w:p>
+          <w:p>
+            <w:pPr>
+              <w:spacing w:after="0" w:line="240" w:lineRule="auto"/>
+              <w:rPr>
+                <w:rFonts w:ascii="Calibri" w:hAnsi="Calibri" w:cs="Calibri"/>
+                <w:color w:val="000000"/>
+                <w:sz w:val="22"/>
+              </w:rPr>
+            </w:pPr>
+            <w:proofErr w:type="spellStart"/>
+            <w:r>
+              <w:rPr>
+                <w:rFonts w:ascii="Calibri" w:hAnsi="Calibri" w:cs="Calibri"/>
+                <w:color w:val="000000"/>
+                <w:sz w:val="22"/>
+                <w:highlight w:val="yellow"/>
+              </w:rPr>
+              <w:t>product_name</w:t>
+            </w:r>
+            <w:proofErr w:type="spellEnd"/>
+            <w:r>
+              <w:rPr>
+                <w:rFonts w:ascii="Calibri" w:hAnsi="Calibri" w:cs="Calibri"/>
+                <w:color w:val="000000"/>
+                <w:sz w:val="22"/>
+              </w:rPr>
+              <w:t>,</w:t>
+            </w:r>
+          </w:p>
+          <w:p>
+            <w:pPr>
+              <w:spacing w:after="0" w:line="240" w:lineRule="auto"/>
+              <w:rPr>
+                <w:rFonts w:ascii="Calibri" w:hAnsi="Calibri" w:cs="Calibri"/>
+                <w:color w:val="000000"/>
+                <w:sz w:val="22"/>
+              </w:rPr>
+            </w:pPr>
+            <w:r>
+              <w:rPr>
+                <w:rFonts w:ascii="Calibri" w:hAnsi="Calibri" w:cs="Calibri"/>
+                <w:color w:val="000000"/>
+                <w:sz w:val="22"/>
+                <w:highlight w:val="yellow"/>
+              </w:rPr>
+              <w:lastRenderedPageBreak/>
+              <w:t>category</w:t>
+            </w:r>
+            <w:r>
+              <w:rPr>
+                <w:rFonts w:ascii="Calibri" w:hAnsi="Calibri" w:cs="Calibri"/>
+                <w:color w:val="000000"/>
+                <w:sz w:val="22"/>
+              </w:rPr>
+              <w:t>,</w:t>
+            </w:r>
+          </w:p>
+          <w:p>
+            <w:pPr>
+              <w:spacing w:after="0" w:line="240" w:lineRule="auto"/>
+              <w:rPr>
+                <w:rFonts w:ascii="Calibri" w:hAnsi="Calibri" w:cs="Calibri"/>
+                <w:color w:val="000000"/>
+                <w:sz w:val="22"/>
+              </w:rPr>
+            </w:pPr>
+            <w:r>
+              <w:rPr>
+                <w:rFonts w:ascii="Calibri" w:hAnsi="Calibri" w:cs="Calibri"/>
+                <w:color w:val="000000"/>
+                <w:sz w:val="22"/>
+                <w:highlight w:val="yellow"/>
+              </w:rPr>
+              <w:t>subcategory</w:t>
+            </w:r>
+            <w:r>
+              <w:rPr>
+                <w:rFonts w:ascii="Calibri" w:hAnsi="Calibri" w:cs="Calibri"/>
+                <w:color w:val="000000"/>
+                <w:sz w:val="22"/>
+              </w:rPr>
+              <w:t>,</w:t>
+            </w:r>
+          </w:p>
+          <w:p>
+            <w:pPr>
+              <w:spacing w:after="0" w:line="240" w:lineRule="auto"/>
+              <w:rPr>
+                <w:rFonts w:ascii="Calibri" w:hAnsi="Calibri" w:cs="Calibri"/>
+                <w:color w:val="000000"/>
+                <w:sz w:val="22"/>
+              </w:rPr>
+            </w:pPr>
+            <w:r>
+              <w:rPr>
+                <w:rFonts w:ascii="Calibri" w:hAnsi="Calibri" w:cs="Calibri"/>
+                <w:color w:val="000000"/>
+                <w:sz w:val="22"/>
+              </w:rPr>
+              <w:t>brand,</w:t>
+            </w:r>
+          </w:p>
+          <w:p>
+            <w:pPr>
+              <w:spacing w:after="0" w:line="240" w:lineRule="auto"/>
+              <w:rPr>
+                <w:rFonts w:ascii="Calibri" w:hAnsi="Calibri" w:cs="Calibri"/>
+                <w:color w:val="000000"/>
+                <w:sz w:val="22"/>
+              </w:rPr>
+            </w:pPr>
+            <w:proofErr w:type="spellStart"/>
+            <w:r>
+              <w:rPr>
+                <w:rFonts w:ascii="Calibri" w:hAnsi="Calibri" w:cs="Calibri"/>
+                <w:color w:val="000000"/>
+                <w:sz w:val="22"/>
+              </w:rPr>
+              <w:t>unit_cost</w:t>
+            </w:r>
+            <w:proofErr w:type="spellEnd"/>
+            <w:r>
+              <w:rPr>
+                <w:rFonts w:ascii="Calibri" w:hAnsi="Calibri" w:cs="Calibri"/>
+                <w:color w:val="000000"/>
+                <w:sz w:val="22"/>
+              </w:rPr>
+              <w:t>,</w:t>
+            </w:r>
+          </w:p>
+          <w:p>
+            <w:pPr>
+              <w:spacing w:after="0" w:line="240" w:lineRule="auto"/>
+              <w:rPr>
+                <w:rFonts w:ascii="Calibri" w:hAnsi="Calibri" w:cs="Calibri"/>
+                <w:color w:val="000000"/>
+                <w:sz w:val="22"/>
+              </w:rPr>
+            </w:pPr>
+            <w:proofErr w:type="spellStart"/>
+            <w:r>
+              <w:rPr>
+                <w:rFonts w:ascii="Calibri" w:hAnsi="Calibri" w:cs="Calibri"/>
+                <w:color w:val="000000"/>
+                <w:sz w:val="22"/>
+              </w:rPr>
+              <w:t>list_price</w:t>
+            </w:r>
+            <w:proofErr w:type="spellEnd"/>
+            <w:r>
+              <w:rPr>
+                <w:rFonts w:ascii="Calibri" w:hAnsi="Calibri" w:cs="Calibri"/>
+                <w:color w:val="000000"/>
+                <w:sz w:val="22"/>
+              </w:rPr>
+              <w:t>,</w:t>
+            </w:r>
+          </w:p>
+          <w:p>
+            <w:pPr>
+              <w:spacing w:after="0" w:line="240" w:lineRule="auto"/>
+              <w:rPr>
+                <w:rFonts w:ascii="Calibri" w:hAnsi="Calibri" w:cs="Calibri"/>
+                <w:color w:val="000000"/>
+                <w:sz w:val="22"/>
+              </w:rPr>
+            </w:pPr>
+            <w:proofErr w:type="spellStart"/>
+            <w:r>
+              <w:rPr>
+                <w:rFonts w:ascii="Calibri" w:hAnsi="Calibri" w:cs="Calibri"/>
+                <w:color w:val="000000"/>
+                <w:sz w:val="22"/>
+              </w:rPr>
+              <w:t>supplier_id</w:t>
+            </w:r>
+            <w:proofErr w:type="spellEnd"/>
+            <w:r>
+              <w:rPr>
+                <w:rFonts w:ascii="Calibri" w:hAnsi="Calibri" w:cs="Calibri"/>
+                <w:color w:val="000000"/>
+                <w:sz w:val="22"/>
+              </w:rPr>
+              <w:t>,</w:t>
+            </w:r>
+          </w:p>
+          <w:p>
+            <w:pPr>
+              <w:spacing w:after="0" w:line="240" w:lineRule="auto"/>
+              <w:rPr>
+                <w:rFonts w:ascii="Calibri" w:hAnsi="Calibri" w:cs="Calibri"/>
+                <w:color w:val="000000"/>
+                <w:sz w:val="22"/>
+              </w:rPr>
+            </w:pPr>
+            <w:proofErr w:type="spellStart"/>
+            <w:r>
+              <w:rPr>
+                <w:rFonts w:ascii="Calibri" w:hAnsi="Calibri" w:cs="Calibri"/>
+                <w:color w:val="000000"/>
+                <w:sz w:val="22"/>
+              </w:rPr>
+              <w:t>launch_date</w:t>
+            </w:r>
+            <w:proofErr w:type="spellEnd"/>
+            <w:r>
+              <w:rPr>
+                <w:rFonts w:ascii="Calibri" w:hAnsi="Calibri" w:cs="Calibri"/>
+                <w:color w:val="000000"/>
+                <w:sz w:val="22"/>
+              </w:rPr>
+              <w:t>,</w:t>
+            </w:r>
+          </w:p>
+          <w:p>
+            <w:pPr>
+              <w:spacing w:after="0" w:line="240" w:lineRule="auto"/>
+              <w:rPr>
+                <w:rFonts w:ascii="Calibri" w:hAnsi="Calibri" w:cs="Calibri"/>
+                <w:color w:val="000000"/>
+                <w:sz w:val="22"/>
+              </w:rPr>
+            </w:pPr>
+            <w:proofErr w:type="spellStart"/>
+            <w:r>
+              <w:rPr>
+                <w:rFonts w:ascii="Calibri" w:hAnsi="Calibri" w:cs="Calibri"/>
+                <w:color w:val="000000"/>
+                <w:sz w:val="22"/>
+              </w:rPr>
+              <w:t>active_flag</w:t>
+            </w:r>
+            <w:proofErr w:type="spellEnd"/>
+          </w:p>
           <w:p>
             <w:pPr>
               <w:spacing w:after="40"/>
@@ -3526,14 +3950,15 @@
         </w:tc>
         <w:tc>
           <w:tcPr>
-            <w:tcW w:w="1769" w:type="dxa"/>
+            <w:tcW w:w="1090" w:type="dxa"/>
           </w:tcPr>
           <w:p>
             <w:pPr>
               <w:spacing w:after="40"/>
             </w:pPr>
             <w:r>
-              <w:t>Sales system/Customers Data owner</w:t>
+              <w:lastRenderedPageBreak/>
+              <w:t>Product master-data owner</w:t>
             </w:r>
           </w:p>
         </w:tc>
@@ -3552,7 +3977,7 @@
         </w:tc>
         <w:tc>
           <w:tcPr>
-            <w:tcW w:w="1080" w:type="dxa"/>
+            <w:tcW w:w="717" w:type="dxa"/>
           </w:tcPr>
           <w:p>
             <w:pPr>
@@ -3562,7 +3987,7 @@
         </w:tc>
         <w:tc>
           <w:tcPr>
-            <w:tcW w:w="1622" w:type="dxa"/>
+            <w:tcW w:w="1985" w:type="dxa"/>
           </w:tcPr>
           <w:p>
             <w:pPr>
@@ -3575,20 +4000,20 @@
         </w:tc>
         <w:tc>
           <w:tcPr>
-            <w:tcW w:w="1622" w:type="dxa"/>
+            <w:tcW w:w="1984" w:type="dxa"/>
           </w:tcPr>
           <w:p>
             <w:pPr>
               <w:spacing w:after="40"/>
             </w:pPr>
             <w:r>
-              <w:t>Internal, restricted-may contains PII(personally identifiable information)</w:t>
-            </w:r>
-          </w:p>
-        </w:tc>
-        <w:tc>
-          <w:tcPr>
-            <w:tcW w:w="1017" w:type="dxa"/>
+              <w:t>Internal-contains product master data and pricing</w:t>
+            </w:r>
+          </w:p>
+        </w:tc>
+        <w:tc>
+          <w:tcPr>
+            <w:tcW w:w="655" w:type="dxa"/>
           </w:tcPr>
           <w:p>
             <w:pPr>
@@ -3607,14 +4032,290 @@
               <w:spacing w:after="40"/>
             </w:pPr>
             <w:r>
-              <w:t>SQL products table</w:t>
-            </w:r>
-          </w:p>
-        </w:tc>
-        <w:tc>
-          <w:tcPr>
-            <w:tcW w:w="992" w:type="dxa"/>
-          </w:tcPr>
+              <w:t>SQL orders table</w:t>
+            </w:r>
+          </w:p>
+        </w:tc>
+        <w:tc>
+          <w:tcPr>
+            <w:tcW w:w="1671" w:type="dxa"/>
+          </w:tcPr>
+          <w:p>
+            <w:pPr>
+              <w:spacing w:after="0" w:line="240" w:lineRule="auto"/>
+              <w:rPr>
+                <w:rFonts w:ascii="Calibri" w:hAnsi="Calibri" w:cs="Calibri"/>
+                <w:color w:val="000000"/>
+                <w:sz w:val="22"/>
+              </w:rPr>
+            </w:pPr>
+            <w:proofErr w:type="spellStart"/>
+            <w:r>
+              <w:rPr>
+                <w:rFonts w:ascii="Calibri" w:hAnsi="Calibri" w:cs="Calibri"/>
+                <w:color w:val="000000"/>
+                <w:sz w:val="22"/>
+                <w:highlight w:val="yellow"/>
+              </w:rPr>
+              <w:t>order_id</w:t>
+            </w:r>
+            <w:proofErr w:type="spellEnd"/>
+            <w:r>
+              <w:rPr>
+                <w:rFonts w:ascii="Calibri" w:hAnsi="Calibri" w:cs="Calibri"/>
+                <w:color w:val="000000"/>
+                <w:sz w:val="22"/>
+              </w:rPr>
+              <w:t>,</w:t>
+            </w:r>
+          </w:p>
+          <w:p>
+            <w:pPr>
+              <w:spacing w:after="0" w:line="240" w:lineRule="auto"/>
+              <w:rPr>
+                <w:rFonts w:ascii="Calibri" w:hAnsi="Calibri" w:cs="Calibri"/>
+                <w:color w:val="000000"/>
+                <w:sz w:val="22"/>
+              </w:rPr>
+            </w:pPr>
+            <w:proofErr w:type="spellStart"/>
+            <w:r>
+              <w:rPr>
+                <w:rFonts w:ascii="Calibri" w:hAnsi="Calibri" w:cs="Calibri"/>
+                <w:color w:val="000000"/>
+                <w:sz w:val="22"/>
+                <w:highlight w:val="yellow"/>
+              </w:rPr>
+              <w:t>order_date</w:t>
+            </w:r>
+            <w:proofErr w:type="spellEnd"/>
+            <w:r>
+              <w:rPr>
+                <w:rFonts w:ascii="Calibri" w:hAnsi="Calibri" w:cs="Calibri"/>
+                <w:color w:val="000000"/>
+                <w:sz w:val="22"/>
+              </w:rPr>
+              <w:t>,</w:t>
+            </w:r>
+          </w:p>
+          <w:p>
+            <w:pPr>
+              <w:spacing w:after="0" w:line="240" w:lineRule="auto"/>
+              <w:rPr>
+                <w:rFonts w:ascii="Calibri" w:hAnsi="Calibri" w:cs="Calibri"/>
+                <w:color w:val="000000"/>
+                <w:sz w:val="22"/>
+              </w:rPr>
+            </w:pPr>
+            <w:proofErr w:type="spellStart"/>
+            <w:r>
+              <w:rPr>
+                <w:rFonts w:ascii="Calibri" w:hAnsi="Calibri" w:cs="Calibri"/>
+                <w:color w:val="000000"/>
+                <w:sz w:val="22"/>
+              </w:rPr>
+              <w:t>customer_id</w:t>
+            </w:r>
+            <w:proofErr w:type="spellEnd"/>
+            <w:r>
+              <w:rPr>
+                <w:rFonts w:ascii="Calibri" w:hAnsi="Calibri" w:cs="Calibri"/>
+                <w:color w:val="000000"/>
+                <w:sz w:val="22"/>
+              </w:rPr>
+              <w:t>,</w:t>
+            </w:r>
+          </w:p>
+          <w:p>
+            <w:pPr>
+              <w:spacing w:after="0" w:line="240" w:lineRule="auto"/>
+              <w:rPr>
+                <w:rFonts w:ascii="Calibri" w:hAnsi="Calibri" w:cs="Calibri"/>
+                <w:color w:val="000000"/>
+                <w:sz w:val="22"/>
+              </w:rPr>
+            </w:pPr>
+            <w:proofErr w:type="spellStart"/>
+            <w:r>
+              <w:rPr>
+                <w:rFonts w:ascii="Calibri" w:hAnsi="Calibri" w:cs="Calibri"/>
+                <w:color w:val="000000"/>
+                <w:sz w:val="22"/>
+              </w:rPr>
+              <w:t>channel_id</w:t>
+            </w:r>
+            <w:proofErr w:type="spellEnd"/>
+            <w:r>
+              <w:rPr>
+                <w:rFonts w:ascii="Calibri" w:hAnsi="Calibri" w:cs="Calibri"/>
+                <w:color w:val="000000"/>
+                <w:sz w:val="22"/>
+              </w:rPr>
+              <w:t>,</w:t>
+            </w:r>
+          </w:p>
+          <w:p>
+            <w:pPr>
+              <w:spacing w:after="0" w:line="240" w:lineRule="auto"/>
+              <w:rPr>
+                <w:rFonts w:ascii="Calibri" w:hAnsi="Calibri" w:cs="Calibri"/>
+                <w:color w:val="000000"/>
+                <w:sz w:val="22"/>
+              </w:rPr>
+            </w:pPr>
+            <w:proofErr w:type="spellStart"/>
+            <w:r>
+              <w:rPr>
+                <w:rFonts w:ascii="Calibri" w:hAnsi="Calibri" w:cs="Calibri"/>
+                <w:color w:val="000000"/>
+                <w:sz w:val="22"/>
+                <w:highlight w:val="yellow"/>
+              </w:rPr>
+              <w:t>region_id</w:t>
+            </w:r>
+            <w:proofErr w:type="spellEnd"/>
+            <w:r>
+              <w:rPr>
+                <w:rFonts w:ascii="Calibri" w:hAnsi="Calibri" w:cs="Calibri"/>
+                <w:color w:val="000000"/>
+                <w:sz w:val="22"/>
+              </w:rPr>
+              <w:t>,</w:t>
+            </w:r>
+          </w:p>
+          <w:p>
+            <w:pPr>
+              <w:spacing w:after="0" w:line="240" w:lineRule="auto"/>
+              <w:rPr>
+                <w:rFonts w:ascii="Calibri" w:hAnsi="Calibri" w:cs="Calibri"/>
+                <w:color w:val="000000"/>
+                <w:sz w:val="22"/>
+              </w:rPr>
+            </w:pPr>
+            <w:proofErr w:type="spellStart"/>
+            <w:r>
+              <w:rPr>
+                <w:rFonts w:ascii="Calibri" w:hAnsi="Calibri" w:cs="Calibri"/>
+                <w:color w:val="000000"/>
+                <w:sz w:val="22"/>
+              </w:rPr>
+              <w:t>payment_method</w:t>
+            </w:r>
+            <w:proofErr w:type="spellEnd"/>
+            <w:r>
+              <w:rPr>
+                <w:rFonts w:ascii="Calibri" w:hAnsi="Calibri" w:cs="Calibri"/>
+                <w:color w:val="000000"/>
+                <w:sz w:val="22"/>
+              </w:rPr>
+              <w:t>,</w:t>
+            </w:r>
+          </w:p>
+          <w:p>
+            <w:pPr>
+              <w:spacing w:after="0" w:line="240" w:lineRule="auto"/>
+              <w:rPr>
+                <w:rFonts w:ascii="Calibri" w:hAnsi="Calibri" w:cs="Calibri"/>
+                <w:color w:val="000000"/>
+                <w:sz w:val="22"/>
+              </w:rPr>
+            </w:pPr>
+            <w:proofErr w:type="spellStart"/>
+            <w:r>
+              <w:rPr>
+                <w:rFonts w:ascii="Calibri" w:hAnsi="Calibri" w:cs="Calibri"/>
+                <w:color w:val="000000"/>
+                <w:sz w:val="22"/>
+                <w:highlight w:val="yellow"/>
+              </w:rPr>
+              <w:t>order_status</w:t>
+            </w:r>
+            <w:proofErr w:type="spellEnd"/>
+            <w:r>
+              <w:rPr>
+                <w:rFonts w:ascii="Calibri" w:hAnsi="Calibri" w:cs="Calibri"/>
+                <w:color w:val="000000"/>
+                <w:sz w:val="22"/>
+              </w:rPr>
+              <w:t>,</w:t>
+            </w:r>
+          </w:p>
+          <w:p>
+            <w:pPr>
+              <w:spacing w:after="0" w:line="240" w:lineRule="auto"/>
+              <w:rPr>
+                <w:rFonts w:ascii="Calibri" w:hAnsi="Calibri" w:cs="Calibri"/>
+                <w:color w:val="000000"/>
+                <w:sz w:val="22"/>
+              </w:rPr>
+            </w:pPr>
+            <w:proofErr w:type="spellStart"/>
+            <w:r>
+              <w:rPr>
+                <w:rFonts w:ascii="Calibri" w:hAnsi="Calibri" w:cs="Calibri"/>
+                <w:color w:val="000000"/>
+                <w:sz w:val="22"/>
+              </w:rPr>
+              <w:t>campaign_code</w:t>
+            </w:r>
+            <w:proofErr w:type="spellEnd"/>
+            <w:r>
+              <w:rPr>
+                <w:rFonts w:ascii="Calibri" w:hAnsi="Calibri" w:cs="Calibri"/>
+                <w:color w:val="000000"/>
+                <w:sz w:val="22"/>
+              </w:rPr>
+              <w:t>,</w:t>
+            </w:r>
+          </w:p>
+          <w:p>
+            <w:pPr>
+              <w:spacing w:after="0" w:line="240" w:lineRule="auto"/>
+              <w:rPr>
+                <w:rFonts w:ascii="Calibri" w:hAnsi="Calibri" w:cs="Calibri"/>
+                <w:color w:val="000000"/>
+                <w:sz w:val="22"/>
+              </w:rPr>
+            </w:pPr>
+            <w:proofErr w:type="spellStart"/>
+            <w:r>
+              <w:rPr>
+                <w:rFonts w:ascii="Calibri" w:hAnsi="Calibri" w:cs="Calibri"/>
+                <w:color w:val="000000"/>
+                <w:sz w:val="22"/>
+              </w:rPr>
+              <w:t>shipping_fee</w:t>
+            </w:r>
+            <w:proofErr w:type="spellEnd"/>
+            <w:r>
+              <w:rPr>
+                <w:rFonts w:ascii="Calibri" w:hAnsi="Calibri" w:cs="Calibri"/>
+                <w:color w:val="000000"/>
+                <w:sz w:val="22"/>
+              </w:rPr>
+              <w:t>,</w:t>
+            </w:r>
+          </w:p>
+          <w:p>
+            <w:pPr>
+              <w:spacing w:after="0" w:line="240" w:lineRule="auto"/>
+              <w:rPr>
+                <w:rFonts w:ascii="Calibri" w:hAnsi="Calibri" w:cs="Calibri"/>
+                <w:color w:val="000000"/>
+                <w:sz w:val="22"/>
+              </w:rPr>
+            </w:pPr>
+            <w:proofErr w:type="spellStart"/>
+            <w:r>
+              <w:rPr>
+                <w:rFonts w:ascii="Calibri" w:hAnsi="Calibri" w:cs="Calibri"/>
+                <w:color w:val="000000"/>
+                <w:sz w:val="22"/>
+              </w:rPr>
+              <w:t>order_source_system</w:t>
+            </w:r>
+            <w:proofErr w:type="spellEnd"/>
+          </w:p>
           <w:p>
             <w:pPr>
               <w:spacing w:after="40"/>
@@ -3623,14 +4324,14 @@
         </w:tc>
         <w:tc>
           <w:tcPr>
-            <w:tcW w:w="1769" w:type="dxa"/>
+            <w:tcW w:w="1090" w:type="dxa"/>
           </w:tcPr>
           <w:p>
             <w:pPr>
               <w:spacing w:after="40"/>
             </w:pPr>
             <w:r>
-              <w:t>Product master-data owner</w:t>
+              <w:t>Sales op manager</w:t>
             </w:r>
           </w:p>
         </w:tc>
@@ -3649,7 +4350,7 @@
         </w:tc>
         <w:tc>
           <w:tcPr>
-            <w:tcW w:w="1080" w:type="dxa"/>
+            <w:tcW w:w="717" w:type="dxa"/>
           </w:tcPr>
           <w:p>
             <w:pPr>
@@ -3659,7 +4360,7 @@
         </w:tc>
         <w:tc>
           <w:tcPr>
-            <w:tcW w:w="1622" w:type="dxa"/>
+            <w:tcW w:w="1985" w:type="dxa"/>
           </w:tcPr>
           <w:p>
             <w:pPr>
@@ -3672,20 +4373,26 @@
         </w:tc>
         <w:tc>
           <w:tcPr>
-            <w:tcW w:w="1622" w:type="dxa"/>
+            <w:tcW w:w="1984" w:type="dxa"/>
           </w:tcPr>
           <w:p>
             <w:pPr>
               <w:spacing w:after="40"/>
             </w:pPr>
             <w:r>
-              <w:t>Internal-contains product master data and pricing</w:t>
-            </w:r>
-          </w:p>
-        </w:tc>
-        <w:tc>
-          <w:tcPr>
-            <w:tcW w:w="1017" w:type="dxa"/>
+              <w:t xml:space="preserve">Confidential-contain </w:t>
+            </w:r>
+            <w:r>
+              <w:t>transaction</w:t>
+            </w:r>
+            <w:r>
+              <w:t xml:space="preserve"> data</w:t>
+            </w:r>
+          </w:p>
+        </w:tc>
+        <w:tc>
+          <w:tcPr>
+            <w:tcW w:w="655" w:type="dxa"/>
           </w:tcPr>
           <w:p>
             <w:pPr>
@@ -3704,14 +4411,263 @@
               <w:spacing w:after="40"/>
             </w:pPr>
             <w:r>
-              <w:t>SQL orders table</w:t>
-            </w:r>
-          </w:p>
-        </w:tc>
-        <w:tc>
-          <w:tcPr>
-            <w:tcW w:w="992" w:type="dxa"/>
-          </w:tcPr>
+              <w:t>SQL order-items table</w:t>
+            </w:r>
+          </w:p>
+        </w:tc>
+        <w:tc>
+          <w:tcPr>
+            <w:tcW w:w="1671" w:type="dxa"/>
+          </w:tcPr>
+          <w:p>
+            <w:pPr>
+              <w:spacing w:after="0" w:line="240" w:lineRule="auto"/>
+              <w:rPr>
+                <w:rFonts w:ascii="Calibri" w:hAnsi="Calibri" w:cs="Calibri"/>
+                <w:color w:val="000000"/>
+                <w:sz w:val="22"/>
+              </w:rPr>
+            </w:pPr>
+            <w:proofErr w:type="spellStart"/>
+            <w:r>
+              <w:rPr>
+                <w:rFonts w:ascii="Calibri" w:hAnsi="Calibri" w:cs="Calibri"/>
+                <w:color w:val="000000"/>
+                <w:sz w:val="22"/>
+                <w:highlight w:val="yellow"/>
+              </w:rPr>
+              <w:t>order_line_id</w:t>
+            </w:r>
+            <w:proofErr w:type="spellEnd"/>
+            <w:r>
+              <w:rPr>
+                <w:rFonts w:ascii="Calibri" w:hAnsi="Calibri" w:cs="Calibri"/>
+                <w:color w:val="000000"/>
+                <w:sz w:val="22"/>
+              </w:rPr>
+              <w:t>,</w:t>
+            </w:r>
+          </w:p>
+          <w:p>
+            <w:pPr>
+              <w:spacing w:after="0" w:line="240" w:lineRule="auto"/>
+              <w:rPr>
+                <w:rFonts w:ascii="Calibri" w:hAnsi="Calibri" w:cs="Calibri"/>
+                <w:color w:val="000000"/>
+                <w:sz w:val="22"/>
+              </w:rPr>
+            </w:pPr>
+            <w:proofErr w:type="spellStart"/>
+            <w:r>
+              <w:rPr>
+                <w:rFonts w:ascii="Calibri" w:hAnsi="Calibri" w:cs="Calibri"/>
+                <w:color w:val="000000"/>
+                <w:sz w:val="22"/>
+                <w:highlight w:val="yellow"/>
+              </w:rPr>
+              <w:t>order_id</w:t>
+            </w:r>
+            <w:proofErr w:type="spellEnd"/>
+            <w:r>
+              <w:rPr>
+                <w:rFonts w:ascii="Calibri" w:hAnsi="Calibri" w:cs="Calibri"/>
+                <w:color w:val="000000"/>
+                <w:sz w:val="22"/>
+              </w:rPr>
+              <w:t>,</w:t>
+            </w:r>
+          </w:p>
+          <w:p>
+            <w:pPr>
+              <w:spacing w:after="0" w:line="240" w:lineRule="auto"/>
+              <w:rPr>
+                <w:rFonts w:ascii="Calibri" w:hAnsi="Calibri" w:cs="Calibri"/>
+                <w:color w:val="000000"/>
+                <w:sz w:val="22"/>
+              </w:rPr>
+            </w:pPr>
+            <w:proofErr w:type="spellStart"/>
+            <w:r>
+              <w:rPr>
+                <w:rFonts w:ascii="Calibri" w:hAnsi="Calibri" w:cs="Calibri"/>
+                <w:color w:val="000000"/>
+                <w:sz w:val="22"/>
+                <w:highlight w:val="yellow"/>
+              </w:rPr>
+              <w:t>product_id</w:t>
+            </w:r>
+            <w:proofErr w:type="spellEnd"/>
+            <w:r>
+              <w:rPr>
+                <w:rFonts w:ascii="Calibri" w:hAnsi="Calibri" w:cs="Calibri"/>
+                <w:color w:val="000000"/>
+                <w:sz w:val="22"/>
+              </w:rPr>
+              <w:t>,</w:t>
+            </w:r>
+          </w:p>
+          <w:p>
+            <w:pPr>
+              <w:spacing w:after="0" w:line="240" w:lineRule="auto"/>
+              <w:rPr>
+                <w:rFonts w:ascii="Calibri" w:hAnsi="Calibri" w:cs="Calibri"/>
+                <w:color w:val="000000"/>
+                <w:sz w:val="22"/>
+              </w:rPr>
+            </w:pPr>
+            <w:r>
+              <w:rPr>
+                <w:rFonts w:ascii="Calibri" w:hAnsi="Calibri" w:cs="Calibri"/>
+                <w:color w:val="000000"/>
+                <w:sz w:val="22"/>
+                <w:highlight w:val="yellow"/>
+              </w:rPr>
+              <w:t>quantity</w:t>
+            </w:r>
+            <w:r>
+              <w:rPr>
+                <w:rFonts w:ascii="Calibri" w:hAnsi="Calibri" w:cs="Calibri"/>
+                <w:color w:val="000000"/>
+                <w:sz w:val="22"/>
+              </w:rPr>
+              <w:t>,</w:t>
+            </w:r>
+          </w:p>
+          <w:p>
+            <w:pPr>
+              <w:spacing w:after="0" w:line="240" w:lineRule="auto"/>
+              <w:rPr>
+                <w:rFonts w:ascii="Calibri" w:hAnsi="Calibri" w:cs="Calibri"/>
+                <w:color w:val="000000"/>
+                <w:sz w:val="22"/>
+              </w:rPr>
+            </w:pPr>
+            <w:proofErr w:type="spellStart"/>
+            <w:r>
+              <w:rPr>
+                <w:rFonts w:ascii="Calibri" w:hAnsi="Calibri" w:cs="Calibri"/>
+                <w:color w:val="000000"/>
+                <w:sz w:val="22"/>
+                <w:highlight w:val="yellow"/>
+              </w:rPr>
+              <w:t>unit_price</w:t>
+            </w:r>
+            <w:proofErr w:type="spellEnd"/>
+            <w:r>
+              <w:rPr>
+                <w:rFonts w:ascii="Calibri" w:hAnsi="Calibri" w:cs="Calibri"/>
+                <w:color w:val="000000"/>
+                <w:sz w:val="22"/>
+              </w:rPr>
+              <w:t>,</w:t>
+            </w:r>
+          </w:p>
+          <w:p>
+            <w:pPr>
+              <w:spacing w:after="0" w:line="240" w:lineRule="auto"/>
+              <w:rPr>
+                <w:rFonts w:ascii="Calibri" w:hAnsi="Calibri" w:cs="Calibri"/>
+                <w:color w:val="000000"/>
+                <w:sz w:val="22"/>
+              </w:rPr>
+            </w:pPr>
+            <w:proofErr w:type="spellStart"/>
+            <w:r>
+              <w:rPr>
+                <w:rFonts w:ascii="Calibri" w:hAnsi="Calibri" w:cs="Calibri"/>
+                <w:color w:val="000000"/>
+                <w:sz w:val="22"/>
+                <w:highlight w:val="yellow"/>
+              </w:rPr>
+              <w:t>discount_amount</w:t>
+            </w:r>
+            <w:proofErr w:type="spellEnd"/>
+            <w:r>
+              <w:rPr>
+                <w:rFonts w:ascii="Calibri" w:hAnsi="Calibri" w:cs="Calibri"/>
+                <w:color w:val="000000"/>
+                <w:sz w:val="22"/>
+              </w:rPr>
+              <w:t>,</w:t>
+            </w:r>
+          </w:p>
+          <w:p>
+            <w:pPr>
+              <w:spacing w:after="0" w:line="240" w:lineRule="auto"/>
+              <w:rPr>
+                <w:rFonts w:ascii="Calibri" w:hAnsi="Calibri" w:cs="Calibri"/>
+                <w:color w:val="000000"/>
+                <w:sz w:val="22"/>
+              </w:rPr>
+            </w:pPr>
+            <w:proofErr w:type="spellStart"/>
+            <w:r>
+              <w:rPr>
+                <w:rFonts w:ascii="Calibri" w:hAnsi="Calibri" w:cs="Calibri"/>
+                <w:color w:val="000000"/>
+                <w:sz w:val="22"/>
+                <w:highlight w:val="yellow"/>
+              </w:rPr>
+              <w:t>net_amount</w:t>
+            </w:r>
+            <w:proofErr w:type="spellEnd"/>
+            <w:r>
+              <w:rPr>
+                <w:rFonts w:ascii="Calibri" w:hAnsi="Calibri" w:cs="Calibri"/>
+                <w:color w:val="000000"/>
+                <w:sz w:val="22"/>
+              </w:rPr>
+              <w:t>,</w:t>
+            </w:r>
+          </w:p>
+          <w:p>
+            <w:pPr>
+              <w:spacing w:after="0" w:line="240" w:lineRule="auto"/>
+              <w:rPr>
+                <w:rFonts w:ascii="Calibri" w:hAnsi="Calibri" w:cs="Calibri"/>
+                <w:color w:val="000000"/>
+                <w:sz w:val="22"/>
+              </w:rPr>
+            </w:pPr>
+            <w:proofErr w:type="spellStart"/>
+            <w:r>
+              <w:rPr>
+                <w:rFonts w:ascii="Calibri" w:hAnsi="Calibri" w:cs="Calibri"/>
+                <w:color w:val="000000"/>
+                <w:sz w:val="22"/>
+              </w:rPr>
+              <w:t>tax_amount</w:t>
+            </w:r>
+            <w:proofErr w:type="spellEnd"/>
+            <w:r>
+              <w:rPr>
+                <w:rFonts w:ascii="Calibri" w:hAnsi="Calibri" w:cs="Calibri"/>
+                <w:color w:val="000000"/>
+                <w:sz w:val="22"/>
+              </w:rPr>
+              <w:t>,</w:t>
+            </w:r>
+          </w:p>
+          <w:p>
+            <w:pPr>
+              <w:spacing w:after="0" w:line="240" w:lineRule="auto"/>
+              <w:rPr>
+                <w:rFonts w:ascii="Calibri" w:hAnsi="Calibri" w:cs="Calibri"/>
+                <w:color w:val="000000"/>
+                <w:sz w:val="22"/>
+              </w:rPr>
+            </w:pPr>
+            <w:proofErr w:type="spellStart"/>
+            <w:r>
+              <w:rPr>
+                <w:rFonts w:ascii="Calibri" w:hAnsi="Calibri" w:cs="Calibri"/>
+                <w:color w:val="000000"/>
+                <w:sz w:val="22"/>
+              </w:rPr>
+              <w:t>warehouse_id</w:t>
+            </w:r>
+            <w:proofErr w:type="spellEnd"/>
+          </w:p>
           <w:p>
             <w:pPr>
               <w:spacing w:after="40"/>
@@ -3720,7 +4676,7 @@
         </w:tc>
         <w:tc>
           <w:tcPr>
-            <w:tcW w:w="1769" w:type="dxa"/>
+            <w:tcW w:w="1090" w:type="dxa"/>
           </w:tcPr>
           <w:p>
             <w:pPr>
@@ -3746,7 +4702,7 @@
         </w:tc>
         <w:tc>
           <w:tcPr>
-            <w:tcW w:w="1080" w:type="dxa"/>
+            <w:tcW w:w="717" w:type="dxa"/>
           </w:tcPr>
           <w:p>
             <w:pPr>
@@ -3756,7 +4712,7 @@
         </w:tc>
         <w:tc>
           <w:tcPr>
-            <w:tcW w:w="1622" w:type="dxa"/>
+            <w:tcW w:w="1985" w:type="dxa"/>
           </w:tcPr>
           <w:p>
             <w:pPr>
@@ -3769,26 +4725,23 @@
         </w:tc>
         <w:tc>
           <w:tcPr>
-            <w:tcW w:w="1622" w:type="dxa"/>
+            <w:tcW w:w="1984" w:type="dxa"/>
           </w:tcPr>
           <w:p>
             <w:pPr>
               <w:spacing w:after="40"/>
             </w:pPr>
             <w:r>
-              <w:t xml:space="preserve">Confidential-contain </w:t>
-            </w:r>
-            <w:r>
-              <w:t>transaction</w:t>
-            </w:r>
-            <w:r>
-              <w:t xml:space="preserve"> data</w:t>
-            </w:r>
-          </w:p>
-        </w:tc>
-        <w:tc>
-          <w:tcPr>
-            <w:tcW w:w="1017" w:type="dxa"/>
+              <w:t>Internal</w:t>
+            </w:r>
+            <w:r>
+              <w:t>-contain transaction and pricing data</w:t>
+            </w:r>
+          </w:p>
+        </w:tc>
+        <w:tc>
+          <w:tcPr>
+            <w:tcW w:w="655" w:type="dxa"/>
           </w:tcPr>
           <w:p>
             <w:pPr>
@@ -3807,15 +4760,148 @@
               <w:spacing w:after="40"/>
             </w:pPr>
             <w:r>
-              <w:lastRenderedPageBreak/>
-              <w:t>SQL order-items table</w:t>
-            </w:r>
-          </w:p>
-        </w:tc>
-        <w:tc>
-          <w:tcPr>
-            <w:tcW w:w="992" w:type="dxa"/>
-          </w:tcPr>
+              <w:t>SQL regions table</w:t>
+            </w:r>
+          </w:p>
+        </w:tc>
+        <w:tc>
+          <w:tcPr>
+            <w:tcW w:w="1671" w:type="dxa"/>
+          </w:tcPr>
+          <w:p>
+            <w:pPr>
+              <w:spacing w:after="0" w:line="240" w:lineRule="auto"/>
+              <w:rPr>
+                <w:rFonts w:ascii="Calibri" w:hAnsi="Calibri" w:cs="Calibri"/>
+                <w:color w:val="000000"/>
+                <w:sz w:val="22"/>
+              </w:rPr>
+            </w:pPr>
+            <w:proofErr w:type="spellStart"/>
+            <w:r>
+              <w:rPr>
+                <w:rFonts w:ascii="Calibri" w:hAnsi="Calibri" w:cs="Calibri"/>
+                <w:color w:val="000000"/>
+                <w:sz w:val="22"/>
+                <w:highlight w:val="yellow"/>
+              </w:rPr>
+              <w:t>region_id</w:t>
+            </w:r>
+            <w:proofErr w:type="spellEnd"/>
+            <w:r>
+              <w:rPr>
+                <w:rFonts w:ascii="Calibri" w:hAnsi="Calibri" w:cs="Calibri"/>
+                <w:color w:val="000000"/>
+                <w:sz w:val="22"/>
+              </w:rPr>
+              <w:t>,</w:t>
+            </w:r>
+          </w:p>
+          <w:p>
+            <w:pPr>
+              <w:spacing w:after="0" w:line="240" w:lineRule="auto"/>
+              <w:rPr>
+                <w:rFonts w:ascii="Calibri" w:hAnsi="Calibri" w:cs="Calibri"/>
+                <w:color w:val="000000"/>
+                <w:sz w:val="22"/>
+              </w:rPr>
+            </w:pPr>
+            <w:r>
+              <w:rPr>
+                <w:rFonts w:ascii="Calibri" w:hAnsi="Calibri" w:cs="Calibri"/>
+                <w:color w:val="000000"/>
+                <w:sz w:val="22"/>
+                <w:highlight w:val="yellow"/>
+              </w:rPr>
+              <w:t>province</w:t>
+            </w:r>
+            <w:r>
+              <w:rPr>
+                <w:rFonts w:ascii="Calibri" w:hAnsi="Calibri" w:cs="Calibri"/>
+                <w:color w:val="000000"/>
+                <w:sz w:val="22"/>
+              </w:rPr>
+              <w:t>,</w:t>
+            </w:r>
+          </w:p>
+          <w:p>
+            <w:pPr>
+              <w:spacing w:after="0" w:line="240" w:lineRule="auto"/>
+              <w:rPr>
+                <w:rFonts w:ascii="Calibri" w:hAnsi="Calibri" w:cs="Calibri"/>
+                <w:color w:val="000000"/>
+                <w:sz w:val="22"/>
+              </w:rPr>
+            </w:pPr>
+            <w:proofErr w:type="spellStart"/>
+            <w:r>
+              <w:rPr>
+                <w:rFonts w:ascii="Calibri" w:hAnsi="Calibri" w:cs="Calibri"/>
+                <w:color w:val="000000"/>
+                <w:sz w:val="22"/>
+                <w:highlight w:val="yellow"/>
+              </w:rPr>
+              <w:t>sales_territory</w:t>
+            </w:r>
+            <w:proofErr w:type="spellEnd"/>
+            <w:r>
+              <w:rPr>
+                <w:rFonts w:ascii="Calibri" w:hAnsi="Calibri" w:cs="Calibri"/>
+                <w:color w:val="000000"/>
+                <w:sz w:val="22"/>
+              </w:rPr>
+              <w:t>,</w:t>
+            </w:r>
+          </w:p>
+          <w:p>
+            <w:pPr>
+              <w:spacing w:after="0" w:line="240" w:lineRule="auto"/>
+              <w:rPr>
+                <w:rFonts w:ascii="Calibri" w:hAnsi="Calibri" w:cs="Calibri"/>
+                <w:color w:val="000000"/>
+                <w:sz w:val="22"/>
+              </w:rPr>
+            </w:pPr>
+            <w:proofErr w:type="spellStart"/>
+            <w:r>
+              <w:rPr>
+                <w:rFonts w:ascii="Calibri" w:hAnsi="Calibri" w:cs="Calibri"/>
+                <w:color w:val="000000"/>
+                <w:sz w:val="22"/>
+                <w:highlight w:val="yellow"/>
+              </w:rPr>
+              <w:t>regional_hub</w:t>
+            </w:r>
+            <w:proofErr w:type="spellEnd"/>
+            <w:r>
+              <w:rPr>
+                <w:rFonts w:ascii="Calibri" w:hAnsi="Calibri" w:cs="Calibri"/>
+                <w:color w:val="000000"/>
+                <w:sz w:val="22"/>
+              </w:rPr>
+              <w:t>,</w:t>
+            </w:r>
+          </w:p>
+          <w:p>
+            <w:pPr>
+              <w:spacing w:after="0" w:line="240" w:lineRule="auto"/>
+              <w:rPr>
+                <w:rFonts w:ascii="Calibri" w:hAnsi="Calibri" w:cs="Calibri"/>
+                <w:color w:val="000000"/>
+                <w:sz w:val="22"/>
+              </w:rPr>
+            </w:pPr>
+            <w:proofErr w:type="spellStart"/>
+            <w:r>
+              <w:rPr>
+                <w:rFonts w:ascii="Calibri" w:hAnsi="Calibri" w:cs="Calibri"/>
+                <w:color w:val="000000"/>
+                <w:sz w:val="22"/>
+              </w:rPr>
+              <w:t>time_zone</w:t>
+            </w:r>
+            <w:proofErr w:type="spellEnd"/>
+          </w:p>
           <w:p>
             <w:pPr>
               <w:spacing w:after="40"/>
@@ -3824,7 +4910,7 @@
         </w:tc>
         <w:tc>
           <w:tcPr>
-            <w:tcW w:w="1769" w:type="dxa"/>
+            <w:tcW w:w="1090" w:type="dxa"/>
           </w:tcPr>
           <w:p>
             <w:pPr>
@@ -3850,7 +4936,7 @@
         </w:tc>
         <w:tc>
           <w:tcPr>
-            <w:tcW w:w="1080" w:type="dxa"/>
+            <w:tcW w:w="717" w:type="dxa"/>
           </w:tcPr>
           <w:p>
             <w:pPr>
@@ -3860,7 +4946,7 @@
         </w:tc>
         <w:tc>
           <w:tcPr>
-            <w:tcW w:w="1622" w:type="dxa"/>
+            <w:tcW w:w="1985" w:type="dxa"/>
           </w:tcPr>
           <w:p>
             <w:pPr>
@@ -3873,23 +4959,20 @@
         </w:tc>
         <w:tc>
           <w:tcPr>
-            <w:tcW w:w="1622" w:type="dxa"/>
+            <w:tcW w:w="1984" w:type="dxa"/>
           </w:tcPr>
           <w:p>
             <w:pPr>
               <w:spacing w:after="40"/>
             </w:pPr>
             <w:r>
-              <w:t>Internal</w:t>
-            </w:r>
-            <w:r>
-              <w:t>-contain transaction and pricing data</w:t>
-            </w:r>
-          </w:p>
-        </w:tc>
-        <w:tc>
-          <w:tcPr>
-            <w:tcW w:w="1017" w:type="dxa"/>
+              <w:t>Public</w:t>
+            </w:r>
+          </w:p>
+        </w:tc>
+        <w:tc>
+          <w:tcPr>
+            <w:tcW w:w="655" w:type="dxa"/>
           </w:tcPr>
           <w:p>
             <w:pPr>
@@ -3914,22 +4997,104 @@
         </w:tc>
         <w:tc>
           <w:tcPr>
-            <w:tcW w:w="992" w:type="dxa"/>
+            <w:tcW w:w="1671" w:type="dxa"/>
           </w:tcPr>
           <w:p>
             <w:pPr>
               <w:spacing w:after="40"/>
             </w:pPr>
-          </w:p>
-        </w:tc>
-        <w:tc>
-          <w:tcPr>
-            <w:tcW w:w="1769" w:type="dxa"/>
-          </w:tcPr>
+            <w:proofErr w:type="spellStart"/>
+            <w:r>
+              <w:t>Target_id</w:t>
+            </w:r>
+            <w:proofErr w:type="spellEnd"/>
+            <w:r>
+              <w:t>,</w:t>
+            </w:r>
+          </w:p>
           <w:p>
             <w:pPr>
               <w:spacing w:after="40"/>
             </w:pPr>
+            <w:proofErr w:type="spellStart"/>
+            <w:r>
+              <w:rPr>
+                <w:highlight w:val="yellow"/>
+              </w:rPr>
+              <w:t>Target_month</w:t>
+            </w:r>
+            <w:proofErr w:type="spellEnd"/>
+            <w:r>
+              <w:t>,</w:t>
+            </w:r>
+          </w:p>
+          <w:p>
+            <w:pPr>
+              <w:spacing w:after="40"/>
+            </w:pPr>
+            <w:proofErr w:type="spellStart"/>
+            <w:r>
+              <w:rPr>
+                <w:highlight w:val="yellow"/>
+              </w:rPr>
+              <w:t>Region_id</w:t>
+            </w:r>
+            <w:proofErr w:type="spellEnd"/>
+            <w:r>
+              <w:t>,</w:t>
+            </w:r>
+          </w:p>
+          <w:p>
+            <w:pPr>
+              <w:spacing w:after="40"/>
+            </w:pPr>
+            <w:proofErr w:type="spellStart"/>
+            <w:r>
+              <w:rPr>
+                <w:highlight w:val="yellow"/>
+              </w:rPr>
+              <w:t>Revenue_target</w:t>
+            </w:r>
+            <w:proofErr w:type="spellEnd"/>
+            <w:r>
+              <w:t>,</w:t>
+            </w:r>
+          </w:p>
+          <w:p>
+            <w:pPr>
+              <w:spacing w:after="40"/>
+            </w:pPr>
+            <w:proofErr w:type="spellStart"/>
+            <w:r>
+              <w:rPr>
+                <w:highlight w:val="yellow"/>
+              </w:rPr>
+              <w:t>Order_target</w:t>
+            </w:r>
+            <w:proofErr w:type="spellEnd"/>
+            <w:r>
+              <w:t>,</w:t>
+            </w:r>
+          </w:p>
+          <w:p>
+            <w:pPr>
+              <w:spacing w:after="40"/>
+            </w:pPr>
+            <w:proofErr w:type="spellStart"/>
+            <w:r>
+              <w:t>Target_owner</w:t>
+            </w:r>
+            <w:proofErr w:type="spellEnd"/>
+          </w:p>
+        </w:tc>
+        <w:tc>
+          <w:tcPr>
+            <w:tcW w:w="1090" w:type="dxa"/>
+          </w:tcPr>
+          <w:p>
+            <w:pPr>
+              <w:spacing w:after="40"/>
+            </w:pPr>
             <w:r>
               <w:t>Sales Head/sales planning manager</w:t>
             </w:r>
@@ -3950,7 +5115,7 @@
         </w:tc>
         <w:tc>
           <w:tcPr>
-            <w:tcW w:w="1080" w:type="dxa"/>
+            <w:tcW w:w="717" w:type="dxa"/>
           </w:tcPr>
           <w:p>
             <w:pPr>
@@ -3960,7 +5125,7 @@
         </w:tc>
         <w:tc>
           <w:tcPr>
-            <w:tcW w:w="1622" w:type="dxa"/>
+            <w:tcW w:w="1985" w:type="dxa"/>
           </w:tcPr>
           <w:p>
             <w:pPr>
@@ -3973,7 +5138,7 @@
         </w:tc>
         <w:tc>
           <w:tcPr>
-            <w:tcW w:w="1622" w:type="dxa"/>
+            <w:tcW w:w="1984" w:type="dxa"/>
           </w:tcPr>
           <w:p>
             <w:pPr>
@@ -3986,7 +5151,7 @@
         </w:tc>
         <w:tc>
           <w:tcPr>
-            <w:tcW w:w="1017" w:type="dxa"/>
+            <w:tcW w:w="655" w:type="dxa"/>
           </w:tcPr>
           <w:p>
             <w:pPr>
@@ -4011,23 +5176,129 @@
         </w:tc>
         <w:tc>
           <w:tcPr>
-            <w:tcW w:w="992" w:type="dxa"/>
+            <w:tcW w:w="1671" w:type="dxa"/>
           </w:tcPr>
           <w:p>
             <w:pPr>
               <w:spacing w:after="40"/>
             </w:pPr>
-          </w:p>
-        </w:tc>
-        <w:tc>
-          <w:tcPr>
-            <w:tcW w:w="1769" w:type="dxa"/>
-          </w:tcPr>
+            <w:proofErr w:type="spellStart"/>
+            <w:r>
+              <w:t>Snapshot_id</w:t>
+            </w:r>
+            <w:proofErr w:type="spellEnd"/>
+            <w:r>
+              <w:t>,</w:t>
+            </w:r>
+          </w:p>
           <w:p>
             <w:pPr>
               <w:spacing w:after="40"/>
             </w:pPr>
-            <w:r>
+            <w:proofErr w:type="spellStart"/>
+            <w:r>
+              <w:t>Snapshot_data</w:t>
+            </w:r>
+            <w:proofErr w:type="spellEnd"/>
+            <w:r>
+              <w:t>,</w:t>
+            </w:r>
+          </w:p>
+          <w:p>
+            <w:pPr>
+              <w:spacing w:after="40"/>
+            </w:pPr>
+            <w:proofErr w:type="spellStart"/>
+            <w:r>
+              <w:t>Product_id</w:t>
+            </w:r>
+            <w:proofErr w:type="spellEnd"/>
+            <w:r>
+              <w:t>,</w:t>
+            </w:r>
+          </w:p>
+          <w:p>
+            <w:pPr>
+              <w:spacing w:after="40"/>
+            </w:pPr>
+            <w:proofErr w:type="spellStart"/>
+            <w:r>
+              <w:t>Warehouse_id</w:t>
+            </w:r>
+            <w:proofErr w:type="spellEnd"/>
+            <w:r>
+              <w:t>,</w:t>
+            </w:r>
+          </w:p>
+          <w:p>
+            <w:pPr>
+              <w:spacing w:after="40"/>
+            </w:pPr>
+            <w:proofErr w:type="spellStart"/>
+            <w:r>
+              <w:lastRenderedPageBreak/>
+              <w:t>Opening_stock</w:t>
+            </w:r>
+            <w:proofErr w:type="spellEnd"/>
+            <w:r>
+              <w:t>,</w:t>
+            </w:r>
+          </w:p>
+          <w:p>
+            <w:pPr>
+              <w:spacing w:after="40"/>
+            </w:pPr>
+            <w:r>
+              <w:t>Receipts,</w:t>
+            </w:r>
+          </w:p>
+          <w:p>
+            <w:pPr>
+              <w:spacing w:after="40"/>
+            </w:pPr>
+            <w:proofErr w:type="spellStart"/>
+            <w:r>
+              <w:t>Units_sold</w:t>
+            </w:r>
+            <w:proofErr w:type="spellEnd"/>
+            <w:r>
+              <w:t>,</w:t>
+            </w:r>
+          </w:p>
+          <w:p>
+            <w:pPr>
+              <w:spacing w:after="40"/>
+            </w:pPr>
+            <w:proofErr w:type="spellStart"/>
+            <w:r>
+              <w:t>Closing_stock</w:t>
+            </w:r>
+            <w:proofErr w:type="spellEnd"/>
+            <w:r>
+              <w:t>,</w:t>
+            </w:r>
+          </w:p>
+          <w:p>
+            <w:pPr>
+              <w:spacing w:after="40"/>
+            </w:pPr>
+            <w:proofErr w:type="spellStart"/>
+            <w:r>
+              <w:t>Unit_cost</w:t>
+            </w:r>
+            <w:proofErr w:type="spellEnd"/>
+          </w:p>
+        </w:tc>
+        <w:tc>
+          <w:tcPr>
+            <w:tcW w:w="1090" w:type="dxa"/>
+          </w:tcPr>
+          <w:p>
+            <w:pPr>
+              <w:spacing w:after="40"/>
+            </w:pPr>
+            <w:r>
+              <w:lastRenderedPageBreak/>
               <w:t>Inventory manager</w:t>
             </w:r>
           </w:p>
@@ -4047,7 +5318,7 @@
         </w:tc>
         <w:tc>
           <w:tcPr>
-            <w:tcW w:w="1080" w:type="dxa"/>
+            <w:tcW w:w="717" w:type="dxa"/>
           </w:tcPr>
           <w:p>
             <w:pPr>
@@ -4057,7 +5328,7 @@
         </w:tc>
         <w:tc>
           <w:tcPr>
-            <w:tcW w:w="1622" w:type="dxa"/>
+            <w:tcW w:w="1985" w:type="dxa"/>
           </w:tcPr>
           <w:p>
             <w:pPr>
@@ -4070,7 +5341,7 @@
         </w:tc>
         <w:tc>
           <w:tcPr>
-            <w:tcW w:w="1622" w:type="dxa"/>
+            <w:tcW w:w="1984" w:type="dxa"/>
           </w:tcPr>
           <w:p>
             <w:pPr>
@@ -4083,7 +5354,7 @@
         </w:tc>
         <w:tc>
           <w:tcPr>
-            <w:tcW w:w="1017" w:type="dxa"/>
+            <w:tcW w:w="655" w:type="dxa"/>
           </w:tcPr>
           <w:p>
             <w:pPr>
@@ -4108,8 +5379,201 @@
         </w:tc>
         <w:tc>
           <w:tcPr>
-            <w:tcW w:w="992" w:type="dxa"/>
-          </w:tcPr>
+            <w:tcW w:w="1671" w:type="dxa"/>
+          </w:tcPr>
+          <w:p>
+            <w:pPr>
+              <w:spacing w:after="0" w:line="240" w:lineRule="auto"/>
+              <w:rPr>
+                <w:rFonts w:ascii="Calibri" w:hAnsi="Calibri" w:cs="Calibri"/>
+                <w:color w:val="000000"/>
+                <w:sz w:val="22"/>
+              </w:rPr>
+            </w:pPr>
+            <w:proofErr w:type="spellStart"/>
+            <w:r>
+              <w:rPr>
+                <w:rFonts w:ascii="Calibri" w:hAnsi="Calibri" w:cs="Calibri"/>
+                <w:color w:val="000000"/>
+                <w:sz w:val="22"/>
+                <w:highlight w:val="yellow"/>
+              </w:rPr>
+              <w:t>return_id</w:t>
+            </w:r>
+            <w:proofErr w:type="spellEnd"/>
+            <w:r>
+              <w:rPr>
+                <w:rFonts w:ascii="Calibri" w:hAnsi="Calibri" w:cs="Calibri"/>
+                <w:color w:val="000000"/>
+                <w:sz w:val="22"/>
+              </w:rPr>
+              <w:t>,</w:t>
+            </w:r>
+          </w:p>
+          <w:p>
+            <w:pPr>
+              <w:spacing w:after="0" w:line="240" w:lineRule="auto"/>
+              <w:rPr>
+                <w:rFonts w:ascii="Calibri" w:hAnsi="Calibri" w:cs="Calibri"/>
+                <w:color w:val="000000"/>
+                <w:sz w:val="22"/>
+              </w:rPr>
+            </w:pPr>
+            <w:proofErr w:type="spellStart"/>
+            <w:r>
+              <w:rPr>
+                <w:rFonts w:ascii="Calibri" w:hAnsi="Calibri" w:cs="Calibri"/>
+                <w:color w:val="000000"/>
+                <w:sz w:val="22"/>
+              </w:rPr>
+              <w:t>order_line_id</w:t>
+            </w:r>
+            <w:proofErr w:type="spellEnd"/>
+            <w:r>
+              <w:rPr>
+                <w:rFonts w:ascii="Calibri" w:hAnsi="Calibri" w:cs="Calibri"/>
+                <w:color w:val="000000"/>
+                <w:sz w:val="22"/>
+              </w:rPr>
+              <w:t>,</w:t>
+            </w:r>
+          </w:p>
+          <w:p>
+            <w:pPr>
+              <w:spacing w:after="0" w:line="240" w:lineRule="auto"/>
+              <w:rPr>
+                <w:rFonts w:ascii="Calibri" w:hAnsi="Calibri" w:cs="Calibri"/>
+                <w:color w:val="000000"/>
+                <w:sz w:val="22"/>
+              </w:rPr>
+            </w:pPr>
+            <w:proofErr w:type="spellStart"/>
+            <w:r>
+              <w:rPr>
+                <w:rFonts w:ascii="Calibri" w:hAnsi="Calibri" w:cs="Calibri"/>
+                <w:color w:val="000000"/>
+                <w:sz w:val="22"/>
+                <w:highlight w:val="yellow"/>
+              </w:rPr>
+              <w:t>return_date</w:t>
+            </w:r>
+            <w:proofErr w:type="spellEnd"/>
+            <w:r>
+              <w:rPr>
+                <w:rFonts w:ascii="Calibri" w:hAnsi="Calibri" w:cs="Calibri"/>
+                <w:color w:val="000000"/>
+                <w:sz w:val="22"/>
+              </w:rPr>
+              <w:t>,</w:t>
+            </w:r>
+          </w:p>
+          <w:p>
+            <w:pPr>
+              <w:spacing w:after="0" w:line="240" w:lineRule="auto"/>
+              <w:rPr>
+                <w:rFonts w:ascii="Calibri" w:hAnsi="Calibri" w:cs="Calibri"/>
+                <w:color w:val="000000"/>
+                <w:sz w:val="22"/>
+              </w:rPr>
+            </w:pPr>
+            <w:proofErr w:type="spellStart"/>
+            <w:r>
+              <w:rPr>
+                <w:rFonts w:ascii="Calibri" w:hAnsi="Calibri" w:cs="Calibri"/>
+                <w:color w:val="000000"/>
+                <w:sz w:val="22"/>
+                <w:highlight w:val="yellow"/>
+              </w:rPr>
+              <w:t>return_quantity</w:t>
+            </w:r>
+            <w:proofErr w:type="spellEnd"/>
+            <w:r>
+              <w:rPr>
+                <w:rFonts w:ascii="Calibri" w:hAnsi="Calibri" w:cs="Calibri"/>
+                <w:color w:val="000000"/>
+                <w:sz w:val="22"/>
+              </w:rPr>
+              <w:t>,</w:t>
+            </w:r>
+          </w:p>
+          <w:p>
+            <w:pPr>
+              <w:spacing w:after="0" w:line="240" w:lineRule="auto"/>
+              <w:rPr>
+                <w:rFonts w:ascii="Calibri" w:hAnsi="Calibri" w:cs="Calibri"/>
+                <w:color w:val="000000"/>
+                <w:sz w:val="22"/>
+              </w:rPr>
+            </w:pPr>
+            <w:proofErr w:type="spellStart"/>
+            <w:r>
+              <w:rPr>
+                <w:rFonts w:ascii="Calibri" w:hAnsi="Calibri" w:cs="Calibri"/>
+                <w:color w:val="000000"/>
+                <w:sz w:val="22"/>
+              </w:rPr>
+              <w:t>return_reason</w:t>
+            </w:r>
+            <w:proofErr w:type="spellEnd"/>
+            <w:r>
+              <w:rPr>
+                <w:rFonts w:ascii="Calibri" w:hAnsi="Calibri" w:cs="Calibri"/>
+                <w:color w:val="000000"/>
+                <w:sz w:val="22"/>
+              </w:rPr>
+              <w:t>,</w:t>
+            </w:r>
+          </w:p>
+          <w:p>
+            <w:pPr>
+              <w:spacing w:after="0" w:line="240" w:lineRule="auto"/>
+              <w:rPr>
+                <w:rFonts w:ascii="Calibri" w:hAnsi="Calibri" w:cs="Calibri"/>
+                <w:color w:val="000000"/>
+                <w:sz w:val="22"/>
+              </w:rPr>
+            </w:pPr>
+            <w:proofErr w:type="spellStart"/>
+            <w:r>
+              <w:rPr>
+                <w:rFonts w:ascii="Calibri" w:hAnsi="Calibri" w:cs="Calibri"/>
+                <w:color w:val="000000"/>
+                <w:sz w:val="22"/>
+                <w:highlight w:val="yellow"/>
+              </w:rPr>
+              <w:t>refund_amount</w:t>
+            </w:r>
+            <w:proofErr w:type="spellEnd"/>
+            <w:r>
+              <w:rPr>
+                <w:rFonts w:ascii="Calibri" w:hAnsi="Calibri" w:cs="Calibri"/>
+                <w:color w:val="000000"/>
+                <w:sz w:val="22"/>
+              </w:rPr>
+              <w:t>,</w:t>
+            </w:r>
+          </w:p>
+          <w:p>
+            <w:pPr>
+              <w:spacing w:after="0" w:line="240" w:lineRule="auto"/>
+              <w:rPr>
+                <w:rFonts w:ascii="Calibri" w:hAnsi="Calibri" w:cs="Calibri"/>
+                <w:color w:val="000000"/>
+                <w:sz w:val="22"/>
+              </w:rPr>
+            </w:pPr>
+            <w:proofErr w:type="spellStart"/>
+            <w:r>
+              <w:rPr>
+                <w:rFonts w:ascii="Calibri" w:hAnsi="Calibri" w:cs="Calibri"/>
+                <w:color w:val="000000"/>
+                <w:sz w:val="22"/>
+                <w:highlight w:val="yellow"/>
+              </w:rPr>
+              <w:t>return_status</w:t>
+            </w:r>
+            <w:proofErr w:type="spellEnd"/>
+          </w:p>
           <w:p>
             <w:pPr>
               <w:spacing w:after="40"/>
@@ -4118,14 +5582,22 @@
         </w:tc>
         <w:tc>
           <w:tcPr>
-            <w:tcW w:w="1769" w:type="dxa"/>
+            <w:tcW w:w="1090" w:type="dxa"/>
           </w:tcPr>
           <w:p>
             <w:pPr>
               <w:spacing w:after="40"/>
             </w:pPr>
             <w:r>
-              <w:t>Customer servive/return operation manager</w:t>
+              <w:t xml:space="preserve">Customer </w:t>
+            </w:r>
+            <w:proofErr w:type="spellStart"/>
+            <w:r>
+              <w:t>servive</w:t>
+            </w:r>
+            <w:proofErr w:type="spellEnd"/>
+            <w:r>
+              <w:t>/return operation manager</w:t>
             </w:r>
           </w:p>
         </w:tc>
@@ -4144,7 +5616,7 @@
         </w:tc>
         <w:tc>
           <w:tcPr>
-            <w:tcW w:w="1080" w:type="dxa"/>
+            <w:tcW w:w="717" w:type="dxa"/>
           </w:tcPr>
           <w:p>
             <w:pPr>
@@ -4154,7 +5626,7 @@
         </w:tc>
         <w:tc>
           <w:tcPr>
-            <w:tcW w:w="1622" w:type="dxa"/>
+            <w:tcW w:w="1985" w:type="dxa"/>
           </w:tcPr>
           <w:p>
             <w:pPr>
@@ -4167,7 +5639,7 @@
         </w:tc>
         <w:tc>
           <w:tcPr>
-            <w:tcW w:w="1622" w:type="dxa"/>
+            <w:tcW w:w="1984" w:type="dxa"/>
           </w:tcPr>
           <w:p>
             <w:pPr>
@@ -4180,7 +5652,7 @@
         </w:tc>
         <w:tc>
           <w:tcPr>
-            <w:tcW w:w="1017" w:type="dxa"/>
+            <w:tcW w:w="655" w:type="dxa"/>
           </w:tcPr>
           <w:p>
             <w:pPr>
@@ -4205,8 +5677,112 @@
         </w:tc>
         <w:tc>
           <w:tcPr>
-            <w:tcW w:w="992" w:type="dxa"/>
-          </w:tcPr>
+            <w:tcW w:w="1671" w:type="dxa"/>
+          </w:tcPr>
+          <w:p>
+            <w:pPr>
+              <w:spacing w:after="0" w:line="240" w:lineRule="auto"/>
+              <w:rPr>
+                <w:rFonts w:ascii="Calibri" w:hAnsi="Calibri" w:cs="Calibri"/>
+                <w:color w:val="000000"/>
+                <w:sz w:val="22"/>
+              </w:rPr>
+            </w:pPr>
+            <w:proofErr w:type="spellStart"/>
+            <w:r>
+              <w:rPr>
+                <w:rFonts w:ascii="Calibri" w:hAnsi="Calibri" w:cs="Calibri"/>
+                <w:color w:val="000000"/>
+                <w:sz w:val="22"/>
+              </w:rPr>
+              <w:t>channel_id</w:t>
+            </w:r>
+            <w:proofErr w:type="spellEnd"/>
+            <w:r>
+              <w:rPr>
+                <w:rFonts w:ascii="Calibri" w:hAnsi="Calibri" w:cs="Calibri"/>
+                <w:color w:val="000000"/>
+                <w:sz w:val="22"/>
+              </w:rPr>
+              <w:t>,</w:t>
+            </w:r>
+          </w:p>
+          <w:p>
+            <w:pPr>
+              <w:spacing w:after="0" w:line="240" w:lineRule="auto"/>
+              <w:rPr>
+                <w:rFonts w:ascii="Calibri" w:hAnsi="Calibri" w:cs="Calibri"/>
+                <w:color w:val="000000"/>
+                <w:sz w:val="22"/>
+              </w:rPr>
+            </w:pPr>
+            <w:proofErr w:type="spellStart"/>
+            <w:r>
+              <w:rPr>
+                <w:rFonts w:ascii="Calibri" w:hAnsi="Calibri" w:cs="Calibri"/>
+                <w:color w:val="000000"/>
+                <w:sz w:val="22"/>
+              </w:rPr>
+              <w:t>channel_name</w:t>
+            </w:r>
+            <w:proofErr w:type="spellEnd"/>
+            <w:r>
+              <w:rPr>
+                <w:rFonts w:ascii="Calibri" w:hAnsi="Calibri" w:cs="Calibri"/>
+                <w:color w:val="000000"/>
+                <w:sz w:val="22"/>
+              </w:rPr>
+              <w:t>,</w:t>
+            </w:r>
+          </w:p>
+          <w:p>
+            <w:pPr>
+              <w:spacing w:after="0" w:line="240" w:lineRule="auto"/>
+              <w:rPr>
+                <w:rFonts w:ascii="Calibri" w:hAnsi="Calibri" w:cs="Calibri"/>
+                <w:color w:val="000000"/>
+                <w:sz w:val="22"/>
+              </w:rPr>
+            </w:pPr>
+            <w:proofErr w:type="spellStart"/>
+            <w:r>
+              <w:rPr>
+                <w:rFonts w:ascii="Calibri" w:hAnsi="Calibri" w:cs="Calibri"/>
+                <w:color w:val="000000"/>
+                <w:sz w:val="22"/>
+              </w:rPr>
+              <w:t>channel_group</w:t>
+            </w:r>
+            <w:proofErr w:type="spellEnd"/>
+            <w:r>
+              <w:rPr>
+                <w:rFonts w:ascii="Calibri" w:hAnsi="Calibri" w:cs="Calibri"/>
+                <w:color w:val="000000"/>
+                <w:sz w:val="22"/>
+              </w:rPr>
+              <w:t>,</w:t>
+            </w:r>
+          </w:p>
+          <w:p>
+            <w:pPr>
+              <w:spacing w:after="0" w:line="240" w:lineRule="auto"/>
+              <w:rPr>
+                <w:rFonts w:ascii="Calibri" w:hAnsi="Calibri" w:cs="Calibri"/>
+                <w:color w:val="000000"/>
+                <w:sz w:val="22"/>
+              </w:rPr>
+            </w:pPr>
+            <w:proofErr w:type="spellStart"/>
+            <w:r>
+              <w:rPr>
+                <w:rFonts w:ascii="Calibri" w:hAnsi="Calibri" w:cs="Calibri"/>
+                <w:color w:val="000000"/>
+                <w:sz w:val="22"/>
+              </w:rPr>
+              <w:t>commission_rate</w:t>
+            </w:r>
+            <w:proofErr w:type="spellEnd"/>
+          </w:p>
           <w:p>
             <w:pPr>
               <w:spacing w:after="40"/>
@@ -4215,7 +5791,7 @@
         </w:tc>
         <w:tc>
           <w:tcPr>
-            <w:tcW w:w="1769" w:type="dxa"/>
+            <w:tcW w:w="1090" w:type="dxa"/>
           </w:tcPr>
           <w:p>
             <w:pPr>
@@ -4241,7 +5817,7 @@
         </w:tc>
         <w:tc>
           <w:tcPr>
-            <w:tcW w:w="1080" w:type="dxa"/>
+            <w:tcW w:w="717" w:type="dxa"/>
           </w:tcPr>
           <w:p>
             <w:pPr>
@@ -4251,7 +5827,7 @@
         </w:tc>
         <w:tc>
           <w:tcPr>
-            <w:tcW w:w="1622" w:type="dxa"/>
+            <w:tcW w:w="1985" w:type="dxa"/>
           </w:tcPr>
           <w:p>
             <w:pPr>
@@ -4264,7 +5840,7 @@
         </w:tc>
         <w:tc>
           <w:tcPr>
-            <w:tcW w:w="1622" w:type="dxa"/>
+            <w:tcW w:w="1984" w:type="dxa"/>
           </w:tcPr>
           <w:p>
             <w:pPr>
@@ -4277,7 +5853,7 @@
         </w:tc>
         <w:tc>
           <w:tcPr>
-            <w:tcW w:w="1017" w:type="dxa"/>
+            <w:tcW w:w="655" w:type="dxa"/>
           </w:tcPr>
           <w:p>
             <w:pPr>
@@ -4303,23 +5879,114 @@
         </w:tc>
         <w:tc>
           <w:tcPr>
-            <w:tcW w:w="992" w:type="dxa"/>
+            <w:tcW w:w="1671" w:type="dxa"/>
           </w:tcPr>
           <w:p>
             <w:pPr>
               <w:spacing w:after="40"/>
             </w:pPr>
-          </w:p>
-        </w:tc>
-        <w:tc>
-          <w:tcPr>
-            <w:tcW w:w="1769" w:type="dxa"/>
-          </w:tcPr>
+            <w:proofErr w:type="spellStart"/>
+            <w:r>
+              <w:t>Order_id</w:t>
+            </w:r>
+            <w:proofErr w:type="spellEnd"/>
+            <w:r>
+              <w:t>,</w:t>
+            </w:r>
+          </w:p>
           <w:p>
             <w:pPr>
               <w:spacing w:after="40"/>
             </w:pPr>
             <w:r>
+              <w:t>Courier,</w:t>
+            </w:r>
+          </w:p>
+          <w:p>
+            <w:pPr>
+              <w:spacing w:after="40"/>
+            </w:pPr>
+            <w:proofErr w:type="spellStart"/>
+            <w:r>
+              <w:t>Service_level</w:t>
+            </w:r>
+            <w:proofErr w:type="spellEnd"/>
+            <w:r>
+              <w:t>,</w:t>
+            </w:r>
+          </w:p>
+          <w:p>
+            <w:pPr>
+              <w:spacing w:after="40"/>
+            </w:pPr>
+            <w:proofErr w:type="spellStart"/>
+            <w:r>
+              <w:t>Shipped_at</w:t>
+            </w:r>
+            <w:proofErr w:type="spellEnd"/>
+            <w:r>
+              <w:t>,</w:t>
+            </w:r>
+          </w:p>
+          <w:p>
+            <w:pPr>
+              <w:spacing w:after="40"/>
+            </w:pPr>
+            <w:proofErr w:type="spellStart"/>
+            <w:r>
+              <w:t>Delivered_at</w:t>
+            </w:r>
+            <w:proofErr w:type="spellEnd"/>
+            <w:r>
+              <w:t>,</w:t>
+            </w:r>
+          </w:p>
+          <w:p>
+            <w:pPr>
+              <w:spacing w:after="40"/>
+            </w:pPr>
+            <w:proofErr w:type="spellStart"/>
+            <w:r>
+              <w:t>Delivery_status</w:t>
+            </w:r>
+            <w:proofErr w:type="spellEnd"/>
+            <w:r>
+              <w:t>,</w:t>
+            </w:r>
+          </w:p>
+          <w:p>
+            <w:pPr>
+              <w:spacing w:after="40"/>
+            </w:pPr>
+            <w:proofErr w:type="spellStart"/>
+            <w:r>
+              <w:t>Shipping_cost</w:t>
+            </w:r>
+            <w:proofErr w:type="spellEnd"/>
+            <w:r>
+              <w:t>,</w:t>
+            </w:r>
+          </w:p>
+          <w:p>
+            <w:pPr>
+              <w:spacing w:after="40"/>
+            </w:pPr>
+            <w:proofErr w:type="spellStart"/>
+            <w:r>
+              <w:t>Tracking_event_count</w:t>
+            </w:r>
+            <w:proofErr w:type="spellEnd"/>
+          </w:p>
+        </w:tc>
+        <w:tc>
+          <w:tcPr>
+            <w:tcW w:w="1090" w:type="dxa"/>
+          </w:tcPr>
+          <w:p>
+            <w:pPr>
+              <w:spacing w:after="40"/>
+            </w:pPr>
+            <w:r>
               <w:t>Logistics manager</w:t>
             </w:r>
           </w:p>
@@ -4339,7 +6006,7 @@
         </w:tc>
         <w:tc>
           <w:tcPr>
-            <w:tcW w:w="1080" w:type="dxa"/>
+            <w:tcW w:w="717" w:type="dxa"/>
           </w:tcPr>
           <w:p>
             <w:pPr>
@@ -4349,7 +6016,7 @@
         </w:tc>
         <w:tc>
           <w:tcPr>
-            <w:tcW w:w="1622" w:type="dxa"/>
+            <w:tcW w:w="1985" w:type="dxa"/>
           </w:tcPr>
           <w:p>
             <w:pPr>
@@ -4362,7 +6029,7 @@
         </w:tc>
         <w:tc>
           <w:tcPr>
-            <w:tcW w:w="1622" w:type="dxa"/>
+            <w:tcW w:w="1984" w:type="dxa"/>
           </w:tcPr>
           <w:p>
             <w:pPr>
@@ -4375,7 +6042,7 @@
         </w:tc>
         <w:tc>
           <w:tcPr>
-            <w:tcW w:w="1017" w:type="dxa"/>
+            <w:tcW w:w="655" w:type="dxa"/>
           </w:tcPr>
           <w:p>
             <w:pPr>
@@ -4394,6 +6061,66 @@
           <w:iCs/>
         </w:rPr>
       </w:pPr>
+      <w:proofErr w:type="spellStart"/>
+      <w:r>
+        <w:rPr>
+          <w:i/>
+          <w:iCs/>
+        </w:rPr>
+        <w:t>Tracking_event_count</w:t>
+      </w:r>
+      <w:proofErr w:type="spellEnd"/>
+    </w:p>
+    <w:p>
+      <w:pPr>
+        <w:spacing w:after="40"/>
+        <w:ind w:hanging="29"/>
+        <w:rPr>
+          <w:i/>
+          <w:iCs/>
+        </w:rPr>
+      </w:pPr>
+      <w:r>
+        <w:rPr>
+          <w:i/>
+          <w:iCs/>
+        </w:rPr>
+        <w:drawing>
+          <wp:inline distT="0" distB="0" distL="0" distR="0" wp14:anchorId="363CC6B3" wp14:editId="65FEF51C">
+            <wp:extent cx="1682848" cy="1767840"/>
+            <wp:effectExtent l="0" t="0" r="0" b="3810"/>
+            <wp:docPr id="718313197" name="Picture 1"/>
+            <wp:cNvGraphicFramePr>
+              <a:graphicFrameLocks xmlns:a="http://schemas.openxmlformats.org/drawingml/2006/main" noChangeAspect="1"/>
+            </wp:cNvGraphicFramePr>
+            <a:graphic xmlns:a="http://schemas.openxmlformats.org/drawingml/2006/main">
+              <a:graphicData uri="http://schemas.openxmlformats.org/drawingml/2006/picture">
+                <pic:pic xmlns:pic="http://schemas.openxmlformats.org/drawingml/2006/picture">
+                  <pic:nvPicPr>
+                    <pic:cNvPr id="718313197" name=""/>
+                    <pic:cNvPicPr/>
+                  </pic:nvPicPr>
+                  <pic:blipFill>
+                    <a:blip r:embed="rId10"/>
+                    <a:stretch>
+                      <a:fillRect/>
+                    </a:stretch>
+                  </pic:blipFill>
+                  <pic:spPr>
+                    <a:xfrm>
+                      <a:off x="0" y="0"/>
+                      <a:ext cx="1686583" cy="1771764"/>
+                    </a:xfrm>
+                    <a:prstGeom prst="rect">
+                      <a:avLst/>
+                    </a:prstGeom>
+                  </pic:spPr>
+                </pic:pic>
+              </a:graphicData>
+            </a:graphic>
+          </wp:inline>
+        </w:drawing>
+      </w:r>
     </w:p>
     <w:p>
       <w:pPr>
@@ -12969,8 +14696,8 @@
       </w:pPr>
     </w:p>
     <w:sectPr>
-      <w:headerReference w:type="default" r:id="rId10"/>
-      <w:footerReference w:type="default" r:id="rId11"/>
+      <w:headerReference w:type="default" r:id="rId11"/>
+      <w:footerReference w:type="default" r:id="rId12"/>
       <w:pgSz w:w="12240" w:h="15840"/>
       <w:pgMar w:top="1008" w:right="1037" w:bottom="936" w:left="1037" w:header="432" w:footer="432" w:gutter="0"/>
       <w:cols w:space="720"/>
@@ -14202,7 +15929,6 @@
   <w:style w:type="character" w:default="1" w:styleId="DefaultParagraphFont">
     <w:name w:val="Default Paragraph Font"/>
     <w:uiPriority w:val="1"/>
-    <w:semiHidden/>
     <w:unhideWhenUsed/>
   </w:style>
   <w:style w:type="table" w:default="1" w:styleId="TableNormal">

</xml_diff>

<commit_message>
connection setup : data connection setup prep
</commit_message>
<xml_diff>
--- a/Skymart/Power_BI_Portfolio_Project_Worksheet.docx
+++ b/Skymart/Power_BI_Portfolio_Project_Worksheet.docx
@@ -20432,6 +20432,190 @@
               <w:t>;</w:t>
             </w:r>
           </w:p>
+          <w:p>
+            <w:pPr>
+              <w:pStyle w:val="SmallMuted"/>
+              <w:spacing w:after="40" w:line="276" w:lineRule="auto"/>
+              <w:ind w:firstLine="132"/>
+              <w:rPr>
+                <w:b/>
+                <w:bCs/>
+                <w:lang w:val="en-ID"/>
+              </w:rPr>
+            </w:pPr>
+          </w:p>
+          <w:p>
+            <w:pPr>
+              <w:pStyle w:val="SmallMuted"/>
+              <w:spacing w:after="40" w:line="276" w:lineRule="auto"/>
+              <w:ind w:firstLine="132"/>
+              <w:rPr>
+                <w:b/>
+                <w:bCs/>
+                <w:lang w:val="en-ID"/>
+              </w:rPr>
+            </w:pPr>
+            <w:r>
+              <w:rPr>
+                <w:b/>
+                <w:bCs/>
+                <w:lang w:val="en-ID"/>
+              </w:rPr>
+              <w:t>NOTES:</w:t>
+            </w:r>
+          </w:p>
+          <w:p>
+            <w:pPr>
+              <w:pStyle w:val="SmallMuted"/>
+              <w:spacing w:after="40" w:line="276" w:lineRule="auto"/>
+              <w:rPr>
+                <w:b/>
+                <w:bCs/>
+                <w:lang w:val="en-ID"/>
+              </w:rPr>
+            </w:pPr>
+            <w:proofErr w:type="spellStart"/>
+            <w:r>
+              <w:rPr>
+                <w:b/>
+                <w:bCs/>
+                <w:lang w:val="en-ID"/>
+              </w:rPr>
+              <w:t>SkyMart</w:t>
+            </w:r>
+            <w:proofErr w:type="spellEnd"/>
+            <w:r>
+              <w:rPr>
+                <w:b/>
+                <w:bCs/>
+                <w:lang w:val="en-ID"/>
+              </w:rPr>
+              <w:t>=# \copy regions FROM 'C:\LIFE_REPOSITORY\05_job\Power BI\</w:t>
+            </w:r>
+            <w:proofErr w:type="spellStart"/>
+            <w:r>
+              <w:rPr>
+                <w:b/>
+                <w:bCs/>
+                <w:lang w:val="en-ID"/>
+              </w:rPr>
+              <w:t>SkyMart</w:t>
+            </w:r>
+            <w:proofErr w:type="spellEnd"/>
+          </w:p>
+          <w:p>
+            <w:pPr>
+              <w:pStyle w:val="SmallMuted"/>
+              <w:spacing w:after="40" w:line="276" w:lineRule="auto"/>
+              <w:rPr>
+                <w:b/>
+                <w:bCs/>
+                <w:lang w:val="en-ID"/>
+              </w:rPr>
+            </w:pPr>
+            <w:r>
+              <w:rPr>
+                <w:b/>
+                <w:bCs/>
+                <w:lang w:val="en-ID"/>
+              </w:rPr>
+              <w:t>_Raw_Dataset_v1\skymart_raw_v1\raw\regions.csv' DELIMITER ',' CSV HEADER</w:t>
+            </w:r>
+          </w:p>
+          <w:p>
+            <w:pPr>
+              <w:pStyle w:val="SmallMuted"/>
+              <w:spacing w:after="40" w:line="276" w:lineRule="auto"/>
+              <w:rPr>
+                <w:b/>
+                <w:bCs/>
+                <w:lang w:val="en-ID"/>
+              </w:rPr>
+            </w:pPr>
+            <w:r>
+              <w:rPr>
+                <w:b/>
+                <w:bCs/>
+                <w:lang w:val="en-ID"/>
+              </w:rPr>
+              <w:t>;</w:t>
+            </w:r>
+          </w:p>
+          <w:p>
+            <w:pPr>
+              <w:pStyle w:val="SmallMuted"/>
+              <w:spacing w:after="40" w:line="276" w:lineRule="auto"/>
+              <w:rPr>
+                <w:b/>
+                <w:bCs/>
+                <w:lang w:val="en-ID"/>
+              </w:rPr>
+            </w:pPr>
+            <w:r>
+              <w:rPr>
+                <w:b/>
+                <w:bCs/>
+                <w:lang w:val="en-ID"/>
+              </w:rPr>
+              <w:t>COPY 18</w:t>
+            </w:r>
+          </w:p>
+          <w:p>
+            <w:pPr>
+              <w:pStyle w:val="SmallMuted"/>
+              <w:spacing w:after="40" w:line="276" w:lineRule="auto"/>
+              <w:rPr>
+                <w:b/>
+                <w:bCs/>
+                <w:lang w:val="en-ID"/>
+              </w:rPr>
+            </w:pPr>
+            <w:proofErr w:type="spellStart"/>
+            <w:r>
+              <w:rPr>
+                <w:b/>
+                <w:bCs/>
+                <w:lang w:val="en-ID"/>
+              </w:rPr>
+              <w:t>SkyMart</w:t>
+            </w:r>
+            <w:proofErr w:type="spellEnd"/>
+            <w:r>
+              <w:rPr>
+                <w:b/>
+                <w:bCs/>
+                <w:lang w:val="en-ID"/>
+              </w:rPr>
+              <w:t>=#</w:t>
+            </w:r>
+            <w:r>
+              <w:rPr>
+                <w:b/>
+                <w:bCs/>
+                <w:lang w:val="en-ID"/>
+              </w:rPr>
+              <w:br/>
+            </w:r>
+          </w:p>
+          <w:p>
+            <w:pPr>
+              <w:pStyle w:val="SmallMuted"/>
+              <w:spacing w:after="40" w:line="276" w:lineRule="auto"/>
+              <w:rPr>
+                <w:b/>
+                <w:bCs/>
+                <w:lang w:val="en-ID"/>
+              </w:rPr>
+            </w:pPr>
+            <w:r>
+              <w:rPr>
+                <w:b/>
+                <w:bCs/>
+                <w:lang w:val="en-ID"/>
+              </w:rPr>
+              <w:t>ENSURE / become \ in PSQL Command Line</w:t>
+            </w:r>
+          </w:p>
         </w:tc>
       </w:tr>
       <w:tr>
@@ -20489,57 +20673,2430 @@
                 <w:lang w:val="en-ID"/>
               </w:rPr>
             </w:pPr>
+          </w:p>
+        </w:tc>
+      </w:tr>
+    </w:tbl>
+    <w:p/>
+    <w:p>
+      <w:r>
+        <w:t>Connect to SQL using the least-privilege account; prefer views or query folding when appropriate in power BI</w:t>
+      </w:r>
+    </w:p>
+    <w:p>
+      <w:pPr>
+        <w:pStyle w:val="ListParagraph"/>
+        <w:numPr>
+          <w:ilvl w:val="0"/>
+          <w:numId w:val="14"/>
+        </w:numPr>
+      </w:pPr>
+      <w:r>
+        <w:t xml:space="preserve">Power BI connect with a dedicated read-only database account-not PostgreSQL administrator account- </w:t>
+      </w:r>
+      <w:proofErr w:type="spellStart"/>
+      <w:r>
+        <w:t>tand</w:t>
+      </w:r>
+      <w:proofErr w:type="spellEnd"/>
+      <w:r>
+        <w:t xml:space="preserve"> transformations should be performed efficiently through database views and query </w:t>
+      </w:r>
+      <w:r>
+        <w:t>f</w:t>
+      </w:r>
+      <w:r>
+        <w:t>olding</w:t>
+      </w:r>
+    </w:p>
+    <w:p>
+      <w:r>
+        <w:t xml:space="preserve">Architecture </w:t>
+      </w:r>
+    </w:p>
+    <w:p>
+      <w:r>
+        <w:t>Raw tables in SQL</w:t>
+      </w:r>
+    </w:p>
+    <w:tbl>
+      <w:tblPr>
+        <w:tblStyle w:val="TableGrid"/>
+        <w:tblW w:w="0" w:type="auto"/>
+        <w:tblLook w:val="04A0" w:firstRow="1" w:lastRow="0" w:firstColumn="1" w:lastColumn="0" w:noHBand="0" w:noVBand="1"/>
+      </w:tblPr>
+      <w:tblGrid>
+        <w:gridCol w:w="3385"/>
+        <w:gridCol w:w="3385"/>
+        <w:gridCol w:w="3386"/>
+      </w:tblGrid>
+      <w:tr>
+        <w:tc>
+          <w:tcPr>
+            <w:tcW w:w="3385" w:type="dxa"/>
+          </w:tcPr>
+          <w:p>
+            <w:pPr>
+              <w:rPr>
+                <w:b/>
+                <w:bCs/>
+              </w:rPr>
+            </w:pPr>
+            <w:r>
+              <w:rPr>
+                <w:b/>
+                <w:bCs/>
+              </w:rPr>
+              <w:t>RAW TABLES</w:t>
+            </w:r>
+          </w:p>
+          <w:p>
+            <w:proofErr w:type="spellStart"/>
+            <w:r>
+              <w:t>Skymart.order_items</w:t>
+            </w:r>
+            <w:proofErr w:type="spellEnd"/>
+          </w:p>
+          <w:p>
+            <w:proofErr w:type="spellStart"/>
+            <w:r>
+              <w:t>Skymart.customers</w:t>
+            </w:r>
+            <w:proofErr w:type="spellEnd"/>
+          </w:p>
+          <w:p>
+            <w:proofErr w:type="spellStart"/>
+            <w:r>
+              <w:t>Skymart.products</w:t>
+            </w:r>
+            <w:proofErr w:type="spellEnd"/>
+          </w:p>
+          <w:p>
+            <w:proofErr w:type="spellStart"/>
+            <w:r>
+              <w:t>Skymart.regions</w:t>
+            </w:r>
+            <w:proofErr w:type="spellEnd"/>
+          </w:p>
+          <w:p>
+            <w:proofErr w:type="spellStart"/>
+            <w:r>
+              <w:lastRenderedPageBreak/>
+              <w:t>Skymart.orders</w:t>
+            </w:r>
+            <w:proofErr w:type="spellEnd"/>
+          </w:p>
+        </w:tc>
+        <w:tc>
+          <w:tcPr>
+            <w:tcW w:w="3385" w:type="dxa"/>
+          </w:tcPr>
+          <w:p>
+            <w:pPr>
+              <w:rPr>
+                <w:b/>
+                <w:bCs/>
+              </w:rPr>
+            </w:pPr>
+            <w:r>
+              <w:rPr>
+                <w:b/>
+                <w:bCs/>
+              </w:rPr>
+              <w:lastRenderedPageBreak/>
+              <w:t>Reporting Views</w:t>
+            </w:r>
+          </w:p>
+          <w:p>
+            <w:proofErr w:type="spellStart"/>
+            <w:r>
+              <w:t>Reporting.vw</w:t>
+            </w:r>
+            <w:proofErr w:type="spellEnd"/>
+            <w:r>
+              <w:t>_</w:t>
+            </w:r>
+          </w:p>
+        </w:tc>
+        <w:tc>
+          <w:tcPr>
+            <w:tcW w:w="3386" w:type="dxa"/>
+          </w:tcPr>
+          <w:p>
+            <w:pPr>
+              <w:rPr>
+                <w:b/>
+                <w:bCs/>
+              </w:rPr>
+            </w:pPr>
+            <w:r>
+              <w:rPr>
+                <w:b/>
+                <w:bCs/>
+              </w:rPr>
+              <w:t>RAW TABLES</w:t>
+            </w:r>
+          </w:p>
+          <w:p>
+            <w:proofErr w:type="spellStart"/>
+            <w:r>
+              <w:t>Skymart.order_items</w:t>
+            </w:r>
+            <w:proofErr w:type="spellEnd"/>
+          </w:p>
+          <w:p>
+            <w:proofErr w:type="spellStart"/>
+            <w:r>
+              <w:t>Skymart.customers</w:t>
+            </w:r>
+            <w:proofErr w:type="spellEnd"/>
+          </w:p>
+          <w:p>
+            <w:proofErr w:type="spellStart"/>
+            <w:r>
+              <w:t>Skymart.products</w:t>
+            </w:r>
+            <w:proofErr w:type="spellEnd"/>
+          </w:p>
+          <w:p>
+            <w:proofErr w:type="spellStart"/>
+            <w:r>
+              <w:t>Skymart.regions</w:t>
+            </w:r>
+            <w:proofErr w:type="spellEnd"/>
+          </w:p>
+          <w:p>
+            <w:pPr>
+              <w:pStyle w:val="Title"/>
+              <w:pBdr>
+                <w:bottom w:val="none" w:sz="0" w:space="0" w:color="auto"/>
+              </w:pBdr>
+              <w:rPr>
+                <w:rFonts w:ascii="Aptos" w:eastAsiaTheme="minorEastAsia" w:hAnsi="Aptos" w:cstheme="minorBidi"/>
+                <w:b w:val="0"/>
+                <w:color w:val="222222"/>
+                <w:spacing w:val="0"/>
+                <w:kern w:val="0"/>
+                <w:sz w:val="19"/>
+                <w:szCs w:val="22"/>
+              </w:rPr>
+            </w:pPr>
+            <w:proofErr w:type="spellStart"/>
+            <w:r>
+              <w:rPr>
+                <w:rFonts w:ascii="Aptos" w:eastAsiaTheme="minorEastAsia" w:hAnsi="Aptos" w:cstheme="minorBidi"/>
+                <w:b w:val="0"/>
+                <w:color w:val="222222"/>
+                <w:spacing w:val="0"/>
+                <w:kern w:val="0"/>
+                <w:sz w:val="19"/>
+                <w:szCs w:val="22"/>
+              </w:rPr>
+              <w:lastRenderedPageBreak/>
+              <w:t>Skymart.orders</w:t>
+            </w:r>
+            <w:proofErr w:type="spellEnd"/>
           </w:p>
         </w:tc>
       </w:tr>
     </w:tbl>
     <w:p>
       <w:pPr>
-        <w:pStyle w:val="SmallMuted"/>
-        <w:spacing w:after="40"/>
-      </w:pPr>
-      <w:r>
-        <w:t>________________________________________________________________________________</w:t>
-      </w:r>
+        <w:pStyle w:val="Title"/>
+        <w:jc w:val="center"/>
+      </w:pPr>
     </w:p>
     <w:p>
       <w:pPr>
-        <w:pStyle w:val="SmallMuted"/>
-        <w:spacing w:after="40"/>
-      </w:pPr>
-      <w:r>
-        <w:t>________________________________________________________________________________</w:t>
+        <w:pStyle w:val="Title"/>
+        <w:jc w:val="center"/>
+      </w:pPr>
+      <w:r>
+        <w:drawing>
+          <wp:inline distT="0" distB="0" distL="0" distR="0" wp14:anchorId="7E3AE96B" wp14:editId="43930098">
+            <wp:extent cx="4411980" cy="3068437"/>
+            <wp:effectExtent l="0" t="0" r="7620" b="0"/>
+            <wp:docPr id="615980032" name="Picture 1"/>
+            <wp:cNvGraphicFramePr>
+              <a:graphicFrameLocks xmlns:a="http://schemas.openxmlformats.org/drawingml/2006/main" noChangeAspect="1"/>
+            </wp:cNvGraphicFramePr>
+            <a:graphic xmlns:a="http://schemas.openxmlformats.org/drawingml/2006/main">
+              <a:graphicData uri="http://schemas.openxmlformats.org/drawingml/2006/picture">
+                <pic:pic xmlns:pic="http://schemas.openxmlformats.org/drawingml/2006/picture">
+                  <pic:nvPicPr>
+                    <pic:cNvPr id="615980032" name=""/>
+                    <pic:cNvPicPr/>
+                  </pic:nvPicPr>
+                  <pic:blipFill>
+                    <a:blip r:embed="rId13"/>
+                    <a:stretch>
+                      <a:fillRect/>
+                    </a:stretch>
+                  </pic:blipFill>
+                  <pic:spPr>
+                    <a:xfrm>
+                      <a:off x="0" y="0"/>
+                      <a:ext cx="4419670" cy="3073785"/>
+                    </a:xfrm>
+                    <a:prstGeom prst="rect">
+                      <a:avLst/>
+                    </a:prstGeom>
+                  </pic:spPr>
+                </pic:pic>
+              </a:graphicData>
+            </a:graphic>
+          </wp:inline>
+        </w:drawing>
       </w:r>
     </w:p>
     <w:p>
       <w:pPr>
-        <w:pStyle w:val="SmallMuted"/>
-        <w:spacing w:after="40"/>
-      </w:pPr>
-      <w:r>
-        <w:t>________________________________________________________________________________</w:t>
+        <w:rPr>
+          <w:lang w:val="en-ID"/>
+        </w:rPr>
+      </w:pPr>
+      <w:r>
+        <w:rPr>
+          <w:lang w:val="en-ID"/>
+        </w:rPr>
+        <w:t>I</w:t>
+      </w:r>
+      <w:r>
+        <w:rPr>
+          <w:lang w:val="en-ID"/>
+        </w:rPr>
+        <w:t xml:space="preserve">n the final Power BI model, combine orders and </w:t>
+      </w:r>
+      <w:proofErr w:type="spellStart"/>
+      <w:r>
+        <w:rPr>
+          <w:lang w:val="en-ID"/>
+        </w:rPr>
+        <w:t>order_items</w:t>
+      </w:r>
+      <w:proofErr w:type="spellEnd"/>
+      <w:r>
+        <w:rPr>
+          <w:lang w:val="en-ID"/>
+        </w:rPr>
+        <w:t xml:space="preserve"> into one sales fact table through Power Query or SQL. The simplified model would then be:</w:t>
       </w:r>
     </w:p>
     <w:p>
       <w:pPr>
-        <w:pStyle w:val="SmallMuted"/>
-        <w:spacing w:after="40"/>
-      </w:pPr>
-      <w:r>
-        <w:t>________________________________________________________________________________</w:t>
+        <w:numPr>
+          <w:ilvl w:val="0"/>
+          <w:numId w:val="16"/>
+        </w:numPr>
+        <w:rPr>
+          <w:lang w:val="en-ID"/>
+        </w:rPr>
+      </w:pPr>
+      <w:proofErr w:type="spellStart"/>
+      <w:r>
+        <w:rPr>
+          <w:lang w:val="en-ID"/>
+        </w:rPr>
+        <w:t>FactSales</w:t>
+      </w:r>
+      <w:proofErr w:type="spellEnd"/>
+      <w:r>
+        <w:rPr>
+          <w:lang w:val="en-ID"/>
+        </w:rPr>
+        <w:t xml:space="preserve"> </w:t>
       </w:r>
     </w:p>
     <w:p>
-      <w:r>
-        <w:br w:type="page"/>
+      <w:pPr>
+        <w:numPr>
+          <w:ilvl w:val="0"/>
+          <w:numId w:val="16"/>
+        </w:numPr>
+        <w:rPr>
+          <w:lang w:val="en-ID"/>
+        </w:rPr>
+      </w:pPr>
+      <w:proofErr w:type="spellStart"/>
+      <w:r>
+        <w:rPr>
+          <w:lang w:val="en-ID"/>
+        </w:rPr>
+        <w:t>FactReturns</w:t>
+      </w:r>
+      <w:proofErr w:type="spellEnd"/>
+      <w:r>
+        <w:rPr>
+          <w:lang w:val="en-ID"/>
+        </w:rPr>
+        <w:t xml:space="preserve"> </w:t>
       </w:r>
     </w:p>
     <w:p>
       <w:pPr>
+        <w:numPr>
+          <w:ilvl w:val="0"/>
+          <w:numId w:val="16"/>
+        </w:numPr>
+        <w:rPr>
+          <w:lang w:val="en-ID"/>
+        </w:rPr>
+      </w:pPr>
+      <w:proofErr w:type="spellStart"/>
+      <w:r>
+        <w:rPr>
+          <w:lang w:val="en-ID"/>
+        </w:rPr>
+        <w:t>FactSalesTargets</w:t>
+      </w:r>
+      <w:proofErr w:type="spellEnd"/>
+      <w:r>
+        <w:rPr>
+          <w:lang w:val="en-ID"/>
+        </w:rPr>
+        <w:t xml:space="preserve"> </w:t>
+      </w:r>
+    </w:p>
+    <w:p>
+      <w:pPr>
+        <w:numPr>
+          <w:ilvl w:val="0"/>
+          <w:numId w:val="16"/>
+        </w:numPr>
+        <w:rPr>
+          <w:lang w:val="en-ID"/>
+        </w:rPr>
+      </w:pPr>
+      <w:proofErr w:type="spellStart"/>
+      <w:r>
+        <w:rPr>
+          <w:lang w:val="en-ID"/>
+        </w:rPr>
+        <w:t>DimProduct</w:t>
+      </w:r>
+      <w:proofErr w:type="spellEnd"/>
+      <w:r>
+        <w:rPr>
+          <w:lang w:val="en-ID"/>
+        </w:rPr>
+        <w:t xml:space="preserve"> </w:t>
+      </w:r>
+    </w:p>
+    <w:p>
+      <w:pPr>
+        <w:numPr>
+          <w:ilvl w:val="0"/>
+          <w:numId w:val="16"/>
+        </w:numPr>
+        <w:rPr>
+          <w:lang w:val="en-ID"/>
+        </w:rPr>
+      </w:pPr>
+      <w:proofErr w:type="spellStart"/>
+      <w:r>
+        <w:rPr>
+          <w:lang w:val="en-ID"/>
+        </w:rPr>
+        <w:t>DimRegion</w:t>
+      </w:r>
+      <w:proofErr w:type="spellEnd"/>
+      <w:r>
+        <w:rPr>
+          <w:lang w:val="en-ID"/>
+        </w:rPr>
+        <w:t xml:space="preserve"> </w:t>
+      </w:r>
+    </w:p>
+    <w:p>
+      <w:pPr>
+        <w:numPr>
+          <w:ilvl w:val="0"/>
+          <w:numId w:val="16"/>
+        </w:numPr>
+        <w:rPr>
+          <w:lang w:val="en-ID"/>
+        </w:rPr>
+      </w:pPr>
+      <w:proofErr w:type="spellStart"/>
+      <w:r>
+        <w:rPr>
+          <w:lang w:val="en-ID"/>
+        </w:rPr>
+        <w:t>DimDate</w:t>
+      </w:r>
+      <w:proofErr w:type="spellEnd"/>
+    </w:p>
+    <w:p>
+      <w:pPr>
+        <w:rPr>
+          <w:lang w:val="en-ID"/>
+        </w:rPr>
+      </w:pPr>
+    </w:p>
+    <w:p/>
+    <w:p/>
+    <w:p>
+      <w:pPr>
+        <w:spacing w:after="200" w:line="276" w:lineRule="auto"/>
+      </w:pPr>
+      <w:r>
+        <w:t>CENTRAL table should be sales at order-line level</w:t>
+      </w:r>
+    </w:p>
+    <w:p>
+      <w:pPr>
+        <w:pStyle w:val="ListParagraph"/>
+        <w:numPr>
+          <w:ilvl w:val="0"/>
+          <w:numId w:val="17"/>
+        </w:numPr>
+        <w:spacing w:after="200" w:line="276" w:lineRule="auto"/>
+        <w:rPr>
+          <w:rFonts w:asciiTheme="majorHAnsi" w:eastAsiaTheme="majorEastAsia" w:hAnsiTheme="majorHAnsi" w:cstheme="majorBidi"/>
+          <w:b/>
+          <w:color w:val="17365D"/>
+          <w:spacing w:val="5"/>
+          <w:kern w:val="28"/>
+          <w:sz w:val="56"/>
+          <w:szCs w:val="52"/>
+        </w:rPr>
+      </w:pPr>
+      <w:r>
+        <w:t>Identify reporting grain</w:t>
+      </w:r>
+    </w:p>
+    <w:p>
+      <w:pPr>
+        <w:spacing w:after="200" w:line="276" w:lineRule="auto"/>
+        <w:ind w:left="360"/>
+      </w:pPr>
+      <w:r>
+        <w:t xml:space="preserve">Lowest level of detail -&gt; row in </w:t>
+      </w:r>
+      <w:proofErr w:type="spellStart"/>
+      <w:r>
+        <w:t>order_items</w:t>
+      </w:r>
+      <w:proofErr w:type="spellEnd"/>
+      <w:r>
+        <w:t xml:space="preserve"> which represents one product line within one order</w:t>
+      </w:r>
+    </w:p>
+    <w:p>
+      <w:pPr>
+        <w:spacing w:after="200" w:line="276" w:lineRule="auto"/>
+        <w:ind w:left="360"/>
+      </w:pPr>
+      <w:r>
+        <w:t xml:space="preserve">So, </w:t>
+      </w:r>
+      <w:proofErr w:type="spellStart"/>
+      <w:r>
+        <w:t>order_items</w:t>
+      </w:r>
+      <w:proofErr w:type="spellEnd"/>
+      <w:r>
+        <w:t xml:space="preserve"> becomes the foundation of sales fact table; orders </w:t>
+      </w:r>
+      <w:proofErr w:type="gramStart"/>
+      <w:r>
+        <w:t>supplies</w:t>
+      </w:r>
+      <w:proofErr w:type="gramEnd"/>
+      <w:r>
+        <w:t xml:space="preserve"> order data, region, and order status; products </w:t>
+      </w:r>
+      <w:proofErr w:type="gramStart"/>
+      <w:r>
+        <w:t>supplies</w:t>
+      </w:r>
+      <w:proofErr w:type="gramEnd"/>
+      <w:r>
+        <w:t xml:space="preserve"> product attributes; regions </w:t>
+      </w:r>
+      <w:proofErr w:type="gramStart"/>
+      <w:r>
+        <w:t>supplies</w:t>
+      </w:r>
+      <w:proofErr w:type="gramEnd"/>
+      <w:r>
+        <w:t xml:space="preserve"> geographic attributes; </w:t>
+      </w:r>
+      <w:r>
+        <w:rPr>
+          <w:highlight w:val="green"/>
+        </w:rPr>
+        <w:t xml:space="preserve">customers </w:t>
+      </w:r>
+      <w:r>
+        <w:rPr>
+          <w:highlight w:val="green"/>
+        </w:rPr>
+        <w:t>supply city name</w:t>
+      </w:r>
+    </w:p>
+    <w:p>
+      <w:pPr>
+        <w:pStyle w:val="ListParagraph"/>
+        <w:numPr>
+          <w:ilvl w:val="0"/>
+          <w:numId w:val="17"/>
+        </w:numPr>
+        <w:spacing w:after="200" w:line="276" w:lineRule="auto"/>
+      </w:pPr>
+      <w:r>
+        <w:t>Architecture</w:t>
+      </w:r>
+    </w:p>
+    <w:p>
+      <w:pPr>
+        <w:spacing w:after="200" w:line="276" w:lineRule="auto"/>
+        <w:ind w:left="360"/>
+      </w:pPr>
+      <w:proofErr w:type="spellStart"/>
+      <w:r>
+        <w:t>Postgresql</w:t>
+      </w:r>
+      <w:proofErr w:type="spellEnd"/>
+      <w:r>
+        <w:t xml:space="preserve"> (source table -&gt; reporting views) -&gt; power bi (power query -&gt; star schema semantic model -&gt; dashboard)</w:t>
+      </w:r>
+    </w:p>
+    <w:p>
+      <w:pPr>
+        <w:spacing w:after="200" w:line="276" w:lineRule="auto"/>
+        <w:ind w:left="360"/>
+      </w:pPr>
+      <w:r>
+        <w:t xml:space="preserve">Source table: products, orders, </w:t>
+      </w:r>
+      <w:proofErr w:type="spellStart"/>
+      <w:r>
+        <w:t>order_items</w:t>
+      </w:r>
+      <w:proofErr w:type="spellEnd"/>
+      <w:r>
+        <w:t xml:space="preserve">, regions -&gt; reporting views: </w:t>
+      </w:r>
+      <w:proofErr w:type="spellStart"/>
+      <w:r>
+        <w:t>reporting.</w:t>
+      </w:r>
+      <w:proofErr w:type="gramStart"/>
+      <w:r>
+        <w:t>vw.fact</w:t>
+      </w:r>
+      <w:proofErr w:type="gramEnd"/>
+      <w:r>
+        <w:t>_sales</w:t>
+      </w:r>
+      <w:proofErr w:type="spellEnd"/>
+      <w:r>
+        <w:t xml:space="preserve"> (orders + </w:t>
+      </w:r>
+      <w:proofErr w:type="spellStart"/>
+      <w:r>
+        <w:t>order_items</w:t>
+      </w:r>
+      <w:proofErr w:type="spellEnd"/>
+      <w:r>
+        <w:t xml:space="preserve">), </w:t>
+      </w:r>
+      <w:proofErr w:type="spellStart"/>
+      <w:proofErr w:type="gramStart"/>
+      <w:r>
+        <w:t>reporting.vw</w:t>
+      </w:r>
+      <w:proofErr w:type="gramEnd"/>
+      <w:r>
+        <w:t>_dim_</w:t>
+      </w:r>
+      <w:proofErr w:type="gramStart"/>
+      <w:r>
+        <w:t>product</w:t>
+      </w:r>
+      <w:proofErr w:type="spellEnd"/>
+      <w:r>
+        <w:t xml:space="preserve"> ;</w:t>
+      </w:r>
+      <w:proofErr w:type="gramEnd"/>
+      <w:r>
+        <w:t xml:space="preserve"> </w:t>
+      </w:r>
+      <w:proofErr w:type="spellStart"/>
+      <w:proofErr w:type="gramStart"/>
+      <w:r>
+        <w:t>reporting.vw</w:t>
+      </w:r>
+      <w:proofErr w:type="gramEnd"/>
+      <w:r>
+        <w:t>_dim_</w:t>
+      </w:r>
+      <w:proofErr w:type="gramStart"/>
+      <w:r>
+        <w:t>region</w:t>
+      </w:r>
+      <w:proofErr w:type="spellEnd"/>
+      <w:r>
+        <w:t xml:space="preserve"> ;</w:t>
+      </w:r>
+      <w:proofErr w:type="gramEnd"/>
+      <w:r>
+        <w:t xml:space="preserve"> </w:t>
+      </w:r>
+      <w:proofErr w:type="spellStart"/>
+      <w:proofErr w:type="gramStart"/>
+      <w:r>
+        <w:t>reporting.vw</w:t>
+      </w:r>
+      <w:proofErr w:type="gramEnd"/>
+      <w:r>
+        <w:t>_dim_customer</w:t>
+      </w:r>
+      <w:proofErr w:type="spellEnd"/>
+      <w:r>
+        <w:t xml:space="preserve"> (maybe)</w:t>
+      </w:r>
+    </w:p>
+    <w:p>
+      <w:pPr>
+        <w:spacing w:after="200" w:line="276" w:lineRule="auto"/>
+        <w:ind w:left="360"/>
+      </w:pPr>
+      <w:r>
+        <w:lastRenderedPageBreak/>
+        <w:drawing>
+          <wp:inline distT="0" distB="0" distL="0" distR="0" wp14:anchorId="56A8DD1E" wp14:editId="46E804C7">
+            <wp:extent cx="4579620" cy="4019347"/>
+            <wp:effectExtent l="0" t="0" r="0" b="635"/>
+            <wp:docPr id="949424706" name="Picture 1"/>
+            <wp:cNvGraphicFramePr>
+              <a:graphicFrameLocks xmlns:a="http://schemas.openxmlformats.org/drawingml/2006/main" noChangeAspect="1"/>
+            </wp:cNvGraphicFramePr>
+            <a:graphic xmlns:a="http://schemas.openxmlformats.org/drawingml/2006/main">
+              <a:graphicData uri="http://schemas.openxmlformats.org/drawingml/2006/picture">
+                <pic:pic xmlns:pic="http://schemas.openxmlformats.org/drawingml/2006/picture">
+                  <pic:nvPicPr>
+                    <pic:cNvPr id="949424706" name=""/>
+                    <pic:cNvPicPr/>
+                  </pic:nvPicPr>
+                  <pic:blipFill>
+                    <a:blip r:embed="rId14"/>
+                    <a:stretch>
+                      <a:fillRect/>
+                    </a:stretch>
+                  </pic:blipFill>
+                  <pic:spPr>
+                    <a:xfrm>
+                      <a:off x="0" y="0"/>
+                      <a:ext cx="4590399" cy="4028807"/>
+                    </a:xfrm>
+                    <a:prstGeom prst="rect">
+                      <a:avLst/>
+                    </a:prstGeom>
+                  </pic:spPr>
+                </pic:pic>
+              </a:graphicData>
+            </a:graphic>
+          </wp:inline>
+        </w:drawing>
+      </w:r>
+      <w:r>
+        <w:t xml:space="preserve"> </w:t>
+      </w:r>
+    </w:p>
+    <w:tbl>
+      <w:tblPr>
+        <w:tblStyle w:val="TableGrid"/>
+        <w:tblW w:w="0" w:type="auto"/>
+        <w:tblLook w:val="04A0" w:firstRow="1" w:lastRow="0" w:firstColumn="1" w:lastColumn="0" w:noHBand="0" w:noVBand="1"/>
+      </w:tblPr>
+      <w:tblGrid>
+        <w:gridCol w:w="1817"/>
+        <w:gridCol w:w="3066"/>
+        <w:gridCol w:w="4707"/>
+      </w:tblGrid>
+      <w:tr>
+        <w:tc>
+          <w:tcPr>
+            <w:tcW w:w="0" w:type="auto"/>
+            <w:hideMark/>
+          </w:tcPr>
+          <w:p>
+            <w:pPr>
+              <w:spacing w:after="200" w:line="276" w:lineRule="auto"/>
+              <w:ind w:left="360"/>
+              <w:rPr>
+                <w:b/>
+                <w:bCs/>
+                <w:lang w:val="en-ID"/>
+              </w:rPr>
+            </w:pPr>
+            <w:r>
+              <w:rPr>
+                <w:b/>
+                <w:bCs/>
+                <w:lang w:val="en-ID"/>
+              </w:rPr>
+              <w:t>Power BI table</w:t>
+            </w:r>
+          </w:p>
+        </w:tc>
+        <w:tc>
+          <w:tcPr>
+            <w:tcW w:w="0" w:type="auto"/>
+            <w:hideMark/>
+          </w:tcPr>
+          <w:p>
+            <w:pPr>
+              <w:spacing w:after="200" w:line="276" w:lineRule="auto"/>
+              <w:ind w:left="360"/>
+              <w:rPr>
+                <w:b/>
+                <w:bCs/>
+                <w:lang w:val="en-ID"/>
+              </w:rPr>
+            </w:pPr>
+            <w:r>
+              <w:rPr>
+                <w:b/>
+                <w:bCs/>
+                <w:lang w:val="en-ID"/>
+              </w:rPr>
+              <w:t>Source</w:t>
+            </w:r>
+          </w:p>
+        </w:tc>
+        <w:tc>
+          <w:tcPr>
+            <w:tcW w:w="0" w:type="auto"/>
+            <w:hideMark/>
+          </w:tcPr>
+          <w:p>
+            <w:pPr>
+              <w:spacing w:after="200" w:line="276" w:lineRule="auto"/>
+              <w:ind w:left="360"/>
+              <w:rPr>
+                <w:b/>
+                <w:bCs/>
+                <w:lang w:val="en-ID"/>
+              </w:rPr>
+            </w:pPr>
+            <w:r>
+              <w:rPr>
+                <w:b/>
+                <w:bCs/>
+                <w:lang w:val="en-ID"/>
+              </w:rPr>
+              <w:t>Grain</w:t>
+            </w:r>
+          </w:p>
+        </w:tc>
+      </w:tr>
+      <w:tr>
+        <w:tc>
+          <w:tcPr>
+            <w:tcW w:w="0" w:type="auto"/>
+            <w:hideMark/>
+          </w:tcPr>
+          <w:p>
+            <w:pPr>
+              <w:spacing w:after="200" w:line="276" w:lineRule="auto"/>
+              <w:ind w:left="360"/>
+              <w:rPr>
+                <w:lang w:val="en-ID"/>
+              </w:rPr>
+            </w:pPr>
+            <w:proofErr w:type="spellStart"/>
+            <w:r>
+              <w:rPr>
+                <w:lang w:val="en-ID"/>
+              </w:rPr>
+              <w:t>FactSales</w:t>
+            </w:r>
+            <w:proofErr w:type="spellEnd"/>
+          </w:p>
+        </w:tc>
+        <w:tc>
+          <w:tcPr>
+            <w:tcW w:w="0" w:type="auto"/>
+            <w:hideMark/>
+          </w:tcPr>
+          <w:p>
+            <w:pPr>
+              <w:spacing w:after="200" w:line="276" w:lineRule="auto"/>
+              <w:ind w:left="360"/>
+              <w:rPr>
+                <w:lang w:val="en-ID"/>
+              </w:rPr>
+            </w:pPr>
+            <w:r>
+              <w:rPr>
+                <w:lang w:val="en-ID"/>
+              </w:rPr>
+              <w:t xml:space="preserve">orders joined with </w:t>
+            </w:r>
+            <w:proofErr w:type="spellStart"/>
+            <w:r>
+              <w:rPr>
+                <w:lang w:val="en-ID"/>
+              </w:rPr>
+              <w:t>order_items</w:t>
+            </w:r>
+            <w:proofErr w:type="spellEnd"/>
+          </w:p>
+        </w:tc>
+        <w:tc>
+          <w:tcPr>
+            <w:tcW w:w="0" w:type="auto"/>
+            <w:hideMark/>
+          </w:tcPr>
+          <w:p>
+            <w:pPr>
+              <w:spacing w:after="200" w:line="276" w:lineRule="auto"/>
+              <w:ind w:left="360"/>
+              <w:rPr>
+                <w:lang w:val="en-ID"/>
+              </w:rPr>
+            </w:pPr>
+            <w:r>
+              <w:rPr>
+                <w:lang w:val="en-ID"/>
+              </w:rPr>
+              <w:t>One row per order line</w:t>
+            </w:r>
+          </w:p>
+        </w:tc>
+      </w:tr>
+      <w:tr>
+        <w:tc>
+          <w:tcPr>
+            <w:tcW w:w="0" w:type="auto"/>
+            <w:hideMark/>
+          </w:tcPr>
+          <w:p>
+            <w:pPr>
+              <w:spacing w:after="200" w:line="276" w:lineRule="auto"/>
+              <w:ind w:left="360"/>
+              <w:rPr>
+                <w:lang w:val="en-ID"/>
+              </w:rPr>
+            </w:pPr>
+            <w:proofErr w:type="spellStart"/>
+            <w:r>
+              <w:rPr>
+                <w:lang w:val="en-ID"/>
+              </w:rPr>
+              <w:t>DimProduct</w:t>
+            </w:r>
+            <w:proofErr w:type="spellEnd"/>
+          </w:p>
+        </w:tc>
+        <w:tc>
+          <w:tcPr>
+            <w:tcW w:w="0" w:type="auto"/>
+            <w:hideMark/>
+          </w:tcPr>
+          <w:p>
+            <w:pPr>
+              <w:spacing w:after="200" w:line="276" w:lineRule="auto"/>
+              <w:ind w:left="360"/>
+              <w:rPr>
+                <w:lang w:val="en-ID"/>
+              </w:rPr>
+            </w:pPr>
+            <w:r>
+              <w:rPr>
+                <w:lang w:val="en-ID"/>
+              </w:rPr>
+              <w:t>products</w:t>
+            </w:r>
+          </w:p>
+        </w:tc>
+        <w:tc>
+          <w:tcPr>
+            <w:tcW w:w="0" w:type="auto"/>
+            <w:hideMark/>
+          </w:tcPr>
+          <w:p>
+            <w:pPr>
+              <w:spacing w:after="200" w:line="276" w:lineRule="auto"/>
+              <w:ind w:left="360"/>
+              <w:rPr>
+                <w:lang w:val="en-ID"/>
+              </w:rPr>
+            </w:pPr>
+            <w:r>
+              <w:rPr>
+                <w:lang w:val="en-ID"/>
+              </w:rPr>
+              <w:t>One row per product</w:t>
+            </w:r>
+          </w:p>
+        </w:tc>
+      </w:tr>
+      <w:tr>
+        <w:tc>
+          <w:tcPr>
+            <w:tcW w:w="0" w:type="auto"/>
+            <w:hideMark/>
+          </w:tcPr>
+          <w:p>
+            <w:pPr>
+              <w:spacing w:after="200" w:line="276" w:lineRule="auto"/>
+              <w:ind w:left="360"/>
+              <w:rPr>
+                <w:lang w:val="en-ID"/>
+              </w:rPr>
+            </w:pPr>
+            <w:proofErr w:type="spellStart"/>
+            <w:r>
+              <w:rPr>
+                <w:lang w:val="en-ID"/>
+              </w:rPr>
+              <w:t>DimRegion</w:t>
+            </w:r>
+            <w:proofErr w:type="spellEnd"/>
+          </w:p>
+        </w:tc>
+        <w:tc>
+          <w:tcPr>
+            <w:tcW w:w="0" w:type="auto"/>
+            <w:hideMark/>
+          </w:tcPr>
+          <w:p>
+            <w:pPr>
+              <w:spacing w:after="200" w:line="276" w:lineRule="auto"/>
+              <w:ind w:left="360"/>
+              <w:rPr>
+                <w:lang w:val="en-ID"/>
+              </w:rPr>
+            </w:pPr>
+            <w:r>
+              <w:rPr>
+                <w:lang w:val="en-ID"/>
+              </w:rPr>
+              <w:t>regions</w:t>
+            </w:r>
+          </w:p>
+        </w:tc>
+        <w:tc>
+          <w:tcPr>
+            <w:tcW w:w="0" w:type="auto"/>
+            <w:hideMark/>
+          </w:tcPr>
+          <w:p>
+            <w:pPr>
+              <w:spacing w:after="200" w:line="276" w:lineRule="auto"/>
+              <w:ind w:left="360"/>
+              <w:rPr>
+                <w:lang w:val="en-ID"/>
+              </w:rPr>
+            </w:pPr>
+            <w:r>
+              <w:rPr>
+                <w:lang w:val="en-ID"/>
+              </w:rPr>
+              <w:t>One row per region</w:t>
+            </w:r>
+          </w:p>
+        </w:tc>
+      </w:tr>
+      <w:tr>
+        <w:tc>
+          <w:tcPr>
+            <w:tcW w:w="0" w:type="auto"/>
+            <w:hideMark/>
+          </w:tcPr>
+          <w:p>
+            <w:pPr>
+              <w:spacing w:after="200" w:line="276" w:lineRule="auto"/>
+              <w:ind w:left="360"/>
+              <w:rPr>
+                <w:lang w:val="en-ID"/>
+              </w:rPr>
+            </w:pPr>
+            <w:proofErr w:type="spellStart"/>
+            <w:r>
+              <w:rPr>
+                <w:lang w:val="en-ID"/>
+              </w:rPr>
+              <w:t>DimDate</w:t>
+            </w:r>
+            <w:proofErr w:type="spellEnd"/>
+          </w:p>
+        </w:tc>
+        <w:tc>
+          <w:tcPr>
+            <w:tcW w:w="0" w:type="auto"/>
+            <w:hideMark/>
+          </w:tcPr>
+          <w:p>
+            <w:pPr>
+              <w:spacing w:after="200" w:line="276" w:lineRule="auto"/>
+              <w:ind w:left="360"/>
+              <w:rPr>
+                <w:lang w:val="en-ID"/>
+              </w:rPr>
+            </w:pPr>
+            <w:r>
+              <w:rPr>
+                <w:lang w:val="en-ID"/>
+              </w:rPr>
+              <w:t>Generated date table</w:t>
+            </w:r>
+          </w:p>
+        </w:tc>
+        <w:tc>
+          <w:tcPr>
+            <w:tcW w:w="0" w:type="auto"/>
+            <w:hideMark/>
+          </w:tcPr>
+          <w:p>
+            <w:pPr>
+              <w:spacing w:after="200" w:line="276" w:lineRule="auto"/>
+              <w:ind w:left="360"/>
+              <w:rPr>
+                <w:lang w:val="en-ID"/>
+              </w:rPr>
+            </w:pPr>
+            <w:r>
+              <w:rPr>
+                <w:lang w:val="en-ID"/>
+              </w:rPr>
+              <w:t>One row per calendar date</w:t>
+            </w:r>
+          </w:p>
+        </w:tc>
+      </w:tr>
+      <w:tr>
+        <w:tc>
+          <w:tcPr>
+            <w:tcW w:w="0" w:type="auto"/>
+            <w:hideMark/>
+          </w:tcPr>
+          <w:p>
+            <w:pPr>
+              <w:spacing w:after="200" w:line="276" w:lineRule="auto"/>
+              <w:ind w:left="360"/>
+              <w:rPr>
+                <w:lang w:val="en-ID"/>
+              </w:rPr>
+            </w:pPr>
+            <w:proofErr w:type="spellStart"/>
+            <w:r>
+              <w:rPr>
+                <w:lang w:val="en-ID"/>
+              </w:rPr>
+              <w:t>DimCustomer</w:t>
+            </w:r>
+            <w:proofErr w:type="spellEnd"/>
+          </w:p>
+        </w:tc>
+        <w:tc>
+          <w:tcPr>
+            <w:tcW w:w="0" w:type="auto"/>
+            <w:hideMark/>
+          </w:tcPr>
+          <w:p>
+            <w:pPr>
+              <w:spacing w:after="200" w:line="276" w:lineRule="auto"/>
+              <w:ind w:left="360"/>
+              <w:rPr>
+                <w:lang w:val="en-ID"/>
+              </w:rPr>
+            </w:pPr>
+            <w:r>
+              <w:rPr>
+                <w:lang w:val="en-ID"/>
+              </w:rPr>
+              <w:t>customers</w:t>
+            </w:r>
+          </w:p>
+        </w:tc>
+        <w:tc>
+          <w:tcPr>
+            <w:tcW w:w="0" w:type="auto"/>
+            <w:hideMark/>
+          </w:tcPr>
+          <w:p>
+            <w:pPr>
+              <w:spacing w:after="200" w:line="276" w:lineRule="auto"/>
+              <w:ind w:left="360"/>
+              <w:rPr>
+                <w:lang w:val="en-ID"/>
+              </w:rPr>
+            </w:pPr>
+            <w:r>
+              <w:rPr>
+                <w:lang w:val="en-ID"/>
+              </w:rPr>
+              <w:t>One row per customer, but currently disconnected</w:t>
+            </w:r>
+          </w:p>
+        </w:tc>
+      </w:tr>
+    </w:tbl>
+    <w:p>
+      <w:pPr>
+        <w:spacing w:after="200" w:line="276" w:lineRule="auto"/>
+        <w:ind w:left="360"/>
+      </w:pPr>
+      <w:r>
+        <w:t xml:space="preserve"> </w:t>
+      </w:r>
+    </w:p>
+    <w:p>
+      <w:pPr>
+        <w:pStyle w:val="ListParagraph"/>
+        <w:numPr>
+          <w:ilvl w:val="0"/>
+          <w:numId w:val="17"/>
+        </w:numPr>
+        <w:spacing w:after="200" w:line="276" w:lineRule="auto"/>
+      </w:pPr>
+      <w:r>
+        <w:t>Create fact view</w:t>
+      </w:r>
+    </w:p>
+    <w:p>
+      <w:pPr>
+        <w:pStyle w:val="ListParagraph"/>
+        <w:numPr>
+          <w:ilvl w:val="0"/>
+          <w:numId w:val="17"/>
+        </w:numPr>
+        <w:spacing w:after="200" w:line="276" w:lineRule="auto"/>
+      </w:pPr>
+      <w:r>
+        <w:rPr>
+          <w:noProof/>
+        </w:rPr>
+        <mc:AlternateContent>
+          <mc:Choice Requires="wps">
+            <w:drawing>
+              <wp:anchor distT="0" distB="0" distL="114300" distR="114300" simplePos="0" relativeHeight="251660288" behindDoc="0" locked="0" layoutInCell="1" allowOverlap="1" wp14:anchorId="11F6427F" wp14:editId="091451CD">
+                <wp:simplePos x="0" y="0"/>
+                <wp:positionH relativeFrom="column">
+                  <wp:posOffset>3898265</wp:posOffset>
+                </wp:positionH>
+                <wp:positionV relativeFrom="paragraph">
+                  <wp:posOffset>6985</wp:posOffset>
+                </wp:positionV>
+                <wp:extent cx="2865120" cy="2080260"/>
+                <wp:effectExtent l="0" t="0" r="11430" b="15240"/>
+                <wp:wrapNone/>
+                <wp:docPr id="890479527" name="Text Box 2"/>
+                <wp:cNvGraphicFramePr/>
+                <a:graphic xmlns:a="http://schemas.openxmlformats.org/drawingml/2006/main">
+                  <a:graphicData uri="http://schemas.microsoft.com/office/word/2010/wordprocessingShape">
+                    <wps:wsp>
+                      <wps:cNvSpPr txBox="1"/>
+                      <wps:spPr>
+                        <a:xfrm>
+                          <a:off x="0" y="0"/>
+                          <a:ext cx="2865120" cy="2080260"/>
+                        </a:xfrm>
+                        <a:prstGeom prst="rect">
+                          <a:avLst/>
+                        </a:prstGeom>
+                        <a:solidFill>
+                          <a:schemeClr val="lt1"/>
+                        </a:solidFill>
+                        <a:ln w="6350">
+                          <a:solidFill>
+                            <a:prstClr val="black"/>
+                          </a:solidFill>
+                        </a:ln>
+                      </wps:spPr>
+                      <wps:txbx>
+                        <w:txbxContent>
+                          <w:p>
+                            <w:proofErr w:type="spellStart"/>
+                            <w:proofErr w:type="gramStart"/>
+                            <w:r>
+                              <w:t>o.order</w:t>
+                            </w:r>
+                            <w:proofErr w:type="gramEnd"/>
+                            <w:r>
+                              <w:t>_status</w:t>
+                            </w:r>
+                            <w:proofErr w:type="spellEnd"/>
+                            <w:r>
+                              <w:t>,</w:t>
+                            </w:r>
+                          </w:p>
+                          <w:p>
+                            <w:r>
+                              <w:t xml:space="preserve">    </w:t>
+                            </w:r>
+                            <w:proofErr w:type="spellStart"/>
+                            <w:proofErr w:type="gramStart"/>
+                            <w:r>
+                              <w:t>oi.quantity</w:t>
+                            </w:r>
+                            <w:proofErr w:type="spellEnd"/>
+                            <w:proofErr w:type="gramEnd"/>
+                            <w:r>
+                              <w:t>,</w:t>
+                            </w:r>
+                          </w:p>
+                          <w:p>
+                            <w:r>
+                              <w:t xml:space="preserve">    </w:t>
+                            </w:r>
+                            <w:proofErr w:type="spellStart"/>
+                            <w:proofErr w:type="gramStart"/>
+                            <w:r>
+                              <w:t>oi.unit</w:t>
+                            </w:r>
+                            <w:proofErr w:type="gramEnd"/>
+                            <w:r>
+                              <w:t>_price</w:t>
+                            </w:r>
+                            <w:proofErr w:type="spellEnd"/>
+                            <w:r>
+                              <w:t>,</w:t>
+                            </w:r>
+                          </w:p>
+                          <w:p>
+                            <w:r>
+                              <w:t xml:space="preserve">    </w:t>
+                            </w:r>
+                            <w:proofErr w:type="spellStart"/>
+                            <w:proofErr w:type="gramStart"/>
+                            <w:r>
+                              <w:t>oi.discount</w:t>
+                            </w:r>
+                            <w:proofErr w:type="gramEnd"/>
+                            <w:r>
+                              <w:t>_amount</w:t>
+                            </w:r>
+                            <w:proofErr w:type="spellEnd"/>
+                            <w:r>
+                              <w:t>,</w:t>
+                            </w:r>
+                          </w:p>
+                          <w:p>
+                            <w:r>
+                              <w:t xml:space="preserve">    </w:t>
+                            </w:r>
+                            <w:proofErr w:type="spellStart"/>
+                            <w:r>
+                              <w:t>oi.net_amount</w:t>
+                            </w:r>
+                            <w:proofErr w:type="spellEnd"/>
+                          </w:p>
+                          <w:p>
+                            <w:r>
+                              <w:t xml:space="preserve">FROM </w:t>
+                            </w:r>
+                            <w:proofErr w:type="spellStart"/>
+                            <w:r>
+                              <w:t>order_items</w:t>
+                            </w:r>
+                            <w:proofErr w:type="spellEnd"/>
+                            <w:r>
+                              <w:t xml:space="preserve"> AS oi</w:t>
+                            </w:r>
+                          </w:p>
+                          <w:p>
+                            <w:r>
+                              <w:t>INNER JOIN orders AS o</w:t>
+                            </w:r>
+                          </w:p>
+                          <w:p>
+                            <w:r>
+                              <w:t xml:space="preserve">    ON </w:t>
+                            </w:r>
+                            <w:proofErr w:type="spellStart"/>
+                            <w:proofErr w:type="gramStart"/>
+                            <w:r>
+                              <w:t>oi.order</w:t>
+                            </w:r>
+                            <w:proofErr w:type="gramEnd"/>
+                            <w:r>
+                              <w:t>_id</w:t>
+                            </w:r>
+                            <w:proofErr w:type="spellEnd"/>
+                            <w:r>
+                              <w:t xml:space="preserve"> = o.id;</w:t>
+                            </w:r>
+                          </w:p>
+                          <w:p/>
+                        </w:txbxContent>
+                      </wps:txbx>
+                      <wps:bodyPr rot="0" spcFirstLastPara="0" vertOverflow="overflow" horzOverflow="overflow" vert="horz" wrap="square" lIns="91440" tIns="45720" rIns="91440" bIns="45720" numCol="1" spcCol="0" rtlCol="0" fromWordArt="0" anchor="t" anchorCtr="0" forceAA="0" compatLnSpc="1">
+                        <a:prstTxWarp prst="textNoShape">
+                          <a:avLst/>
+                        </a:prstTxWarp>
+                        <a:noAutofit/>
+                      </wps:bodyPr>
+                    </wps:wsp>
+                  </a:graphicData>
+                </a:graphic>
+              </wp:anchor>
+            </w:drawing>
+          </mc:Choice>
+          <mc:Fallback>
+            <w:pict>
+              <v:shapetype w14:anchorId="11F6427F" id="_x0000_t202" coordsize="21600,21600" o:spt="202" path="m,l,21600r21600,l21600,xe">
+                <v:stroke joinstyle="miter"/>
+                <v:path gradientshapeok="t" o:connecttype="rect"/>
+              </v:shapetype>
+              <v:shape id="Text Box 2" o:spid="_x0000_s1026" type="#_x0000_t202" style="position:absolute;left:0;text-align:left;margin-left:306.95pt;margin-top:.55pt;width:225.6pt;height:163.8pt;z-index:251660288;visibility:visible;mso-wrap-style:square;mso-wrap-distance-left:9pt;mso-wrap-distance-top:0;mso-wrap-distance-right:9pt;mso-wrap-distance-bottom:0;mso-position-horizontal:absolute;mso-position-horizontal-relative:text;mso-position-vertical:absolute;mso-position-vertical-relative:text;v-text-anchor:top" o:gfxdata="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" fillcolor="white [3201]" strokeweight=".5pt">
+                <v:textbox>
+                  <w:txbxContent>
+                    <w:p>
+                      <w:proofErr w:type="spellStart"/>
+                      <w:proofErr w:type="gramStart"/>
+                      <w:r>
+                        <w:t>o.order</w:t>
+                      </w:r>
+                      <w:proofErr w:type="gramEnd"/>
+                      <w:r>
+                        <w:t>_status</w:t>
+                      </w:r>
+                      <w:proofErr w:type="spellEnd"/>
+                      <w:r>
+                        <w:t>,</w:t>
+                      </w:r>
+                    </w:p>
+                    <w:p>
+                      <w:r>
+                        <w:t xml:space="preserve">    </w:t>
+                      </w:r>
+                      <w:proofErr w:type="spellStart"/>
+                      <w:proofErr w:type="gramStart"/>
+                      <w:r>
+                        <w:t>oi.quantity</w:t>
+                      </w:r>
+                      <w:proofErr w:type="spellEnd"/>
+                      <w:proofErr w:type="gramEnd"/>
+                      <w:r>
+                        <w:t>,</w:t>
+                      </w:r>
+                    </w:p>
+                    <w:p>
+                      <w:r>
+                        <w:t xml:space="preserve">    </w:t>
+                      </w:r>
+                      <w:proofErr w:type="spellStart"/>
+                      <w:proofErr w:type="gramStart"/>
+                      <w:r>
+                        <w:t>oi.unit</w:t>
+                      </w:r>
+                      <w:proofErr w:type="gramEnd"/>
+                      <w:r>
+                        <w:t>_price</w:t>
+                      </w:r>
+                      <w:proofErr w:type="spellEnd"/>
+                      <w:r>
+                        <w:t>,</w:t>
+                      </w:r>
+                    </w:p>
+                    <w:p>
+                      <w:r>
+                        <w:t xml:space="preserve">    </w:t>
+                      </w:r>
+                      <w:proofErr w:type="spellStart"/>
+                      <w:proofErr w:type="gramStart"/>
+                      <w:r>
+                        <w:t>oi.discount</w:t>
+                      </w:r>
+                      <w:proofErr w:type="gramEnd"/>
+                      <w:r>
+                        <w:t>_amount</w:t>
+                      </w:r>
+                      <w:proofErr w:type="spellEnd"/>
+                      <w:r>
+                        <w:t>,</w:t>
+                      </w:r>
+                    </w:p>
+                    <w:p>
+                      <w:r>
+                        <w:t xml:space="preserve">    </w:t>
+                      </w:r>
+                      <w:proofErr w:type="spellStart"/>
+                      <w:r>
+                        <w:t>oi.net_amount</w:t>
+                      </w:r>
+                      <w:proofErr w:type="spellEnd"/>
+                    </w:p>
+                    <w:p>
+                      <w:r>
+                        <w:t xml:space="preserve">FROM </w:t>
+                      </w:r>
+                      <w:proofErr w:type="spellStart"/>
+                      <w:r>
+                        <w:t>order_items</w:t>
+                      </w:r>
+                      <w:proofErr w:type="spellEnd"/>
+                      <w:r>
+                        <w:t xml:space="preserve"> AS oi</w:t>
+                      </w:r>
+                    </w:p>
+                    <w:p>
+                      <w:r>
+                        <w:t>INNER JOIN orders AS o</w:t>
+                      </w:r>
+                    </w:p>
+                    <w:p>
+                      <w:r>
+                        <w:t xml:space="preserve">    ON </w:t>
+                      </w:r>
+                      <w:proofErr w:type="spellStart"/>
+                      <w:proofErr w:type="gramStart"/>
+                      <w:r>
+                        <w:t>oi.order</w:t>
+                      </w:r>
+                      <w:proofErr w:type="gramEnd"/>
+                      <w:r>
+                        <w:t>_id</w:t>
+                      </w:r>
+                      <w:proofErr w:type="spellEnd"/>
+                      <w:r>
+                        <w:t xml:space="preserve"> = o.id;</w:t>
+                      </w:r>
+                    </w:p>
+                    <w:p/>
+                  </w:txbxContent>
+                </v:textbox>
+              </v:shape>
+            </w:pict>
+          </mc:Fallback>
+        </mc:AlternateContent>
+      </w:r>
+      <w:r>
+        <w:rPr>
+          <w:noProof/>
+        </w:rPr>
+        <mc:AlternateContent>
+          <mc:Choice Requires="wps">
+            <w:drawing>
+              <wp:anchor distT="0" distB="0" distL="114300" distR="114300" simplePos="0" relativeHeight="251659264" behindDoc="0" locked="0" layoutInCell="1" allowOverlap="1" wp14:anchorId="4F8E1734" wp14:editId="6417715F">
+                <wp:simplePos x="0" y="0"/>
+                <wp:positionH relativeFrom="column">
+                  <wp:posOffset>758825</wp:posOffset>
+                </wp:positionH>
+                <wp:positionV relativeFrom="paragraph">
+                  <wp:posOffset>6985</wp:posOffset>
+                </wp:positionV>
+                <wp:extent cx="3002280" cy="2156460"/>
+                <wp:effectExtent l="0" t="0" r="26670" b="15240"/>
+                <wp:wrapNone/>
+                <wp:docPr id="1340100908" name="Text Box 1"/>
+                <wp:cNvGraphicFramePr/>
+                <a:graphic xmlns:a="http://schemas.openxmlformats.org/drawingml/2006/main">
+                  <a:graphicData uri="http://schemas.microsoft.com/office/word/2010/wordprocessingShape">
+                    <wps:wsp>
+                      <wps:cNvSpPr txBox="1"/>
+                      <wps:spPr>
+                        <a:xfrm>
+                          <a:off x="0" y="0"/>
+                          <a:ext cx="3002280" cy="2156460"/>
+                        </a:xfrm>
+                        <a:prstGeom prst="rect">
+                          <a:avLst/>
+                        </a:prstGeom>
+                        <a:solidFill>
+                          <a:schemeClr val="lt1"/>
+                        </a:solidFill>
+                        <a:ln w="6350">
+                          <a:solidFill>
+                            <a:prstClr val="black"/>
+                          </a:solidFill>
+                        </a:ln>
+                      </wps:spPr>
+                      <wps:txbx>
+                        <w:txbxContent>
+                          <w:p>
+                            <w:r>
+                              <w:t>CREATE SCHEMA IF NOT EXISTS reporting;</w:t>
+                            </w:r>
+                          </w:p>
+                          <w:p/>
+                          <w:p>
+                            <w:r>
+                              <w:t xml:space="preserve">CREATE OR REPLACE VIEW </w:t>
+                            </w:r>
+                            <w:proofErr w:type="spellStart"/>
+                            <w:proofErr w:type="gramStart"/>
+                            <w:r>
+                              <w:t>reporting.vw</w:t>
+                            </w:r>
+                            <w:proofErr w:type="gramEnd"/>
+                            <w:r>
+                              <w:t>_fact_sales</w:t>
+                            </w:r>
+                            <w:proofErr w:type="spellEnd"/>
+                            <w:r>
+                              <w:t xml:space="preserve"> AS</w:t>
+                            </w:r>
+                          </w:p>
+                          <w:p>
+                            <w:r>
+                              <w:t>SELECT</w:t>
+                            </w:r>
+                          </w:p>
+                          <w:p>
+                            <w:r>
+                              <w:t xml:space="preserve">    </w:t>
+                            </w:r>
+                            <w:proofErr w:type="spellStart"/>
+                            <w:proofErr w:type="gramStart"/>
+                            <w:r>
+                              <w:t>oi.order</w:t>
+                            </w:r>
+                            <w:proofErr w:type="gramEnd"/>
+                            <w:r>
+                              <w:t>_line_id</w:t>
+                            </w:r>
+                            <w:proofErr w:type="spellEnd"/>
+                            <w:r>
+                              <w:t>,</w:t>
+                            </w:r>
+                          </w:p>
+                          <w:p>
+                            <w:r>
+                              <w:t xml:space="preserve">    </w:t>
+                            </w:r>
+                            <w:proofErr w:type="spellStart"/>
+                            <w:proofErr w:type="gramStart"/>
+                            <w:r>
+                              <w:t>oi.order</w:t>
+                            </w:r>
+                            <w:proofErr w:type="gramEnd"/>
+                            <w:r>
+                              <w:t>_id</w:t>
+                            </w:r>
+                            <w:proofErr w:type="spellEnd"/>
+                            <w:r>
+                              <w:t>,</w:t>
+                            </w:r>
+                          </w:p>
+                          <w:p>
+                            <w:r>
+                              <w:t xml:space="preserve">    </w:t>
+                            </w:r>
+                            <w:proofErr w:type="spellStart"/>
+                            <w:proofErr w:type="gramStart"/>
+                            <w:r>
+                              <w:t>oi.product</w:t>
+                            </w:r>
+                            <w:proofErr w:type="gramEnd"/>
+                            <w:r>
+                              <w:t>_id</w:t>
+                            </w:r>
+                            <w:proofErr w:type="spellEnd"/>
+                            <w:r>
+                              <w:t>,</w:t>
+                            </w:r>
+                          </w:p>
+                          <w:p>
+                            <w:r>
+                              <w:t xml:space="preserve">    </w:t>
+                            </w:r>
+                            <w:proofErr w:type="spellStart"/>
+                            <w:proofErr w:type="gramStart"/>
+                            <w:r>
+                              <w:t>o.region</w:t>
+                            </w:r>
+                            <w:proofErr w:type="gramEnd"/>
+                            <w:r>
+                              <w:t>_id</w:t>
+                            </w:r>
+                            <w:proofErr w:type="spellEnd"/>
+                            <w:r>
+                              <w:t>,</w:t>
+                            </w:r>
+                          </w:p>
+                          <w:p>
+                            <w:r>
+                              <w:t xml:space="preserve">    </w:t>
+                            </w:r>
+                            <w:proofErr w:type="spellStart"/>
+                            <w:proofErr w:type="gramStart"/>
+                            <w:r>
+                              <w:t>o.date</w:t>
+                            </w:r>
+                            <w:proofErr w:type="spellEnd"/>
+                            <w:proofErr w:type="gramEnd"/>
+                            <w:r>
+                              <w:t xml:space="preserve"> AS </w:t>
+                            </w:r>
+                            <w:proofErr w:type="spellStart"/>
+                            <w:r>
+                              <w:t>order_date</w:t>
+                            </w:r>
+                            <w:proofErr w:type="spellEnd"/>
+                            <w:r>
+                              <w:t>,</w:t>
+                            </w:r>
+                          </w:p>
+                          <w:p>
+                            <w:r>
+                              <w:t xml:space="preserve">    </w:t>
+                            </w:r>
+                          </w:p>
+                        </w:txbxContent>
+                      </wps:txbx>
+                      <wps:bodyPr rot="0" spcFirstLastPara="0" vertOverflow="overflow" horzOverflow="overflow" vert="horz" wrap="square" lIns="91440" tIns="45720" rIns="91440" bIns="45720" numCol="1" spcCol="0" rtlCol="0" fromWordArt="0" anchor="t" anchorCtr="0" forceAA="0" compatLnSpc="1">
+                        <a:prstTxWarp prst="textNoShape">
+                          <a:avLst/>
+                        </a:prstTxWarp>
+                        <a:noAutofit/>
+                      </wps:bodyPr>
+                    </wps:wsp>
+                  </a:graphicData>
+                </a:graphic>
+                <wp14:sizeRelH relativeFrom="margin">
+                  <wp14:pctWidth>0</wp14:pctWidth>
+                </wp14:sizeRelH>
+                <wp14:sizeRelV relativeFrom="margin">
+                  <wp14:pctHeight>0</wp14:pctHeight>
+                </wp14:sizeRelV>
+              </wp:anchor>
+            </w:drawing>
+          </mc:Choice>
+          <mc:Fallback>
+            <w:pict>
+              <v:shape w14:anchorId="4F8E1734" id="Text Box 1" o:spid="_x0000_s1027" type="#_x0000_t202" style="position:absolute;left:0;text-align:left;margin-left:59.75pt;margin-top:.55pt;width:236.4pt;height:169.8pt;z-index:251659264;visibility:visible;mso-wrap-style:square;mso-width-percent:0;mso-height-percent:0;mso-wrap-distance-left:9pt;mso-wrap-distance-top:0;mso-wrap-distance-right:9pt;mso-wrap-distance-bottom:0;mso-position-horizontal:absolute;mso-position-horizontal-relative:text;mso-position-vertical:absolute;mso-position-vertical-relative:text;mso-width-percent:0;mso-height-percent:0;mso-width-relative:margin;mso-height-relative:margin;v-text-anchor:top" o:gfxdata="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" fillcolor="white [3201]" strokeweight=".5pt">
+                <v:textbox>
+                  <w:txbxContent>
+                    <w:p>
+                      <w:r>
+                        <w:t>CREATE SCHEMA IF NOT EXISTS reporting;</w:t>
+                      </w:r>
+                    </w:p>
+                    <w:p/>
+                    <w:p>
+                      <w:r>
+                        <w:t xml:space="preserve">CREATE OR REPLACE VIEW </w:t>
+                      </w:r>
+                      <w:proofErr w:type="spellStart"/>
+                      <w:proofErr w:type="gramStart"/>
+                      <w:r>
+                        <w:t>reporting.vw</w:t>
+                      </w:r>
+                      <w:proofErr w:type="gramEnd"/>
+                      <w:r>
+                        <w:t>_fact_sales</w:t>
+                      </w:r>
+                      <w:proofErr w:type="spellEnd"/>
+                      <w:r>
+                        <w:t xml:space="preserve"> AS</w:t>
+                      </w:r>
+                    </w:p>
+                    <w:p>
+                      <w:r>
+                        <w:t>SELECT</w:t>
+                      </w:r>
+                    </w:p>
+                    <w:p>
+                      <w:r>
+                        <w:t xml:space="preserve">    </w:t>
+                      </w:r>
+                      <w:proofErr w:type="spellStart"/>
+                      <w:proofErr w:type="gramStart"/>
+                      <w:r>
+                        <w:t>oi.order</w:t>
+                      </w:r>
+                      <w:proofErr w:type="gramEnd"/>
+                      <w:r>
+                        <w:t>_line_id</w:t>
+                      </w:r>
+                      <w:proofErr w:type="spellEnd"/>
+                      <w:r>
+                        <w:t>,</w:t>
+                      </w:r>
+                    </w:p>
+                    <w:p>
+                      <w:r>
+                        <w:t xml:space="preserve">    </w:t>
+                      </w:r>
+                      <w:proofErr w:type="spellStart"/>
+                      <w:proofErr w:type="gramStart"/>
+                      <w:r>
+                        <w:t>oi.order</w:t>
+                      </w:r>
+                      <w:proofErr w:type="gramEnd"/>
+                      <w:r>
+                        <w:t>_id</w:t>
+                      </w:r>
+                      <w:proofErr w:type="spellEnd"/>
+                      <w:r>
+                        <w:t>,</w:t>
+                      </w:r>
+                    </w:p>
+                    <w:p>
+                      <w:r>
+                        <w:t xml:space="preserve">    </w:t>
+                      </w:r>
+                      <w:proofErr w:type="spellStart"/>
+                      <w:proofErr w:type="gramStart"/>
+                      <w:r>
+                        <w:t>oi.product</w:t>
+                      </w:r>
+                      <w:proofErr w:type="gramEnd"/>
+                      <w:r>
+                        <w:t>_id</w:t>
+                      </w:r>
+                      <w:proofErr w:type="spellEnd"/>
+                      <w:r>
+                        <w:t>,</w:t>
+                      </w:r>
+                    </w:p>
+                    <w:p>
+                      <w:r>
+                        <w:t xml:space="preserve">    </w:t>
+                      </w:r>
+                      <w:proofErr w:type="spellStart"/>
+                      <w:proofErr w:type="gramStart"/>
+                      <w:r>
+                        <w:t>o.region</w:t>
+                      </w:r>
+                      <w:proofErr w:type="gramEnd"/>
+                      <w:r>
+                        <w:t>_id</w:t>
+                      </w:r>
+                      <w:proofErr w:type="spellEnd"/>
+                      <w:r>
+                        <w:t>,</w:t>
+                      </w:r>
+                    </w:p>
+                    <w:p>
+                      <w:r>
+                        <w:t xml:space="preserve">    </w:t>
+                      </w:r>
+                      <w:proofErr w:type="spellStart"/>
+                      <w:proofErr w:type="gramStart"/>
+                      <w:r>
+                        <w:t>o.date</w:t>
+                      </w:r>
+                      <w:proofErr w:type="spellEnd"/>
+                      <w:proofErr w:type="gramEnd"/>
+                      <w:r>
+                        <w:t xml:space="preserve"> AS </w:t>
+                      </w:r>
+                      <w:proofErr w:type="spellStart"/>
+                      <w:r>
+                        <w:t>order_date</w:t>
+                      </w:r>
+                      <w:proofErr w:type="spellEnd"/>
+                      <w:r>
+                        <w:t>,</w:t>
+                      </w:r>
+                    </w:p>
+                    <w:p>
+                      <w:r>
+                        <w:t xml:space="preserve">    </w:t>
+                      </w:r>
+                    </w:p>
+                  </w:txbxContent>
+                </v:textbox>
+              </v:shape>
+            </w:pict>
+          </mc:Fallback>
+        </mc:AlternateContent>
+      </w:r>
+      <w:r>
+        <w:br w:type="page"/>
+      </w:r>
+      <w:r>
+        <w:lastRenderedPageBreak/>
+        <w:t>DIMENSION views</w:t>
+      </w:r>
+    </w:p>
+    <w:p>
+      <w:pPr>
+        <w:spacing w:after="200" w:line="276" w:lineRule="auto"/>
+        <w:ind w:left="360"/>
+      </w:pPr>
+      <w:r>
+        <w:t>Product Dimension                                                                                      Region Dimension</w:t>
+      </w:r>
+    </w:p>
+    <w:p>
+      <w:pPr>
+        <w:spacing w:after="200" w:line="276" w:lineRule="auto"/>
+        <w:ind w:left="360"/>
+      </w:pPr>
+      <w:r>
+        <w:rPr>
+          <w:noProof/>
+        </w:rPr>
+        <mc:AlternateContent>
+          <mc:Choice Requires="wps">
+            <w:drawing>
+              <wp:inline distT="0" distB="0" distL="0" distR="0" wp14:anchorId="70257AC6" wp14:editId="0B406B35">
+                <wp:extent cx="2796540" cy="1897380"/>
+                <wp:effectExtent l="0" t="0" r="22860" b="26670"/>
+                <wp:docPr id="1721366002" name="Text Box 3"/>
+                <wp:cNvGraphicFramePr/>
+                <a:graphic xmlns:a="http://schemas.openxmlformats.org/drawingml/2006/main">
+                  <a:graphicData uri="http://schemas.microsoft.com/office/word/2010/wordprocessingShape">
+                    <wps:wsp>
+                      <wps:cNvSpPr txBox="1"/>
+                      <wps:spPr>
+                        <a:xfrm>
+                          <a:off x="0" y="0"/>
+                          <a:ext cx="2796540" cy="1897380"/>
+                        </a:xfrm>
+                        <a:prstGeom prst="rect">
+                          <a:avLst/>
+                        </a:prstGeom>
+                        <a:solidFill>
+                          <a:schemeClr val="lt1"/>
+                        </a:solidFill>
+                        <a:ln w="6350">
+                          <a:solidFill>
+                            <a:prstClr val="black"/>
+                          </a:solidFill>
+                        </a:ln>
+                      </wps:spPr>
+                      <wps:txbx>
+                        <w:txbxContent>
+                          <w:p>
+                            <w:r>
+                              <w:t xml:space="preserve">CREATE OR REPLACE VIEW </w:t>
+                            </w:r>
+                            <w:proofErr w:type="spellStart"/>
+                            <w:proofErr w:type="gramStart"/>
+                            <w:r>
+                              <w:t>reporting.vw</w:t>
+                            </w:r>
+                            <w:proofErr w:type="gramEnd"/>
+                            <w:r>
+                              <w:t>_dim_product</w:t>
+                            </w:r>
+                            <w:proofErr w:type="spellEnd"/>
+                            <w:r>
+                              <w:t xml:space="preserve"> AS</w:t>
+                            </w:r>
+                          </w:p>
+                          <w:p>
+                            <w:r>
+                              <w:t>SELECT</w:t>
+                            </w:r>
+                          </w:p>
+                          <w:p>
+                            <w:r>
+                              <w:t xml:space="preserve">    id AS </w:t>
+                            </w:r>
+                            <w:proofErr w:type="spellStart"/>
+                            <w:r>
+                              <w:t>product_id</w:t>
+                            </w:r>
+                            <w:proofErr w:type="spellEnd"/>
+                            <w:r>
+                              <w:t>,</w:t>
+                            </w:r>
+                          </w:p>
+                          <w:p>
+                            <w:r>
+                              <w:t xml:space="preserve">    name AS </w:t>
+                            </w:r>
+                            <w:proofErr w:type="spellStart"/>
+                            <w:r>
+                              <w:t>product_name</w:t>
+                            </w:r>
+                            <w:proofErr w:type="spellEnd"/>
+                            <w:r>
+                              <w:t>,</w:t>
+                            </w:r>
+                          </w:p>
+                          <w:p>
+                            <w:r>
+                              <w:t xml:space="preserve">    category,</w:t>
+                            </w:r>
+                          </w:p>
+                          <w:p>
+                            <w:r>
+                              <w:t xml:space="preserve">    subcategory</w:t>
+                            </w:r>
+                          </w:p>
+                          <w:p>
+                            <w:r>
+                              <w:t>FROM products;</w:t>
+                            </w:r>
+                          </w:p>
+                        </w:txbxContent>
+                      </wps:txbx>
+                      <wps:bodyPr rot="0" spcFirstLastPara="0" vertOverflow="overflow" horzOverflow="overflow" vert="horz" wrap="square" lIns="91440" tIns="45720" rIns="91440" bIns="45720" numCol="1" spcCol="0" rtlCol="0" fromWordArt="0" anchor="t" anchorCtr="0" forceAA="0" compatLnSpc="1">
+                        <a:prstTxWarp prst="textNoShape">
+                          <a:avLst/>
+                        </a:prstTxWarp>
+                        <a:noAutofit/>
+                      </wps:bodyPr>
+                    </wps:wsp>
+                  </a:graphicData>
+                </a:graphic>
+              </wp:inline>
+            </w:drawing>
+          </mc:Choice>
+          <mc:Fallback>
+            <w:pict>
+              <v:shape w14:anchorId="70257AC6" id="Text Box 3" o:spid="_x0000_s1028" type="#_x0000_t202" style="width:220.2pt;height:149.4pt;visibility:visible;mso-wrap-style:square;mso-left-percent:-10001;mso-top-percent:-10001;mso-position-horizontal:absolute;mso-position-horizontal-relative:char;mso-position-vertical:absolute;mso-position-vertical-relative:line;mso-left-percent:-10001;mso-top-percent:-10001;v-text-anchor:top" o:gfxdata="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" fillcolor="white [3201]" strokeweight=".5pt">
+                <v:textbox>
+                  <w:txbxContent>
+                    <w:p>
+                      <w:r>
+                        <w:t xml:space="preserve">CREATE OR REPLACE VIEW </w:t>
+                      </w:r>
+                      <w:proofErr w:type="spellStart"/>
+                      <w:proofErr w:type="gramStart"/>
+                      <w:r>
+                        <w:t>reporting.vw</w:t>
+                      </w:r>
+                      <w:proofErr w:type="gramEnd"/>
+                      <w:r>
+                        <w:t>_dim_product</w:t>
+                      </w:r>
+                      <w:proofErr w:type="spellEnd"/>
+                      <w:r>
+                        <w:t xml:space="preserve"> AS</w:t>
+                      </w:r>
+                    </w:p>
+                    <w:p>
+                      <w:r>
+                        <w:t>SELECT</w:t>
+                      </w:r>
+                    </w:p>
+                    <w:p>
+                      <w:r>
+                        <w:t xml:space="preserve">    id AS </w:t>
+                      </w:r>
+                      <w:proofErr w:type="spellStart"/>
+                      <w:r>
+                        <w:t>product_id</w:t>
+                      </w:r>
+                      <w:proofErr w:type="spellEnd"/>
+                      <w:r>
+                        <w:t>,</w:t>
+                      </w:r>
+                    </w:p>
+                    <w:p>
+                      <w:r>
+                        <w:t xml:space="preserve">    name AS </w:t>
+                      </w:r>
+                      <w:proofErr w:type="spellStart"/>
+                      <w:r>
+                        <w:t>product_name</w:t>
+                      </w:r>
+                      <w:proofErr w:type="spellEnd"/>
+                      <w:r>
+                        <w:t>,</w:t>
+                      </w:r>
+                    </w:p>
+                    <w:p>
+                      <w:r>
+                        <w:t xml:space="preserve">    category,</w:t>
+                      </w:r>
+                    </w:p>
+                    <w:p>
+                      <w:r>
+                        <w:t xml:space="preserve">    subcategory</w:t>
+                      </w:r>
+                    </w:p>
+                    <w:p>
+                      <w:r>
+                        <w:t>FROM products;</w:t>
+                      </w:r>
+                    </w:p>
+                  </w:txbxContent>
+                </v:textbox>
+                <w10:anchorlock/>
+              </v:shape>
+            </w:pict>
+          </mc:Fallback>
+        </mc:AlternateContent>
+      </w:r>
+      <w:r>
+        <w:rPr>
+          <w:noProof/>
+        </w:rPr>
+        <mc:AlternateContent>
+          <mc:Choice Requires="wps">
+            <w:drawing>
+              <wp:inline distT="0" distB="0" distL="0" distR="0" wp14:anchorId="552D931B" wp14:editId="28FD46CB">
+                <wp:extent cx="2796540" cy="1897380"/>
+                <wp:effectExtent l="0" t="0" r="22860" b="26670"/>
+                <wp:docPr id="1690973620" name="Text Box 3"/>
+                <wp:cNvGraphicFramePr/>
+                <a:graphic xmlns:a="http://schemas.openxmlformats.org/drawingml/2006/main">
+                  <a:graphicData uri="http://schemas.microsoft.com/office/word/2010/wordprocessingShape">
+                    <wps:wsp>
+                      <wps:cNvSpPr txBox="1"/>
+                      <wps:spPr>
+                        <a:xfrm>
+                          <a:off x="0" y="0"/>
+                          <a:ext cx="2796540" cy="1897380"/>
+                        </a:xfrm>
+                        <a:prstGeom prst="rect">
+                          <a:avLst/>
+                        </a:prstGeom>
+                        <a:solidFill>
+                          <a:schemeClr val="lt1"/>
+                        </a:solidFill>
+                        <a:ln w="6350">
+                          <a:solidFill>
+                            <a:prstClr val="black"/>
+                          </a:solidFill>
+                        </a:ln>
+                      </wps:spPr>
+                      <wps:txbx>
+                        <w:txbxContent>
+                          <w:p>
+                            <w:r>
+                              <w:t xml:space="preserve">CREATE OR REPLACE VIEW </w:t>
+                            </w:r>
+                            <w:proofErr w:type="spellStart"/>
+                            <w:proofErr w:type="gramStart"/>
+                            <w:r>
+                              <w:t>reporting.vw</w:t>
+                            </w:r>
+                            <w:proofErr w:type="gramEnd"/>
+                            <w:r>
+                              <w:t>_dim_product</w:t>
+                            </w:r>
+                            <w:proofErr w:type="spellEnd"/>
+                            <w:r>
+                              <w:t xml:space="preserve"> AS</w:t>
+                            </w:r>
+                          </w:p>
+                          <w:p>
+                            <w:r>
+                              <w:t>SELECT</w:t>
+                            </w:r>
+                          </w:p>
+                          <w:p>
+                            <w:r>
+                              <w:t xml:space="preserve">    id AS </w:t>
+                            </w:r>
+                            <w:proofErr w:type="spellStart"/>
+                            <w:r>
+                              <w:t>product_id</w:t>
+                            </w:r>
+                            <w:proofErr w:type="spellEnd"/>
+                            <w:r>
+                              <w:t>,</w:t>
+                            </w:r>
+                          </w:p>
+                          <w:p>
+                            <w:r>
+                              <w:t xml:space="preserve">    name AS </w:t>
+                            </w:r>
+                            <w:proofErr w:type="spellStart"/>
+                            <w:r>
+                              <w:t>product_name</w:t>
+                            </w:r>
+                            <w:proofErr w:type="spellEnd"/>
+                            <w:r>
+                              <w:t>,</w:t>
+                            </w:r>
+                          </w:p>
+                          <w:p>
+                            <w:r>
+                              <w:t xml:space="preserve">    category,</w:t>
+                            </w:r>
+                          </w:p>
+                          <w:p>
+                            <w:r>
+                              <w:t xml:space="preserve">    subcategory</w:t>
+                            </w:r>
+                          </w:p>
+                          <w:p>
+                            <w:r>
+                              <w:t>FROM products;</w:t>
+                            </w:r>
+                          </w:p>
+                        </w:txbxContent>
+                      </wps:txbx>
+                      <wps:bodyPr rot="0" spcFirstLastPara="0" vertOverflow="overflow" horzOverflow="overflow" vert="horz" wrap="square" lIns="91440" tIns="45720" rIns="91440" bIns="45720" numCol="1" spcCol="0" rtlCol="0" fromWordArt="0" anchor="t" anchorCtr="0" forceAA="0" compatLnSpc="1">
+                        <a:prstTxWarp prst="textNoShape">
+                          <a:avLst/>
+                        </a:prstTxWarp>
+                        <a:noAutofit/>
+                      </wps:bodyPr>
+                    </wps:wsp>
+                  </a:graphicData>
+                </a:graphic>
+              </wp:inline>
+            </w:drawing>
+          </mc:Choice>
+          <mc:Fallback>
+            <w:pict>
+              <v:shape w14:anchorId="552D931B" id="_x0000_s1029" type="#_x0000_t202" style="width:220.2pt;height:149.4pt;visibility:visible;mso-wrap-style:square;mso-left-percent:-10001;mso-top-percent:-10001;mso-position-horizontal:absolute;mso-position-horizontal-relative:char;mso-position-vertical:absolute;mso-position-vertical-relative:line;mso-left-percent:-10001;mso-top-percent:-10001;v-text-anchor:top" o:gfxdata="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" fillcolor="white [3201]" strokeweight=".5pt">
+                <v:textbox>
+                  <w:txbxContent>
+                    <w:p>
+                      <w:r>
+                        <w:t xml:space="preserve">CREATE OR REPLACE VIEW </w:t>
+                      </w:r>
+                      <w:proofErr w:type="spellStart"/>
+                      <w:proofErr w:type="gramStart"/>
+                      <w:r>
+                        <w:t>reporting.vw</w:t>
+                      </w:r>
+                      <w:proofErr w:type="gramEnd"/>
+                      <w:r>
+                        <w:t>_dim_product</w:t>
+                      </w:r>
+                      <w:proofErr w:type="spellEnd"/>
+                      <w:r>
+                        <w:t xml:space="preserve"> AS</w:t>
+                      </w:r>
+                    </w:p>
+                    <w:p>
+                      <w:r>
+                        <w:t>SELECT</w:t>
+                      </w:r>
+                    </w:p>
+                    <w:p>
+                      <w:r>
+                        <w:t xml:space="preserve">    id AS </w:t>
+                      </w:r>
+                      <w:proofErr w:type="spellStart"/>
+                      <w:r>
+                        <w:t>product_id</w:t>
+                      </w:r>
+                      <w:proofErr w:type="spellEnd"/>
+                      <w:r>
+                        <w:t>,</w:t>
+                      </w:r>
+                    </w:p>
+                    <w:p>
+                      <w:r>
+                        <w:t xml:space="preserve">    name AS </w:t>
+                      </w:r>
+                      <w:proofErr w:type="spellStart"/>
+                      <w:r>
+                        <w:t>product_name</w:t>
+                      </w:r>
+                      <w:proofErr w:type="spellEnd"/>
+                      <w:r>
+                        <w:t>,</w:t>
+                      </w:r>
+                    </w:p>
+                    <w:p>
+                      <w:r>
+                        <w:t xml:space="preserve">    category,</w:t>
+                      </w:r>
+                    </w:p>
+                    <w:p>
+                      <w:r>
+                        <w:t xml:space="preserve">    subcategory</w:t>
+                      </w:r>
+                    </w:p>
+                    <w:p>
+                      <w:r>
+                        <w:t>FROM products;</w:t>
+                      </w:r>
+                    </w:p>
+                  </w:txbxContent>
+                </v:textbox>
+                <w10:anchorlock/>
+              </v:shape>
+            </w:pict>
+          </mc:Fallback>
+        </mc:AlternateContent>
+      </w:r>
+    </w:p>
+    <w:p>
+      <w:pPr>
+        <w:spacing w:after="200" w:line="276" w:lineRule="auto"/>
+        <w:ind w:left="360"/>
+      </w:pPr>
+      <w:r>
+        <w:t>Customer Dimensions</w:t>
+      </w:r>
+    </w:p>
+    <w:p>
+      <w:pPr>
+        <w:spacing w:after="200" w:line="276" w:lineRule="auto"/>
+        <w:ind w:left="360"/>
+      </w:pPr>
+      <w:r>
+        <w:rPr>
+          <w:noProof/>
+        </w:rPr>
+        <mc:AlternateContent>
+          <mc:Choice Requires="wps">
+            <w:drawing>
+              <wp:inline distT="0" distB="0" distL="0" distR="0" wp14:anchorId="6DA0F45F" wp14:editId="52CBC2BE">
+                <wp:extent cx="2796540" cy="1897380"/>
+                <wp:effectExtent l="0" t="0" r="22860" b="26670"/>
+                <wp:docPr id="1735478248" name="Text Box 3"/>
+                <wp:cNvGraphicFramePr/>
+                <a:graphic xmlns:a="http://schemas.openxmlformats.org/drawingml/2006/main">
+                  <a:graphicData uri="http://schemas.microsoft.com/office/word/2010/wordprocessingShape">
+                    <wps:wsp>
+                      <wps:cNvSpPr txBox="1"/>
+                      <wps:spPr>
+                        <a:xfrm>
+                          <a:off x="0" y="0"/>
+                          <a:ext cx="2796540" cy="1897380"/>
+                        </a:xfrm>
+                        <a:prstGeom prst="rect">
+                          <a:avLst/>
+                        </a:prstGeom>
+                        <a:solidFill>
+                          <a:schemeClr val="lt1"/>
+                        </a:solidFill>
+                        <a:ln w="6350">
+                          <a:solidFill>
+                            <a:prstClr val="black"/>
+                          </a:solidFill>
+                        </a:ln>
+                      </wps:spPr>
+                      <wps:txbx>
+                        <w:txbxContent>
+                          <w:p>
+                            <w:r>
+                              <w:t xml:space="preserve">CREATE OR REPLACE VIEW </w:t>
+                            </w:r>
+                            <w:proofErr w:type="spellStart"/>
+                            <w:proofErr w:type="gramStart"/>
+                            <w:r>
+                              <w:t>reporting.vw</w:t>
+                            </w:r>
+                            <w:proofErr w:type="gramEnd"/>
+                            <w:r>
+                              <w:t>_dim_customer</w:t>
+                            </w:r>
+                            <w:proofErr w:type="spellEnd"/>
+                            <w:r>
+                              <w:t xml:space="preserve"> AS</w:t>
+                            </w:r>
+                          </w:p>
+                          <w:p>
+                            <w:r>
+                              <w:t>SELECT</w:t>
+                            </w:r>
+                          </w:p>
+                          <w:p>
+                            <w:r>
+                              <w:t xml:space="preserve">    id AS </w:t>
+                            </w:r>
+                            <w:proofErr w:type="spellStart"/>
+                            <w:r>
+                              <w:t>customer_id</w:t>
+                            </w:r>
+                            <w:proofErr w:type="spellEnd"/>
+                            <w:r>
+                              <w:t>,</w:t>
+                            </w:r>
+                          </w:p>
+                          <w:p>
+                            <w:r>
+                              <w:t xml:space="preserve">    city,</w:t>
+                            </w:r>
+                          </w:p>
+                          <w:p>
+                            <w:r>
+                              <w:t xml:space="preserve">    </w:t>
+                            </w:r>
+                            <w:proofErr w:type="spellStart"/>
+                            <w:r>
+                              <w:t>region_id</w:t>
+                            </w:r>
+                            <w:proofErr w:type="spellEnd"/>
+                          </w:p>
+                          <w:p>
+                            <w:r>
+                              <w:t>FROM customers;</w:t>
+                            </w:r>
+                          </w:p>
+                        </w:txbxContent>
+                      </wps:txbx>
+                      <wps:bodyPr rot="0" spcFirstLastPara="0" vertOverflow="overflow" horzOverflow="overflow" vert="horz" wrap="square" lIns="91440" tIns="45720" rIns="91440" bIns="45720" numCol="1" spcCol="0" rtlCol="0" fromWordArt="0" anchor="t" anchorCtr="0" forceAA="0" compatLnSpc="1">
+                        <a:prstTxWarp prst="textNoShape">
+                          <a:avLst/>
+                        </a:prstTxWarp>
+                        <a:noAutofit/>
+                      </wps:bodyPr>
+                    </wps:wsp>
+                  </a:graphicData>
+                </a:graphic>
+              </wp:inline>
+            </w:drawing>
+          </mc:Choice>
+          <mc:Fallback>
+            <w:pict>
+              <v:shape w14:anchorId="6DA0F45F" id="_x0000_s1030" type="#_x0000_t202" style="width:220.2pt;height:149.4pt;visibility:visible;mso-wrap-style:square;mso-left-percent:-10001;mso-top-percent:-10001;mso-position-horizontal:absolute;mso-position-horizontal-relative:char;mso-position-vertical:absolute;mso-position-vertical-relative:line;mso-left-percent:-10001;mso-top-percent:-10001;v-text-anchor:top" o:gfxdata="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" fillcolor="white [3201]" strokeweight=".5pt">
+                <v:textbox>
+                  <w:txbxContent>
+                    <w:p>
+                      <w:r>
+                        <w:t xml:space="preserve">CREATE OR REPLACE VIEW </w:t>
+                      </w:r>
+                      <w:proofErr w:type="spellStart"/>
+                      <w:proofErr w:type="gramStart"/>
+                      <w:r>
+                        <w:t>reporting.vw</w:t>
+                      </w:r>
+                      <w:proofErr w:type="gramEnd"/>
+                      <w:r>
+                        <w:t>_dim_customer</w:t>
+                      </w:r>
+                      <w:proofErr w:type="spellEnd"/>
+                      <w:r>
+                        <w:t xml:space="preserve"> AS</w:t>
+                      </w:r>
+                    </w:p>
+                    <w:p>
+                      <w:r>
+                        <w:t>SELECT</w:t>
+                      </w:r>
+                    </w:p>
+                    <w:p>
+                      <w:r>
+                        <w:t xml:space="preserve">    id AS </w:t>
+                      </w:r>
+                      <w:proofErr w:type="spellStart"/>
+                      <w:r>
+                        <w:t>customer_id</w:t>
+                      </w:r>
+                      <w:proofErr w:type="spellEnd"/>
+                      <w:r>
+                        <w:t>,</w:t>
+                      </w:r>
+                    </w:p>
+                    <w:p>
+                      <w:r>
+                        <w:t xml:space="preserve">    city,</w:t>
+                      </w:r>
+                    </w:p>
+                    <w:p>
+                      <w:r>
+                        <w:t xml:space="preserve">    </w:t>
+                      </w:r>
+                      <w:proofErr w:type="spellStart"/>
+                      <w:r>
+                        <w:t>region_id</w:t>
+                      </w:r>
+                      <w:proofErr w:type="spellEnd"/>
+                    </w:p>
+                    <w:p>
+                      <w:r>
+                        <w:t>FROM customers;</w:t>
+                      </w:r>
+                    </w:p>
+                  </w:txbxContent>
+                </v:textbox>
+                <w10:anchorlock/>
+              </v:shape>
+            </w:pict>
+          </mc:Fallback>
+        </mc:AlternateContent>
+      </w:r>
+    </w:p>
+    <w:p>
+      <w:pPr>
         <w:pStyle w:val="Title"/>
       </w:pPr>
       <w:r>
-        <w:lastRenderedPageBreak/>
         <w:t>Phase 3 — Data Modeling</w:t>
       </w:r>
     </w:p>
@@ -20924,6 +23481,7 @@
           <w:b/>
           <w:color w:val="2F75B5"/>
         </w:rPr>
+        <w:lastRenderedPageBreak/>
         <w:t xml:space="preserve">☐  </w:t>
       </w:r>
       <w:r>
@@ -21253,7 +23811,6 @@
         <w:pStyle w:val="Heading2"/>
       </w:pPr>
       <w:r>
-        <w:lastRenderedPageBreak/>
         <w:t>Phase deliverable pack</w:t>
       </w:r>
     </w:p>
@@ -28314,8 +30871,8 @@
       </w:pPr>
     </w:p>
     <w:sectPr>
-      <w:headerReference w:type="default" r:id="rId13"/>
-      <w:footerReference w:type="default" r:id="rId14"/>
+      <w:headerReference w:type="default" r:id="rId15"/>
+      <w:footerReference w:type="default" r:id="rId16"/>
       <w:pgSz w:w="12240" w:h="15840"/>
       <w:pgMar w:top="1008" w:right="1037" w:bottom="936" w:left="1037" w:header="432" w:footer="432" w:gutter="0"/>
       <w:cols w:space="720"/>
@@ -28823,6 +31380,247 @@
     </w:lvl>
   </w:abstractNum>
   <w:abstractNum w:abstractNumId="11" w15:restartNumberingAfterBreak="0">
+    <w:nsid w:val="29A277C8"/>
+    <w:multiLevelType w:val="multilevel"/>
+    <w:tmpl w:val="FEA21CD2"/>
+    <w:lvl w:ilvl="0">
+      <w:start w:val="1"/>
+      <w:numFmt w:val="bullet"/>
+      <w:lvlText w:val=""/>
+      <w:lvlJc w:val="left"/>
+      <w:pPr>
+        <w:tabs>
+          <w:tab w:val="num" w:pos="720"/>
+        </w:tabs>
+        <w:ind w:left="720" w:hanging="360"/>
+      </w:pPr>
+      <w:rPr>
+        <w:rFonts w:ascii="Symbol" w:hAnsi="Symbol" w:hint="default"/>
+        <w:sz w:val="20"/>
+      </w:rPr>
+    </w:lvl>
+    <w:lvl w:ilvl="1" w:tentative="1">
+      <w:start w:val="1"/>
+      <w:numFmt w:val="bullet"/>
+      <w:lvlText w:val="o"/>
+      <w:lvlJc w:val="left"/>
+      <w:pPr>
+        <w:tabs>
+          <w:tab w:val="num" w:pos="1440"/>
+        </w:tabs>
+        <w:ind w:left="1440" w:hanging="360"/>
+      </w:pPr>
+      <w:rPr>
+        <w:rFonts w:ascii="Courier New" w:hAnsi="Courier New" w:hint="default"/>
+        <w:sz w:val="20"/>
+      </w:rPr>
+    </w:lvl>
+    <w:lvl w:ilvl="2" w:tentative="1">
+      <w:start w:val="1"/>
+      <w:numFmt w:val="bullet"/>
+      <w:lvlText w:val=""/>
+      <w:lvlJc w:val="left"/>
+      <w:pPr>
+        <w:tabs>
+          <w:tab w:val="num" w:pos="2160"/>
+        </w:tabs>
+        <w:ind w:left="2160" w:hanging="360"/>
+      </w:pPr>
+      <w:rPr>
+        <w:rFonts w:ascii="Wingdings" w:hAnsi="Wingdings" w:hint="default"/>
+        <w:sz w:val="20"/>
+      </w:rPr>
+    </w:lvl>
+    <w:lvl w:ilvl="3" w:tentative="1">
+      <w:start w:val="1"/>
+      <w:numFmt w:val="bullet"/>
+      <w:lvlText w:val=""/>
+      <w:lvlJc w:val="left"/>
+      <w:pPr>
+        <w:tabs>
+          <w:tab w:val="num" w:pos="2880"/>
+        </w:tabs>
+        <w:ind w:left="2880" w:hanging="360"/>
+      </w:pPr>
+      <w:rPr>
+        <w:rFonts w:ascii="Wingdings" w:hAnsi="Wingdings" w:hint="default"/>
+        <w:sz w:val="20"/>
+      </w:rPr>
+    </w:lvl>
+    <w:lvl w:ilvl="4" w:tentative="1">
+      <w:start w:val="1"/>
+      <w:numFmt w:val="bullet"/>
+      <w:lvlText w:val=""/>
+      <w:lvlJc w:val="left"/>
+      <w:pPr>
+        <w:tabs>
+          <w:tab w:val="num" w:pos="3600"/>
+        </w:tabs>
+        <w:ind w:left="3600" w:hanging="360"/>
+      </w:pPr>
+      <w:rPr>
+        <w:rFonts w:ascii="Wingdings" w:hAnsi="Wingdings" w:hint="default"/>
+        <w:sz w:val="20"/>
+      </w:rPr>
+    </w:lvl>
+    <w:lvl w:ilvl="5" w:tentative="1">
+      <w:start w:val="1"/>
+      <w:numFmt w:val="bullet"/>
+      <w:lvlText w:val=""/>
+      <w:lvlJc w:val="left"/>
+      <w:pPr>
+        <w:tabs>
+          <w:tab w:val="num" w:pos="4320"/>
+        </w:tabs>
+        <w:ind w:left="4320" w:hanging="360"/>
+      </w:pPr>
+      <w:rPr>
+        <w:rFonts w:ascii="Wingdings" w:hAnsi="Wingdings" w:hint="default"/>
+        <w:sz w:val="20"/>
+      </w:rPr>
+    </w:lvl>
+    <w:lvl w:ilvl="6" w:tentative="1">
+      <w:start w:val="1"/>
+      <w:numFmt w:val="bullet"/>
+      <w:lvlText w:val=""/>
+      <w:lvlJc w:val="left"/>
+      <w:pPr>
+        <w:tabs>
+          <w:tab w:val="num" w:pos="5040"/>
+        </w:tabs>
+        <w:ind w:left="5040" w:hanging="360"/>
+      </w:pPr>
+      <w:rPr>
+        <w:rFonts w:ascii="Wingdings" w:hAnsi="Wingdings" w:hint="default"/>
+        <w:sz w:val="20"/>
+      </w:rPr>
+    </w:lvl>
+    <w:lvl w:ilvl="7" w:tentative="1">
+      <w:start w:val="1"/>
+      <w:numFmt w:val="bullet"/>
+      <w:lvlText w:val=""/>
+      <w:lvlJc w:val="left"/>
+      <w:pPr>
+        <w:tabs>
+          <w:tab w:val="num" w:pos="5760"/>
+        </w:tabs>
+        <w:ind w:left="5760" w:hanging="360"/>
+      </w:pPr>
+      <w:rPr>
+        <w:rFonts w:ascii="Wingdings" w:hAnsi="Wingdings" w:hint="default"/>
+        <w:sz w:val="20"/>
+      </w:rPr>
+    </w:lvl>
+    <w:lvl w:ilvl="8" w:tentative="1">
+      <w:start w:val="1"/>
+      <w:numFmt w:val="bullet"/>
+      <w:lvlText w:val=""/>
+      <w:lvlJc w:val="left"/>
+      <w:pPr>
+        <w:tabs>
+          <w:tab w:val="num" w:pos="6480"/>
+        </w:tabs>
+        <w:ind w:left="6480" w:hanging="360"/>
+      </w:pPr>
+      <w:rPr>
+        <w:rFonts w:ascii="Wingdings" w:hAnsi="Wingdings" w:hint="default"/>
+        <w:sz w:val="20"/>
+      </w:rPr>
+    </w:lvl>
+  </w:abstractNum>
+  <w:abstractNum w:abstractNumId="12" w15:restartNumberingAfterBreak="0">
+    <w:nsid w:val="4C757349"/>
+    <w:multiLevelType w:val="hybridMultilevel"/>
+    <w:tmpl w:val="2E06E85E"/>
+    <w:lvl w:ilvl="0" w:tplc="33FEF3F8">
+      <w:start w:val="1"/>
+      <w:numFmt w:val="decimal"/>
+      <w:lvlText w:val="%1."/>
+      <w:lvlJc w:val="left"/>
+      <w:pPr>
+        <w:ind w:left="1080" w:hanging="720"/>
+      </w:pPr>
+      <w:rPr>
+        <w:rFonts w:ascii="Aptos" w:eastAsiaTheme="minorEastAsia" w:hAnsi="Aptos" w:cstheme="minorBidi" w:hint="default"/>
+        <w:b w:val="0"/>
+        <w:color w:val="222222"/>
+        <w:sz w:val="19"/>
+      </w:rPr>
+    </w:lvl>
+    <w:lvl w:ilvl="1" w:tplc="38090019" w:tentative="1">
+      <w:start w:val="1"/>
+      <w:numFmt w:val="lowerLetter"/>
+      <w:lvlText w:val="%2."/>
+      <w:lvlJc w:val="left"/>
+      <w:pPr>
+        <w:ind w:left="1440" w:hanging="360"/>
+      </w:pPr>
+    </w:lvl>
+    <w:lvl w:ilvl="2" w:tplc="3809001B" w:tentative="1">
+      <w:start w:val="1"/>
+      <w:numFmt w:val="lowerRoman"/>
+      <w:lvlText w:val="%3."/>
+      <w:lvlJc w:val="right"/>
+      <w:pPr>
+        <w:ind w:left="2160" w:hanging="180"/>
+      </w:pPr>
+    </w:lvl>
+    <w:lvl w:ilvl="3" w:tplc="3809000F" w:tentative="1">
+      <w:start w:val="1"/>
+      <w:numFmt w:val="decimal"/>
+      <w:lvlText w:val="%4."/>
+      <w:lvlJc w:val="left"/>
+      <w:pPr>
+        <w:ind w:left="2880" w:hanging="360"/>
+      </w:pPr>
+    </w:lvl>
+    <w:lvl w:ilvl="4" w:tplc="38090019" w:tentative="1">
+      <w:start w:val="1"/>
+      <w:numFmt w:val="lowerLetter"/>
+      <w:lvlText w:val="%5."/>
+      <w:lvlJc w:val="left"/>
+      <w:pPr>
+        <w:ind w:left="3600" w:hanging="360"/>
+      </w:pPr>
+    </w:lvl>
+    <w:lvl w:ilvl="5" w:tplc="3809001B" w:tentative="1">
+      <w:start w:val="1"/>
+      <w:numFmt w:val="lowerRoman"/>
+      <w:lvlText w:val="%6."/>
+      <w:lvlJc w:val="right"/>
+      <w:pPr>
+        <w:ind w:left="4320" w:hanging="180"/>
+      </w:pPr>
+    </w:lvl>
+    <w:lvl w:ilvl="6" w:tplc="3809000F" w:tentative="1">
+      <w:start w:val="1"/>
+      <w:numFmt w:val="decimal"/>
+      <w:lvlText w:val="%7."/>
+      <w:lvlJc w:val="left"/>
+      <w:pPr>
+        <w:ind w:left="5040" w:hanging="360"/>
+      </w:pPr>
+    </w:lvl>
+    <w:lvl w:ilvl="7" w:tplc="38090019" w:tentative="1">
+      <w:start w:val="1"/>
+      <w:numFmt w:val="lowerLetter"/>
+      <w:lvlText w:val="%8."/>
+      <w:lvlJc w:val="left"/>
+      <w:pPr>
+        <w:ind w:left="5760" w:hanging="360"/>
+      </w:pPr>
+    </w:lvl>
+    <w:lvl w:ilvl="8" w:tplc="3809001B" w:tentative="1">
+      <w:start w:val="1"/>
+      <w:numFmt w:val="lowerRoman"/>
+      <w:lvlText w:val="%9."/>
+      <w:lvlJc w:val="right"/>
+      <w:pPr>
+        <w:ind w:left="6480" w:hanging="180"/>
+      </w:pPr>
+    </w:lvl>
+  </w:abstractNum>
+  <w:abstractNum w:abstractNumId="13" w15:restartNumberingAfterBreak="0">
     <w:nsid w:val="5C137D5E"/>
     <w:multiLevelType w:val="hybridMultilevel"/>
     <w:tmpl w:val="FA52ABF2"/>
@@ -28935,7 +31733,7 @@
       </w:rPr>
     </w:lvl>
   </w:abstractNum>
-  <w:abstractNum w:abstractNumId="12" w15:restartNumberingAfterBreak="0">
+  <w:abstractNum w:abstractNumId="14" w15:restartNumberingAfterBreak="0">
     <w:nsid w:val="6BCC3755"/>
     <w:multiLevelType w:val="hybridMultilevel"/>
     <w:tmpl w:val="0F7C6754"/>
@@ -29048,7 +31846,7 @@
       </w:rPr>
     </w:lvl>
   </w:abstractNum>
-  <w:abstractNum w:abstractNumId="13" w15:restartNumberingAfterBreak="0">
+  <w:abstractNum w:abstractNumId="15" w15:restartNumberingAfterBreak="0">
     <w:nsid w:val="71075CF5"/>
     <w:multiLevelType w:val="hybridMultilevel"/>
     <w:tmpl w:val="5230504A"/>
@@ -29164,7 +31962,7 @@
       </w:rPr>
     </w:lvl>
   </w:abstractNum>
-  <w:abstractNum w:abstractNumId="14" w15:restartNumberingAfterBreak="0">
+  <w:abstractNum w:abstractNumId="16" w15:restartNumberingAfterBreak="0">
     <w:nsid w:val="7CD26172"/>
     <w:multiLevelType w:val="hybridMultilevel"/>
     <w:tmpl w:val="5A026D44"/>
@@ -29278,22 +32076,28 @@
     <w:abstractNumId w:val="0"/>
   </w:num>
   <w:num w:numId="10" w16cid:durableId="1883864708">
-    <w:abstractNumId w:val="12"/>
+    <w:abstractNumId w:val="14"/>
   </w:num>
   <w:num w:numId="11" w16cid:durableId="162088527">
-    <w:abstractNumId w:val="14"/>
+    <w:abstractNumId w:val="16"/>
   </w:num>
   <w:num w:numId="12" w16cid:durableId="768353820">
-    <w:abstractNumId w:val="11"/>
+    <w:abstractNumId w:val="13"/>
   </w:num>
   <w:num w:numId="13" w16cid:durableId="411775383">
     <w:abstractNumId w:val="9"/>
   </w:num>
   <w:num w:numId="14" w16cid:durableId="1066610718">
-    <w:abstractNumId w:val="13"/>
+    <w:abstractNumId w:val="15"/>
   </w:num>
   <w:num w:numId="15" w16cid:durableId="821431279">
     <w:abstractNumId w:val="10"/>
+  </w:num>
+  <w:num w:numId="16" w16cid:durableId="42215356">
+    <w:abstractNumId w:val="11"/>
+  </w:num>
+  <w:num w:numId="17" w16cid:durableId="1302808137">
+    <w:abstractNumId w:val="12"/>
   </w:num>
 </w:numbering>
 </file>
@@ -29687,7 +32491,7 @@
   <w:style w:type="paragraph" w:default="1" w:styleId="Normal">
     <w:name w:val="Normal"/>
     <w:qFormat/>
-    <w:rsid w:val="00DD49CD"/>
+    <w:rsid w:val="0088014C"/>
     <w:pPr>
       <w:spacing w:after="80" w:line="259" w:lineRule="auto"/>
     </w:pPr>

</xml_diff>